<commit_message>
Docs 01-07 v3.0: updated to the system as built
</commit_message>
<xml_diff>
--- a/docs/01_Concept_Note_College_Institution_Management_System.docx
+++ b/docs/01_Concept_Note_College_Institution_Management_System.docx
@@ -397,7 +397,7 @@
                 <w:sz w:val="18"/>
                 <w:szCs w:val="18"/>
               </w:rPr>
-              <w:t xml:space="preserve">Draft Version 2.0 — for stakeholder review</w:t>
+              <w:t xml:space="preserve">Version 3.0 — updated to the system as built, for stakeholder review</w:t>
             </w:r>
           </w:p>
         </w:tc>
@@ -1222,6 +1222,143 @@
                 <w:szCs w:val="18"/>
               </w:rPr>
               <w:t xml:space="preserve">Re-baselined for NACTVET-registered NVA/NTA institutions, each with its own online admission system; content expanded and aligned across the document suite.</w:t>
+            </w:r>
+          </w:p>
+        </w:tc>
+      </w:tr>
+      <w:tr>
+        <w:trPr>
+          <w:cantSplit/>
+        </w:trPr>
+        <w:tc>
+          <w:tcPr>
+            <w:tcW w:type="dxa" w:w="1083"/>
+            <w:tcBorders>
+              <w:top w:val="single" w:color="BFC9D6" w:sz="4"/>
+              <w:left w:val="single" w:color="BFC9D6" w:sz="4"/>
+              <w:bottom w:val="single" w:color="BFC9D6" w:sz="4"/>
+              <w:right w:val="single" w:color="BFC9D6" w:sz="4"/>
+            </w:tcBorders>
+            <w:shd w:fill="EEF3F8" w:color="auto" w:val="clear"/>
+            <w:tcMar>
+              <w:top w:type="dxa" w:w="60"/>
+              <w:left w:type="dxa" w:w="100"/>
+              <w:bottom w:type="dxa" w:w="60"/>
+              <w:right w:type="dxa" w:w="100"/>
+            </w:tcMar>
+            <w:vAlign w:val="center"/>
+          </w:tcPr>
+          <w:p>
+            <w:pPr>
+              <w:spacing w:after="30" w:before="30"/>
+              <w:jc w:val="left"/>
+            </w:pPr>
+            <w:r>
+              <w:rPr>
+                <w:rFonts w:ascii="Calibri" w:cs="Calibri" w:eastAsia="Calibri" w:hAnsi="Calibri"/>
+                <w:sz w:val="18"/>
+                <w:szCs w:val="18"/>
+              </w:rPr>
+              <w:t xml:space="preserve">3.0</w:t>
+            </w:r>
+          </w:p>
+        </w:tc>
+        <w:tc>
+          <w:tcPr>
+            <w:tcW w:type="dxa" w:w="1624"/>
+            <w:tcBorders>
+              <w:top w:val="single" w:color="BFC9D6" w:sz="4"/>
+              <w:left w:val="single" w:color="BFC9D6" w:sz="4"/>
+              <w:bottom w:val="single" w:color="BFC9D6" w:sz="4"/>
+              <w:right w:val="single" w:color="BFC9D6" w:sz="4"/>
+            </w:tcBorders>
+            <w:shd w:fill="EEF3F8" w:color="auto" w:val="clear"/>
+            <w:tcMar>
+              <w:top w:type="dxa" w:w="60"/>
+              <w:left w:type="dxa" w:w="100"/>
+              <w:bottom w:type="dxa" w:w="60"/>
+              <w:right w:type="dxa" w:w="100"/>
+            </w:tcMar>
+            <w:vAlign w:val="center"/>
+          </w:tcPr>
+          <w:p>
+            <w:pPr>
+              <w:spacing w:after="30" w:before="30"/>
+              <w:jc w:val="left"/>
+            </w:pPr>
+            <w:r>
+              <w:rPr>
+                <w:rFonts w:ascii="Calibri" w:cs="Calibri" w:eastAsia="Calibri" w:hAnsi="Calibri"/>
+                <w:sz w:val="18"/>
+                <w:szCs w:val="18"/>
+              </w:rPr>
+              <w:t xml:space="preserve">October 2026</w:t>
+            </w:r>
+          </w:p>
+        </w:tc>
+        <w:tc>
+          <w:tcPr>
+            <w:tcW w:type="dxa" w:w="1985"/>
+            <w:tcBorders>
+              <w:top w:val="single" w:color="BFC9D6" w:sz="4"/>
+              <w:left w:val="single" w:color="BFC9D6" w:sz="4"/>
+              <w:bottom w:val="single" w:color="BFC9D6" w:sz="4"/>
+              <w:right w:val="single" w:color="BFC9D6" w:sz="4"/>
+            </w:tcBorders>
+            <w:shd w:fill="EEF3F8" w:color="auto" w:val="clear"/>
+            <w:tcMar>
+              <w:top w:type="dxa" w:w="60"/>
+              <w:left w:type="dxa" w:w="100"/>
+              <w:bottom w:type="dxa" w:w="60"/>
+              <w:right w:type="dxa" w:w="100"/>
+            </w:tcMar>
+            <w:vAlign w:val="center"/>
+          </w:tcPr>
+          <w:p>
+            <w:pPr>
+              <w:spacing w:after="30" w:before="30"/>
+              <w:jc w:val="left"/>
+            </w:pPr>
+            <w:r>
+              <w:rPr>
+                <w:rFonts w:ascii="Calibri" w:cs="Calibri" w:eastAsia="Calibri" w:hAnsi="Calibri"/>
+                <w:sz w:val="18"/>
+                <w:szCs w:val="18"/>
+              </w:rPr>
+              <w:t xml:space="preserve">Msingi Technologies Ltd</w:t>
+            </w:r>
+          </w:p>
+        </w:tc>
+        <w:tc>
+          <w:tcPr>
+            <w:tcW w:type="dxa" w:w="4334"/>
+            <w:tcBorders>
+              <w:top w:val="single" w:color="BFC9D6" w:sz="4"/>
+              <w:left w:val="single" w:color="BFC9D6" w:sz="4"/>
+              <w:bottom w:val="single" w:color="BFC9D6" w:sz="4"/>
+              <w:right w:val="single" w:color="BFC9D6" w:sz="4"/>
+            </w:tcBorders>
+            <w:shd w:fill="EEF3F8" w:color="auto" w:val="clear"/>
+            <w:tcMar>
+              <w:top w:type="dxa" w:w="60"/>
+              <w:left w:type="dxa" w:w="100"/>
+              <w:bottom w:type="dxa" w:w="60"/>
+              <w:right w:type="dxa" w:w="100"/>
+            </w:tcMar>
+            <w:vAlign w:val="center"/>
+          </w:tcPr>
+          <w:p>
+            <w:pPr>
+              <w:spacing w:after="30" w:before="30"/>
+              <w:jc w:val="left"/>
+            </w:pPr>
+            <w:r>
+              <w:rPr>
+                <w:rFonts w:ascii="Calibri" w:cs="Calibri" w:eastAsia="Calibri" w:hAnsi="Calibri"/>
+                <w:sz w:val="18"/>
+                <w:szCs w:val="18"/>
+              </w:rPr>
+              <w:t xml:space="preserve">Updated to the system as built (development build, October 2026): what is built, what is partly built and what remains, with corrected technology, data model and plan. The version 2.0 requirements stay the baseline.</w:t>
             </w:r>
           </w:p>
         </w:tc>
@@ -2873,6 +3010,30 @@
         <w:t xml:space="preserve"> CIMS gives every NACTVET-registered institution a modern, compliant digital campus — online admissions, records, examinations, fees, hostels and reports — at a predictable annual cost, without the institution having to build or run its own software team.</w:t>
       </w:r>
     </w:p>
+    <w:p>
+      <w:pPr>
+        <w:pBdr>
+          <w:left w:val="single" w:sz="18" w:space="8" w:color="1F3864"/>
+        </w:pBdr>
+        <w:shd w:val="clear" w:color="auto" w:fill="EEF3F8"/>
+        <w:spacing w:before="60" w:after="120" w:line="276"/>
+        <w:ind w:left="170" w:right="113"/>
+      </w:pPr>
+      <w:r>
+        <w:rPr>
+          <w:rFonts w:ascii="Calibri" w:cs="Calibri" w:eastAsia="Calibri" w:hAnsi="Calibri"/>
+          <w:b/>
+          <w:bCs/>
+        </w:rPr>
+        <w:t xml:space="preserve">Status in October 2026 (version 3.0):</w:t>
+      </w:r>
+      <w:r>
+        <w:rPr>
+          <w:rFonts w:ascii="Calibri" w:cs="Calibri" w:eastAsia="Calibri" w:hAnsi="Calibri"/>
+        </w:rPr>
+        <w:t xml:space="preserve"> CIMS has been built. The development build covers the core scope of all three planned releases: online admission with NECTA and NACTVET look-ups, selection, NACTVET verification and offers, admission letters, registry, fees with GePG control numbers and reconciliation, sponsors, waivers and refunds, teaching and attendance, NTA examinations and NVA competence assessment, results, resits, appeals and transcripts, hostels, industrial practical training, clearance and graduation, the student portal, messaging, reports and the Msingi platform console. GePG, SMS and NACTVET verification run against simulators until live access is granted. Section 5.4 lists what is built and what remains.</w:t>
+      </w:r>
+    </w:p>
     <w:tbl>
       <w:tblPr>
         <w:tblW w:type="dxa" w:w="9026"/>
@@ -3315,12 +3476,10 @@
             <w:r>
               <w:rPr>
                 <w:rFonts w:ascii="Calibri" w:cs="Calibri" w:eastAsia="Calibri" w:hAnsi="Calibri"/>
-                <w:b w:val="false"/>
-                <w:bCs w:val="false"/>
-                <w:sz w:val="18"/>
-                <w:szCs w:val="18"/>
-              </w:rPr>
-              <w:t xml:space="preserve">Three releases over about 11 months; Release 1 (admissions, registry, fees) is ready before the 2027/28 application window.</w:t>
+                <w:sz w:val="18"/>
+                <w:szCs w:val="18"/>
+              </w:rPr>
+              <w:t xml:space="preserve">Development build of the core scope of all three releases completed in October 2026, ahead of the November 2026 start assumed in version 2.0. Next: live integrations, hardening, pilots and go-live before the 2027/28 application window.</w:t>
             </w:r>
           </w:p>
         </w:tc>
@@ -3390,12 +3549,10 @@
             <w:r>
               <w:rPr>
                 <w:rFonts w:ascii="Calibri" w:cs="Calibri" w:eastAsia="Calibri" w:hAnsi="Calibri"/>
-                <w:b w:val="false"/>
-                <w:bCs w:val="false"/>
-                <w:sz w:val="18"/>
-                <w:szCs w:val="18"/>
-              </w:rPr>
-              <w:t xml:space="preserve">Java 21 / Spring Boot 3, React, PostgreSQL, Keycloak, Docker/Kubernetes — open-source, no per-user licence fees.</w:t>
+                <w:sz w:val="18"/>
+                <w:szCs w:val="18"/>
+              </w:rPr>
+              <w:t xml:space="preserve">Java 21 / Spring Boot 3.3, React 18 with TypeScript and MUI, PostgreSQL 16 with row-level security, Flyway, Docker — open source, no per-user licence fees. The build signs in users with its own token issuer; Keycloak is planned for single sign-on and multi-factor authentication.</w:t>
             </w:r>
           </w:p>
         </w:tc>
@@ -7201,6 +7358,2870 @@
           <w:rFonts w:ascii="Calibri" w:cs="Calibri" w:eastAsia="Calibri" w:hAnsi="Calibri"/>
         </w:rPr>
         <w:t xml:space="preserve">Where an external body provides an application programming interface (API), CIMS connects to it directly. Where submission is done through a portal upload, CIMS generates the file in the exact template required and records the outcome when the institution uploads it. Each connector can therefore move from file-based to fully automated without changing the institution's business process.</w:t>
+      </w:r>
+    </w:p>
+    <w:p>
+      <w:pPr>
+        <w:pStyle w:val="Heading2"/>
+      </w:pPr>
+      <w:r>
+        <w:rPr>
+          <w:rFonts w:ascii="Calibri" w:cs="Calibri" w:eastAsia="Calibri" w:hAnsi="Calibri"/>
+        </w:rPr>
+        <w:t xml:space="preserve">5.4 What has been built (October 2026)</w:t>
+      </w:r>
+    </w:p>
+    <w:p>
+      <w:pPr>
+        <w:spacing w:after="120" w:line="276"/>
+        <w:jc w:val="both"/>
+      </w:pPr>
+      <w:r>
+        <w:rPr>
+          <w:rFonts w:ascii="Calibri" w:cs="Calibri" w:eastAsia="Calibri" w:hAnsi="Calibri"/>
+        </w:rPr>
+        <w:t xml:space="preserve">Every module in section 5.2 exists in the development build. The table states, per module, what an institution can do in the system today and what is still to be built. The detail is traced requirement by requirement in Document 03, section 11.</w:t>
+      </w:r>
+    </w:p>
+    <w:tbl>
+      <w:tblPr>
+        <w:tblW w:type="dxa" w:w="9026"/>
+        <w:tblBorders>
+          <w:top w:val="single" w:color="auto" w:sz="4"/>
+          <w:left w:val="single" w:color="auto" w:sz="4"/>
+          <w:bottom w:val="single" w:color="auto" w:sz="4"/>
+          <w:right w:val="single" w:color="auto" w:sz="4"/>
+          <w:insideH w:val="single" w:color="auto" w:sz="4"/>
+          <w:insideV w:val="single" w:color="auto" w:sz="4"/>
+        </w:tblBorders>
+        <w:tblLayout w:type="fixed"/>
+      </w:tblPr>
+      <w:tblGrid>
+        <w:gridCol w:w="1534"/>
+        <w:gridCol w:w="4964"/>
+        <w:gridCol w:w="2528"/>
+      </w:tblGrid>
+      <w:tr>
+        <w:trPr>
+          <w:tblHeader/>
+          <w:cantSplit/>
+        </w:trPr>
+        <w:tc>
+          <w:tcPr>
+            <w:tcW w:type="dxa" w:w="1534"/>
+            <w:tcBorders>
+              <w:top w:val="single" w:color="BFC9D6" w:sz="4"/>
+              <w:left w:val="single" w:color="BFC9D6" w:sz="4"/>
+              <w:bottom w:val="single" w:color="BFC9D6" w:sz="4"/>
+              <w:right w:val="single" w:color="BFC9D6" w:sz="4"/>
+            </w:tcBorders>
+            <w:shd w:fill="1F3864" w:color="auto" w:val="clear"/>
+            <w:tcMar>
+              <w:top w:type="dxa" w:w="60"/>
+              <w:left w:type="dxa" w:w="100"/>
+              <w:bottom w:type="dxa" w:w="60"/>
+              <w:right w:type="dxa" w:w="100"/>
+            </w:tcMar>
+            <w:vAlign w:val="center"/>
+          </w:tcPr>
+          <w:p>
+            <w:pPr>
+              <w:spacing w:after="30" w:before="30"/>
+              <w:jc w:val="left"/>
+            </w:pPr>
+            <w:r>
+              <w:rPr>
+                <w:rFonts w:ascii="Calibri" w:cs="Calibri" w:eastAsia="Calibri" w:hAnsi="Calibri"/>
+                <w:b/>
+                <w:bCs/>
+                <w:color w:val="FFFFFF"/>
+                <w:sz w:val="16"/>
+                <w:szCs w:val="16"/>
+              </w:rPr>
+              <w:t xml:space="preserve">Module</w:t>
+            </w:r>
+          </w:p>
+        </w:tc>
+        <w:tc>
+          <w:tcPr>
+            <w:tcW w:type="dxa" w:w="4964"/>
+            <w:tcBorders>
+              <w:top w:val="single" w:color="BFC9D6" w:sz="4"/>
+              <w:left w:val="single" w:color="BFC9D6" w:sz="4"/>
+              <w:bottom w:val="single" w:color="BFC9D6" w:sz="4"/>
+              <w:right w:val="single" w:color="BFC9D6" w:sz="4"/>
+            </w:tcBorders>
+            <w:shd w:fill="1F3864" w:color="auto" w:val="clear"/>
+            <w:tcMar>
+              <w:top w:type="dxa" w:w="60"/>
+              <w:left w:type="dxa" w:w="100"/>
+              <w:bottom w:type="dxa" w:w="60"/>
+              <w:right w:type="dxa" w:w="100"/>
+            </w:tcMar>
+            <w:vAlign w:val="center"/>
+          </w:tcPr>
+          <w:p>
+            <w:pPr>
+              <w:spacing w:after="30" w:before="30"/>
+              <w:jc w:val="left"/>
+            </w:pPr>
+            <w:r>
+              <w:rPr>
+                <w:rFonts w:ascii="Calibri" w:cs="Calibri" w:eastAsia="Calibri" w:hAnsi="Calibri"/>
+                <w:b/>
+                <w:bCs/>
+                <w:color w:val="FFFFFF"/>
+                <w:sz w:val="16"/>
+                <w:szCs w:val="16"/>
+              </w:rPr>
+              <w:t xml:space="preserve">In the system now</w:t>
+            </w:r>
+          </w:p>
+        </w:tc>
+        <w:tc>
+          <w:tcPr>
+            <w:tcW w:type="dxa" w:w="2528"/>
+            <w:tcBorders>
+              <w:top w:val="single" w:color="BFC9D6" w:sz="4"/>
+              <w:left w:val="single" w:color="BFC9D6" w:sz="4"/>
+              <w:bottom w:val="single" w:color="BFC9D6" w:sz="4"/>
+              <w:right w:val="single" w:color="BFC9D6" w:sz="4"/>
+            </w:tcBorders>
+            <w:shd w:fill="1F3864" w:color="auto" w:val="clear"/>
+            <w:tcMar>
+              <w:top w:type="dxa" w:w="60"/>
+              <w:left w:type="dxa" w:w="100"/>
+              <w:bottom w:type="dxa" w:w="60"/>
+              <w:right w:type="dxa" w:w="100"/>
+            </w:tcMar>
+            <w:vAlign w:val="center"/>
+          </w:tcPr>
+          <w:p>
+            <w:pPr>
+              <w:spacing w:after="30" w:before="30"/>
+              <w:jc w:val="left"/>
+            </w:pPr>
+            <w:r>
+              <w:rPr>
+                <w:rFonts w:ascii="Calibri" w:cs="Calibri" w:eastAsia="Calibri" w:hAnsi="Calibri"/>
+                <w:b/>
+                <w:bCs/>
+                <w:color w:val="FFFFFF"/>
+                <w:sz w:val="16"/>
+                <w:szCs w:val="16"/>
+              </w:rPr>
+              <w:t xml:space="preserve">Still to do</w:t>
+            </w:r>
+          </w:p>
+        </w:tc>
+      </w:tr>
+      <w:tr>
+        <w:trPr>
+          <w:cantSplit/>
+        </w:trPr>
+        <w:tc>
+          <w:tcPr>
+            <w:tcW w:type="dxa" w:w="1534"/>
+            <w:tcBorders>
+              <w:top w:val="single" w:color="BFC9D6" w:sz="4"/>
+              <w:left w:val="single" w:color="BFC9D6" w:sz="4"/>
+              <w:bottom w:val="single" w:color="BFC9D6" w:sz="4"/>
+              <w:right w:val="single" w:color="BFC9D6" w:sz="4"/>
+            </w:tcBorders>
+            <w:shd w:fill="EEF3F8" w:color="auto" w:val="clear"/>
+            <w:tcMar>
+              <w:top w:type="dxa" w:w="60"/>
+              <w:left w:type="dxa" w:w="100"/>
+              <w:bottom w:type="dxa" w:w="60"/>
+              <w:right w:type="dxa" w:w="100"/>
+            </w:tcMar>
+            <w:vAlign w:val="center"/>
+          </w:tcPr>
+          <w:p>
+            <w:pPr>
+              <w:spacing w:after="30" w:before="30"/>
+              <w:jc w:val="left"/>
+            </w:pPr>
+            <w:r>
+              <w:rPr>
+                <w:rFonts w:ascii="Calibri" w:cs="Calibri" w:eastAsia="Calibri" w:hAnsi="Calibri"/>
+                <w:b/>
+                <w:bCs/>
+                <w:sz w:val="16"/>
+                <w:szCs w:val="16"/>
+              </w:rPr>
+              <w:t xml:space="preserve">M01 Online Admission Portal</w:t>
+            </w:r>
+          </w:p>
+        </w:tc>
+        <w:tc>
+          <w:tcPr>
+            <w:tcW w:type="dxa" w:w="4964"/>
+            <w:tcBorders>
+              <w:top w:val="single" w:color="BFC9D6" w:sz="4"/>
+              <w:left w:val="single" w:color="BFC9D6" w:sz="4"/>
+              <w:bottom w:val="single" w:color="BFC9D6" w:sz="4"/>
+              <w:right w:val="single" w:color="BFC9D6" w:sz="4"/>
+            </w:tcBorders>
+            <w:shd w:fill="EEF3F8" w:color="auto" w:val="clear"/>
+            <w:tcMar>
+              <w:top w:type="dxa" w:w="60"/>
+              <w:left w:type="dxa" w:w="100"/>
+              <w:bottom w:type="dxa" w:w="60"/>
+              <w:right w:type="dxa" w:w="100"/>
+            </w:tcMar>
+            <w:vAlign w:val="center"/>
+          </w:tcPr>
+          <w:p>
+            <w:pPr>
+              <w:spacing w:after="30" w:before="30"/>
+              <w:jc w:val="left"/>
+            </w:pPr>
+            <w:r>
+              <w:rPr>
+                <w:rFonts w:ascii="Calibri" w:cs="Calibri" w:eastAsia="Calibri" w:hAnsi="Calibri"/>
+                <w:sz w:val="16"/>
+                <w:szCs w:val="16"/>
+              </w:rPr>
+              <w:t xml:space="preserve">Branded portal with campus photo and a How to apply guide; sign-up with the Form Four index number (names and results from NECTA), SMS verification code and password reset; profile with region-to-street address, education history and next of kin; other qualifications (another CSEE/ACSEE sitting from NECTA, NTA award from NACTVET by registration number, NVA and other awards checked by the office); GePG application fee; eligibility from NACTVET entry rules and the applicant's entry level; windows published, opened, closed early, reopened and extended; selection with committee approval; NACTVET verification by API or file, queries, offers, multiple-admission confirmation; admission letters with QR code.</w:t>
+            </w:r>
+          </w:p>
+        </w:tc>
+        <w:tc>
+          <w:tcPr>
+            <w:tcW w:type="dxa" w:w="2528"/>
+            <w:tcBorders>
+              <w:top w:val="single" w:color="BFC9D6" w:sz="4"/>
+              <w:left w:val="single" w:color="BFC9D6" w:sz="4"/>
+              <w:bottom w:val="single" w:color="BFC9D6" w:sz="4"/>
+              <w:right w:val="single" w:color="BFC9D6" w:sz="4"/>
+            </w:tcBorders>
+            <w:shd w:fill="EEF3F8" w:color="auto" w:val="clear"/>
+            <w:tcMar>
+              <w:top w:type="dxa" w:w="60"/>
+              <w:left w:type="dxa" w:w="100"/>
+              <w:bottom w:type="dxa" w:w="60"/>
+              <w:right w:type="dxa" w:w="100"/>
+            </w:tcMar>
+            <w:vAlign w:val="center"/>
+          </w:tcPr>
+          <w:p>
+            <w:pPr>
+              <w:spacing w:after="30" w:before="30"/>
+              <w:jc w:val="left"/>
+            </w:pPr>
+            <w:r>
+              <w:rPr>
+                <w:rFonts w:ascii="Calibri" w:cs="Calibri" w:eastAsia="Calibri" w:hAnsi="Calibri"/>
+                <w:sz w:val="16"/>
+                <w:szCs w:val="16"/>
+              </w:rPr>
+              <w:t xml:space="preserve">Document uploads; email verification; import of externally selected students (e.g. TAMISEMI); NACTVET's real verification endpoints (a live adapter and a test server are ready).</w:t>
+            </w:r>
+          </w:p>
+        </w:tc>
+      </w:tr>
+      <w:tr>
+        <w:trPr>
+          <w:cantSplit/>
+        </w:trPr>
+        <w:tc>
+          <w:tcPr>
+            <w:tcW w:type="dxa" w:w="1534"/>
+            <w:tcBorders>
+              <w:top w:val="single" w:color="BFC9D6" w:sz="4"/>
+              <w:left w:val="single" w:color="BFC9D6" w:sz="4"/>
+              <w:bottom w:val="single" w:color="BFC9D6" w:sz="4"/>
+              <w:right w:val="single" w:color="BFC9D6" w:sz="4"/>
+            </w:tcBorders>
+            <w:tcMar>
+              <w:top w:type="dxa" w:w="60"/>
+              <w:left w:type="dxa" w:w="100"/>
+              <w:bottom w:type="dxa" w:w="60"/>
+              <w:right w:type="dxa" w:w="100"/>
+            </w:tcMar>
+            <w:vAlign w:val="center"/>
+          </w:tcPr>
+          <w:p>
+            <w:pPr>
+              <w:spacing w:after="30" w:before="30"/>
+              <w:jc w:val="left"/>
+            </w:pPr>
+            <w:r>
+              <w:rPr>
+                <w:rFonts w:ascii="Calibri" w:cs="Calibri" w:eastAsia="Calibri" w:hAnsi="Calibri"/>
+                <w:b/>
+                <w:bCs/>
+                <w:sz w:val="16"/>
+                <w:szCs w:val="16"/>
+              </w:rPr>
+              <w:t xml:space="preserve">M02 Student Registry</w:t>
+            </w:r>
+          </w:p>
+        </w:tc>
+        <w:tc>
+          <w:tcPr>
+            <w:tcW w:type="dxa" w:w="4964"/>
+            <w:tcBorders>
+              <w:top w:val="single" w:color="BFC9D6" w:sz="4"/>
+              <w:left w:val="single" w:color="BFC9D6" w:sz="4"/>
+              <w:bottom w:val="single" w:color="BFC9D6" w:sz="4"/>
+              <w:right w:val="single" w:color="BFC9D6" w:sz="4"/>
+            </w:tcBorders>
+            <w:tcMar>
+              <w:top w:type="dxa" w:w="60"/>
+              <w:left w:type="dxa" w:w="100"/>
+              <w:bottom w:type="dxa" w:w="60"/>
+              <w:right w:type="dxa" w:w="100"/>
+            </w:tcMar>
+            <w:vAlign w:val="center"/>
+          </w:tcPr>
+          <w:p>
+            <w:pPr>
+              <w:spacing w:after="30" w:before="30"/>
+              <w:jc w:val="left"/>
+            </w:pPr>
+            <w:r>
+              <w:rPr>
+                <w:rFonts w:ascii="Calibri" w:cs="Calibri" w:eastAsia="Calibri" w:hAnsi="Calibri"/>
+                <w:sz w:val="16"/>
+                <w:szCs w:val="16"/>
+              </w:rPr>
+              <w:t xml:space="preserve">Hand-over of accepted applicants without re-entry; registration numbers from a configurable pattern, never changed or reused (enforced by the database); first registration with an originals checklist; semester registration with fee clearance; status changes (postponement, resumption, suspension, discontinuation, withdrawal, death) recommended by the Head of Department and decided by the Deputy Principal (Academic); ID cards with photo and QR code; requests to correct personal details.</w:t>
+            </w:r>
+          </w:p>
+        </w:tc>
+        <w:tc>
+          <w:tcPr>
+            <w:tcW w:type="dxa" w:w="2528"/>
+            <w:tcBorders>
+              <w:top w:val="single" w:color="BFC9D6" w:sz="4"/>
+              <w:left w:val="single" w:color="BFC9D6" w:sz="4"/>
+              <w:bottom w:val="single" w:color="BFC9D6" w:sz="4"/>
+              <w:right w:val="single" w:color="BFC9D6" w:sz="4"/>
+            </w:tcBorders>
+            <w:tcMar>
+              <w:top w:type="dxa" w:w="60"/>
+              <w:left w:type="dxa" w:w="100"/>
+              <w:bottom w:type="dxa" w:w="60"/>
+              <w:right w:type="dxa" w:w="100"/>
+            </w:tcMar>
+            <w:vAlign w:val="center"/>
+          </w:tcPr>
+          <w:p>
+            <w:pPr>
+              <w:spacing w:after="30" w:before="30"/>
+              <w:jc w:val="left"/>
+            </w:pPr>
+            <w:r>
+              <w:rPr>
+                <w:rFonts w:ascii="Calibri" w:cs="Calibri" w:eastAsia="Calibri" w:hAnsi="Calibri"/>
+                <w:sz w:val="16"/>
+                <w:szCs w:val="16"/>
+              </w:rPr>
+              <w:t xml:space="preserve">Programme and campus transfers; NACTVET student registration submission.</w:t>
+            </w:r>
+          </w:p>
+        </w:tc>
+      </w:tr>
+      <w:tr>
+        <w:trPr>
+          <w:cantSplit/>
+        </w:trPr>
+        <w:tc>
+          <w:tcPr>
+            <w:tcW w:type="dxa" w:w="1534"/>
+            <w:tcBorders>
+              <w:top w:val="single" w:color="BFC9D6" w:sz="4"/>
+              <w:left w:val="single" w:color="BFC9D6" w:sz="4"/>
+              <w:bottom w:val="single" w:color="BFC9D6" w:sz="4"/>
+              <w:right w:val="single" w:color="BFC9D6" w:sz="4"/>
+            </w:tcBorders>
+            <w:shd w:fill="EEF3F8" w:color="auto" w:val="clear"/>
+            <w:tcMar>
+              <w:top w:type="dxa" w:w="60"/>
+              <w:left w:type="dxa" w:w="100"/>
+              <w:bottom w:type="dxa" w:w="60"/>
+              <w:right w:type="dxa" w:w="100"/>
+            </w:tcMar>
+            <w:vAlign w:val="center"/>
+          </w:tcPr>
+          <w:p>
+            <w:pPr>
+              <w:spacing w:after="30" w:before="30"/>
+              <w:jc w:val="left"/>
+            </w:pPr>
+            <w:r>
+              <w:rPr>
+                <w:rFonts w:ascii="Calibri" w:cs="Calibri" w:eastAsia="Calibri" w:hAnsi="Calibri"/>
+                <w:b/>
+                <w:bCs/>
+                <w:sz w:val="16"/>
+                <w:szCs w:val="16"/>
+              </w:rPr>
+              <w:t xml:space="preserve">M03 Academic Structure</w:t>
+            </w:r>
+          </w:p>
+        </w:tc>
+        <w:tc>
+          <w:tcPr>
+            <w:tcW w:type="dxa" w:w="4964"/>
+            <w:tcBorders>
+              <w:top w:val="single" w:color="BFC9D6" w:sz="4"/>
+              <w:left w:val="single" w:color="BFC9D6" w:sz="4"/>
+              <w:bottom w:val="single" w:color="BFC9D6" w:sz="4"/>
+              <w:right w:val="single" w:color="BFC9D6" w:sz="4"/>
+            </w:tcBorders>
+            <w:shd w:fill="EEF3F8" w:color="auto" w:val="clear"/>
+            <w:tcMar>
+              <w:top w:type="dxa" w:w="60"/>
+              <w:left w:type="dxa" w:w="100"/>
+              <w:bottom w:type="dxa" w:w="60"/>
+              <w:right w:type="dxa" w:w="100"/>
+            </w:tcMar>
+            <w:vAlign w:val="center"/>
+          </w:tcPr>
+          <w:p>
+            <w:pPr>
+              <w:spacing w:after="30" w:before="30"/>
+              <w:jc w:val="left"/>
+            </w:pPr>
+            <w:r>
+              <w:rPr>
+                <w:rFonts w:ascii="Calibri" w:cs="Calibri" w:eastAsia="Calibri" w:hAnsi="Calibri"/>
+                <w:sz w:val="16"/>
+                <w:szCs w:val="16"/>
+              </w:rPr>
+              <w:t xml:space="preserve">Academic years, intakes, departments, NVA/NTA programmes with entry levels, module catalogue (graded or competence-based), versioned curricula approved by someone other than the preparer, academic calendar with key dates, examination regulations per award level versioned by academic year.</w:t>
+            </w:r>
+          </w:p>
+        </w:tc>
+        <w:tc>
+          <w:tcPr>
+            <w:tcW w:type="dxa" w:w="2528"/>
+            <w:tcBorders>
+              <w:top w:val="single" w:color="BFC9D6" w:sz="4"/>
+              <w:left w:val="single" w:color="BFC9D6" w:sz="4"/>
+              <w:bottom w:val="single" w:color="BFC9D6" w:sz="4"/>
+              <w:right w:val="single" w:color="BFC9D6" w:sz="4"/>
+            </w:tcBorders>
+            <w:shd w:fill="EEF3F8" w:color="auto" w:val="clear"/>
+            <w:tcMar>
+              <w:top w:type="dxa" w:w="60"/>
+              <w:left w:type="dxa" w:w="100"/>
+              <w:bottom w:type="dxa" w:w="60"/>
+              <w:right w:type="dxa" w:w="100"/>
+            </w:tcMar>
+            <w:vAlign w:val="center"/>
+          </w:tcPr>
+          <w:p>
+            <w:pPr>
+              <w:spacing w:after="30" w:before="30"/>
+              <w:jc w:val="left"/>
+            </w:pPr>
+            <w:r>
+              <w:rPr>
+                <w:rFonts w:ascii="Calibri" w:cs="Calibri" w:eastAsia="Calibri" w:hAnsi="Calibri"/>
+                <w:sz w:val="16"/>
+                <w:szCs w:val="16"/>
+              </w:rPr>
+              <w:t xml:space="preserve">Campuses and faculties/schools.</w:t>
+            </w:r>
+          </w:p>
+        </w:tc>
+      </w:tr>
+      <w:tr>
+        <w:trPr>
+          <w:cantSplit/>
+        </w:trPr>
+        <w:tc>
+          <w:tcPr>
+            <w:tcW w:type="dxa" w:w="1534"/>
+            <w:tcBorders>
+              <w:top w:val="single" w:color="BFC9D6" w:sz="4"/>
+              <w:left w:val="single" w:color="BFC9D6" w:sz="4"/>
+              <w:bottom w:val="single" w:color="BFC9D6" w:sz="4"/>
+              <w:right w:val="single" w:color="BFC9D6" w:sz="4"/>
+            </w:tcBorders>
+            <w:tcMar>
+              <w:top w:type="dxa" w:w="60"/>
+              <w:left w:type="dxa" w:w="100"/>
+              <w:bottom w:type="dxa" w:w="60"/>
+              <w:right w:type="dxa" w:w="100"/>
+            </w:tcMar>
+            <w:vAlign w:val="center"/>
+          </w:tcPr>
+          <w:p>
+            <w:pPr>
+              <w:spacing w:after="30" w:before="30"/>
+              <w:jc w:val="left"/>
+            </w:pPr>
+            <w:r>
+              <w:rPr>
+                <w:rFonts w:ascii="Calibri" w:cs="Calibri" w:eastAsia="Calibri" w:hAnsi="Calibri"/>
+                <w:b/>
+                <w:bCs/>
+                <w:sz w:val="16"/>
+                <w:szCs w:val="16"/>
+              </w:rPr>
+              <w:t xml:space="preserve">M04 Teaching &amp; Attendance</w:t>
+            </w:r>
+          </w:p>
+        </w:tc>
+        <w:tc>
+          <w:tcPr>
+            <w:tcW w:type="dxa" w:w="4964"/>
+            <w:tcBorders>
+              <w:top w:val="single" w:color="BFC9D6" w:sz="4"/>
+              <w:left w:val="single" w:color="BFC9D6" w:sz="4"/>
+              <w:bottom w:val="single" w:color="BFC9D6" w:sz="4"/>
+              <w:right w:val="single" w:color="BFC9D6" w:sz="4"/>
+            </w:tcBorders>
+            <w:tcMar>
+              <w:top w:type="dxa" w:w="60"/>
+              <w:left w:type="dxa" w:w="100"/>
+              <w:bottom w:type="dxa" w:w="60"/>
+              <w:right w:type="dxa" w:w="100"/>
+            </w:tcMar>
+            <w:vAlign w:val="center"/>
+          </w:tcPr>
+          <w:p>
+            <w:pPr>
+              <w:spacing w:after="30" w:before="30"/>
+              <w:jc w:val="left"/>
+            </w:pPr>
+            <w:r>
+              <w:rPr>
+                <w:rFonts w:ascii="Calibri" w:cs="Calibri" w:eastAsia="Calibri" w:hAnsi="Calibri"/>
+                <w:sz w:val="16"/>
+                <w:szCs w:val="16"/>
+              </w:rPr>
+              <w:t xml:space="preserve">Module offerings from approved registrations and lecturer allocation; My teaching for lecturers; class lists as a printable register (PDF) and Excel; one-tap attendance that keeps working offline; self check-in with a rotating QR code; attendance thresholds with SMS warnings; lecturer workload.</w:t>
+            </w:r>
+          </w:p>
+        </w:tc>
+        <w:tc>
+          <w:tcPr>
+            <w:tcW w:type="dxa" w:w="2528"/>
+            <w:tcBorders>
+              <w:top w:val="single" w:color="BFC9D6" w:sz="4"/>
+              <w:left w:val="single" w:color="BFC9D6" w:sz="4"/>
+              <w:bottom w:val="single" w:color="BFC9D6" w:sz="4"/>
+              <w:right w:val="single" w:color="BFC9D6" w:sz="4"/>
+            </w:tcBorders>
+            <w:tcMar>
+              <w:top w:type="dxa" w:w="60"/>
+              <w:left w:type="dxa" w:w="100"/>
+              <w:bottom w:type="dxa" w:w="60"/>
+              <w:right w:type="dxa" w:w="100"/>
+            </w:tcMar>
+            <w:vAlign w:val="center"/>
+          </w:tcPr>
+          <w:p>
+            <w:pPr>
+              <w:spacing w:after="30" w:before="30"/>
+              <w:jc w:val="left"/>
+            </w:pPr>
+            <w:r>
+              <w:rPr>
+                <w:rFonts w:ascii="Calibri" w:cs="Calibri" w:eastAsia="Calibri" w:hAnsi="Calibri"/>
+                <w:sz w:val="16"/>
+                <w:szCs w:val="16"/>
+              </w:rPr>
+              <w:t xml:space="preserve">Timetabling; limiting self check-in to the classroom (Wi-Fi or location).</w:t>
+            </w:r>
+          </w:p>
+        </w:tc>
+      </w:tr>
+      <w:tr>
+        <w:trPr>
+          <w:cantSplit/>
+        </w:trPr>
+        <w:tc>
+          <w:tcPr>
+            <w:tcW w:type="dxa" w:w="1534"/>
+            <w:tcBorders>
+              <w:top w:val="single" w:color="BFC9D6" w:sz="4"/>
+              <w:left w:val="single" w:color="BFC9D6" w:sz="4"/>
+              <w:bottom w:val="single" w:color="BFC9D6" w:sz="4"/>
+              <w:right w:val="single" w:color="BFC9D6" w:sz="4"/>
+            </w:tcBorders>
+            <w:shd w:fill="EEF3F8" w:color="auto" w:val="clear"/>
+            <w:tcMar>
+              <w:top w:type="dxa" w:w="60"/>
+              <w:left w:type="dxa" w:w="100"/>
+              <w:bottom w:type="dxa" w:w="60"/>
+              <w:right w:type="dxa" w:w="100"/>
+            </w:tcMar>
+            <w:vAlign w:val="center"/>
+          </w:tcPr>
+          <w:p>
+            <w:pPr>
+              <w:spacing w:after="30" w:before="30"/>
+              <w:jc w:val="left"/>
+            </w:pPr>
+            <w:r>
+              <w:rPr>
+                <w:rFonts w:ascii="Calibri" w:cs="Calibri" w:eastAsia="Calibri" w:hAnsi="Calibri"/>
+                <w:b/>
+                <w:bCs/>
+                <w:sz w:val="16"/>
+                <w:szCs w:val="16"/>
+              </w:rPr>
+              <w:t xml:space="preserve">M05 Assessment &amp; Examination</w:t>
+            </w:r>
+          </w:p>
+        </w:tc>
+        <w:tc>
+          <w:tcPr>
+            <w:tcW w:type="dxa" w:w="4964"/>
+            <w:tcBorders>
+              <w:top w:val="single" w:color="BFC9D6" w:sz="4"/>
+              <w:left w:val="single" w:color="BFC9D6" w:sz="4"/>
+              <w:bottom w:val="single" w:color="BFC9D6" w:sz="4"/>
+              <w:right w:val="single" w:color="BFC9D6" w:sz="4"/>
+            </w:tcBorders>
+            <w:shd w:fill="EEF3F8" w:color="auto" w:val="clear"/>
+            <w:tcMar>
+              <w:top w:type="dxa" w:w="60"/>
+              <w:left w:type="dxa" w:w="100"/>
+              <w:bottom w:type="dxa" w:w="60"/>
+              <w:right w:type="dxa" w:w="100"/>
+            </w:tcMar>
+            <w:vAlign w:val="center"/>
+          </w:tcPr>
+          <w:p>
+            <w:pPr>
+              <w:spacing w:after="30" w:before="30"/>
+              <w:jc w:val="left"/>
+            </w:pPr>
+            <w:r>
+              <w:rPr>
+                <w:rFonts w:ascii="Calibri" w:cs="Calibri" w:eastAsia="Calibri" w:hAnsi="Calibri"/>
+                <w:sz w:val="16"/>
+                <w:szCs w:val="16"/>
+              </w:rPr>
+              <w:t xml:space="preserve">Assessment plans; marks on screen or by validated Excel; marks window; Head of Department moderation and optional Department Board; class result sheets with GPA, CGPA and decisions; Academic Committee recommendation and Governing Board confirmation, after which the database refuses changes; publication with SMS; supplementary and special examinations with capping; amendments; remarks and appeals; statements of results with QR code; examination eligibility and exemptions; NVA competence units with verification and award lists; NACTVET results and award files (indicative layout).</w:t>
+            </w:r>
+          </w:p>
+        </w:tc>
+        <w:tc>
+          <w:tcPr>
+            <w:tcW w:type="dxa" w:w="2528"/>
+            <w:tcBorders>
+              <w:top w:val="single" w:color="BFC9D6" w:sz="4"/>
+              <w:left w:val="single" w:color="BFC9D6" w:sz="4"/>
+              <w:bottom w:val="single" w:color="BFC9D6" w:sz="4"/>
+              <w:right w:val="single" w:color="BFC9D6" w:sz="4"/>
+            </w:tcBorders>
+            <w:shd w:fill="EEF3F8" w:color="auto" w:val="clear"/>
+            <w:tcMar>
+              <w:top w:type="dxa" w:w="60"/>
+              <w:left w:type="dxa" w:w="100"/>
+              <w:bottom w:type="dxa" w:w="60"/>
+              <w:right w:type="dxa" w:w="100"/>
+            </w:tcMar>
+            <w:vAlign w:val="center"/>
+          </w:tcPr>
+          <w:p>
+            <w:pPr>
+              <w:spacing w:after="30" w:before="30"/>
+              <w:jc w:val="left"/>
+            </w:pPr>
+            <w:r>
+              <w:rPr>
+                <w:rFonts w:ascii="Calibri" w:cs="Calibri" w:eastAsia="Calibri" w:hAnsi="Calibri"/>
+                <w:sz w:val="16"/>
+                <w:szCs w:val="16"/>
+              </w:rPr>
+              <w:t xml:space="preserve">NACTVET's official results and NVA award templates or API; examination analytics across years.</w:t>
+            </w:r>
+          </w:p>
+        </w:tc>
+      </w:tr>
+      <w:tr>
+        <w:trPr>
+          <w:cantSplit/>
+        </w:trPr>
+        <w:tc>
+          <w:tcPr>
+            <w:tcW w:type="dxa" w:w="1534"/>
+            <w:tcBorders>
+              <w:top w:val="single" w:color="BFC9D6" w:sz="4"/>
+              <w:left w:val="single" w:color="BFC9D6" w:sz="4"/>
+              <w:bottom w:val="single" w:color="BFC9D6" w:sz="4"/>
+              <w:right w:val="single" w:color="BFC9D6" w:sz="4"/>
+            </w:tcBorders>
+            <w:tcMar>
+              <w:top w:type="dxa" w:w="60"/>
+              <w:left w:type="dxa" w:w="100"/>
+              <w:bottom w:type="dxa" w:w="60"/>
+              <w:right w:type="dxa" w:w="100"/>
+            </w:tcMar>
+            <w:vAlign w:val="center"/>
+          </w:tcPr>
+          <w:p>
+            <w:pPr>
+              <w:spacing w:after="30" w:before="30"/>
+              <w:jc w:val="left"/>
+            </w:pPr>
+            <w:r>
+              <w:rPr>
+                <w:rFonts w:ascii="Calibri" w:cs="Calibri" w:eastAsia="Calibri" w:hAnsi="Calibri"/>
+                <w:b/>
+                <w:bCs/>
+                <w:sz w:val="16"/>
+                <w:szCs w:val="16"/>
+              </w:rPr>
+              <w:t xml:space="preserve">M06 Finance &amp; Fees</w:t>
+            </w:r>
+          </w:p>
+        </w:tc>
+        <w:tc>
+          <w:tcPr>
+            <w:tcW w:type="dxa" w:w="4964"/>
+            <w:tcBorders>
+              <w:top w:val="single" w:color="BFC9D6" w:sz="4"/>
+              <w:left w:val="single" w:color="BFC9D6" w:sz="4"/>
+              <w:bottom w:val="single" w:color="BFC9D6" w:sz="4"/>
+              <w:right w:val="single" w:color="BFC9D6" w:sz="4"/>
+            </w:tcBorders>
+            <w:tcMar>
+              <w:top w:type="dxa" w:w="60"/>
+              <w:left w:type="dxa" w:w="100"/>
+              <w:bottom w:type="dxa" w:w="60"/>
+              <w:right w:type="dxa" w:w="100"/>
+            </w:tcMar>
+            <w:vAlign w:val="center"/>
+          </w:tcPr>
+          <w:p>
+            <w:pPr>
+              <w:spacing w:after="30" w:before="30"/>
+              <w:jc w:val="left"/>
+            </w:pPr>
+            <w:r>
+              <w:rPr>
+                <w:rFonts w:ascii="Calibri" w:cs="Calibri" w:eastAsia="Calibri" w:hAnsi="Calibri"/>
+                <w:sz w:val="16"/>
+                <w:szCs w:val="16"/>
+              </w:rPr>
+              <w:t xml:space="preserve">Fee items with GFS codes; fee structures approved by the Bursar, with instalments; invoices and GePG control numbers; signed payment callback; PDF receipts; allocation to fee items and credit; clearance gates; daily GePG reconciliation and monthly sign-off; finance overview with collection targets; sponsors (HESLB as a sponsor) with sponsor invoices and remittances; waivers and refunds with two-level approval; postings file for the accounting system.</w:t>
+            </w:r>
+          </w:p>
+        </w:tc>
+        <w:tc>
+          <w:tcPr>
+            <w:tcW w:type="dxa" w:w="2528"/>
+            <w:tcBorders>
+              <w:top w:val="single" w:color="BFC9D6" w:sz="4"/>
+              <w:left w:val="single" w:color="BFC9D6" w:sz="4"/>
+              <w:bottom w:val="single" w:color="BFC9D6" w:sz="4"/>
+              <w:right w:val="single" w:color="BFC9D6" w:sz="4"/>
+            </w:tcBorders>
+            <w:tcMar>
+              <w:top w:type="dxa" w:w="60"/>
+              <w:left w:type="dxa" w:w="100"/>
+              <w:bottom w:type="dxa" w:w="60"/>
+              <w:right w:type="dxa" w:w="100"/>
+            </w:tcMar>
+            <w:vAlign w:val="center"/>
+          </w:tcPr>
+          <w:p>
+            <w:pPr>
+              <w:spacing w:after="30" w:before="30"/>
+              <w:jc w:val="left"/>
+            </w:pPr>
+            <w:r>
+              <w:rPr>
+                <w:rFonts w:ascii="Calibri" w:cs="Calibri" w:eastAsia="Calibri" w:hAnsi="Calibri"/>
+                <w:sz w:val="16"/>
+                <w:szCs w:val="16"/>
+              </w:rPr>
+              <w:t xml:space="preserve">Live GePG connection (simulated today); instalment reminders; HESLB file formats; bank statement reconciliation; MUSE API.</w:t>
+            </w:r>
+          </w:p>
+        </w:tc>
+      </w:tr>
+      <w:tr>
+        <w:trPr>
+          <w:cantSplit/>
+        </w:trPr>
+        <w:tc>
+          <w:tcPr>
+            <w:tcW w:type="dxa" w:w="1534"/>
+            <w:tcBorders>
+              <w:top w:val="single" w:color="BFC9D6" w:sz="4"/>
+              <w:left w:val="single" w:color="BFC9D6" w:sz="4"/>
+              <w:bottom w:val="single" w:color="BFC9D6" w:sz="4"/>
+              <w:right w:val="single" w:color="BFC9D6" w:sz="4"/>
+            </w:tcBorders>
+            <w:shd w:fill="EEF3F8" w:color="auto" w:val="clear"/>
+            <w:tcMar>
+              <w:top w:type="dxa" w:w="60"/>
+              <w:left w:type="dxa" w:w="100"/>
+              <w:bottom w:type="dxa" w:w="60"/>
+              <w:right w:type="dxa" w:w="100"/>
+            </w:tcMar>
+            <w:vAlign w:val="center"/>
+          </w:tcPr>
+          <w:p>
+            <w:pPr>
+              <w:spacing w:after="30" w:before="30"/>
+              <w:jc w:val="left"/>
+            </w:pPr>
+            <w:r>
+              <w:rPr>
+                <w:rFonts w:ascii="Calibri" w:cs="Calibri" w:eastAsia="Calibri" w:hAnsi="Calibri"/>
+                <w:b/>
+                <w:bCs/>
+                <w:sz w:val="16"/>
+                <w:szCs w:val="16"/>
+              </w:rPr>
+              <w:t xml:space="preserve">M07 Hostel &amp; Accommodation</w:t>
+            </w:r>
+          </w:p>
+        </w:tc>
+        <w:tc>
+          <w:tcPr>
+            <w:tcW w:type="dxa" w:w="4964"/>
+            <w:tcBorders>
+              <w:top w:val="single" w:color="BFC9D6" w:sz="4"/>
+              <w:left w:val="single" w:color="BFC9D6" w:sz="4"/>
+              <w:bottom w:val="single" w:color="BFC9D6" w:sz="4"/>
+              <w:right w:val="single" w:color="BFC9D6" w:sz="4"/>
+            </w:tcBorders>
+            <w:shd w:fill="EEF3F8" w:color="auto" w:val="clear"/>
+            <w:tcMar>
+              <w:top w:type="dxa" w:w="60"/>
+              <w:left w:type="dxa" w:w="100"/>
+              <w:bottom w:type="dxa" w:w="60"/>
+              <w:right w:type="dxa" w:w="100"/>
+            </w:tcMar>
+            <w:vAlign w:val="center"/>
+          </w:tcPr>
+          <w:p>
+            <w:pPr>
+              <w:spacing w:after="30" w:before="30"/>
+              <w:jc w:val="left"/>
+            </w:pPr>
+            <w:r>
+              <w:rPr>
+                <w:rFonts w:ascii="Calibri" w:cs="Calibri" w:eastAsia="Calibri" w:hAnsi="Calibri"/>
+                <w:sz w:val="16"/>
+                <w:szCs w:val="16"/>
+              </w:rPr>
+              <w:t xml:space="preserve">Bed inventory with gender rules; application windows; automatic or manual allocation by priority with a waiting list; hostel invoice and release of unpaid beds; check-in and check-out with damages; wardens assigned to hostels; repairs reported by wardens and students.</w:t>
+            </w:r>
+          </w:p>
+        </w:tc>
+        <w:tc>
+          <w:tcPr>
+            <w:tcW w:type="dxa" w:w="2528"/>
+            <w:tcBorders>
+              <w:top w:val="single" w:color="BFC9D6" w:sz="4"/>
+              <w:left w:val="single" w:color="BFC9D6" w:sz="4"/>
+              <w:bottom w:val="single" w:color="BFC9D6" w:sz="4"/>
+              <w:right w:val="single" w:color="BFC9D6" w:sz="4"/>
+            </w:tcBorders>
+            <w:shd w:fill="EEF3F8" w:color="auto" w:val="clear"/>
+            <w:tcMar>
+              <w:top w:type="dxa" w:w="60"/>
+              <w:left w:type="dxa" w:w="100"/>
+              <w:bottom w:type="dxa" w:w="60"/>
+              <w:right w:type="dxa" w:w="100"/>
+            </w:tcMar>
+            <w:vAlign w:val="center"/>
+          </w:tcPr>
+          <w:p>
+            <w:pPr>
+              <w:spacing w:after="30" w:before="30"/>
+              <w:jc w:val="left"/>
+            </w:pPr>
+            <w:r>
+              <w:rPr>
+                <w:rFonts w:ascii="Calibri" w:cs="Calibri" w:eastAsia="Calibri" w:hAnsi="Calibri"/>
+                <w:sz w:val="16"/>
+                <w:szCs w:val="16"/>
+              </w:rPr>
+              <w:t xml:space="preserve">Room changes and swaps; refunds when a paid allocation is cancelled.</w:t>
+            </w:r>
+          </w:p>
+        </w:tc>
+      </w:tr>
+      <w:tr>
+        <w:trPr>
+          <w:cantSplit/>
+        </w:trPr>
+        <w:tc>
+          <w:tcPr>
+            <w:tcW w:type="dxa" w:w="1534"/>
+            <w:tcBorders>
+              <w:top w:val="single" w:color="BFC9D6" w:sz="4"/>
+              <w:left w:val="single" w:color="BFC9D6" w:sz="4"/>
+              <w:bottom w:val="single" w:color="BFC9D6" w:sz="4"/>
+              <w:right w:val="single" w:color="BFC9D6" w:sz="4"/>
+            </w:tcBorders>
+            <w:tcMar>
+              <w:top w:type="dxa" w:w="60"/>
+              <w:left w:type="dxa" w:w="100"/>
+              <w:bottom w:type="dxa" w:w="60"/>
+              <w:right w:type="dxa" w:w="100"/>
+            </w:tcMar>
+            <w:vAlign w:val="center"/>
+          </w:tcPr>
+          <w:p>
+            <w:pPr>
+              <w:spacing w:after="30" w:before="30"/>
+              <w:jc w:val="left"/>
+            </w:pPr>
+            <w:r>
+              <w:rPr>
+                <w:rFonts w:ascii="Calibri" w:cs="Calibri" w:eastAsia="Calibri" w:hAnsi="Calibri"/>
+                <w:b/>
+                <w:bCs/>
+                <w:sz w:val="16"/>
+                <w:szCs w:val="16"/>
+              </w:rPr>
+              <w:t xml:space="preserve">M08 Industrial Practical Training</w:t>
+            </w:r>
+          </w:p>
+        </w:tc>
+        <w:tc>
+          <w:tcPr>
+            <w:tcW w:type="dxa" w:w="4964"/>
+            <w:tcBorders>
+              <w:top w:val="single" w:color="BFC9D6" w:sz="4"/>
+              <w:left w:val="single" w:color="BFC9D6" w:sz="4"/>
+              <w:bottom w:val="single" w:color="BFC9D6" w:sz="4"/>
+              <w:right w:val="single" w:color="BFC9D6" w:sz="4"/>
+            </w:tcBorders>
+            <w:tcMar>
+              <w:top w:type="dxa" w:w="60"/>
+              <w:left w:type="dxa" w:w="100"/>
+              <w:bottom w:type="dxa" w:w="60"/>
+              <w:right w:type="dxa" w:w="100"/>
+            </w:tcMar>
+            <w:vAlign w:val="center"/>
+          </w:tcPr>
+          <w:p>
+            <w:pPr>
+              <w:spacing w:after="30" w:before="30"/>
+              <w:jc w:val="left"/>
+            </w:pPr>
+            <w:r>
+              <w:rPr>
+                <w:rFonts w:ascii="Calibri" w:cs="Calibri" w:eastAsia="Calibri" w:hAnsi="Calibri"/>
+                <w:sz w:val="16"/>
+                <w:szCs w:val="16"/>
+              </w:rPr>
+              <w:t xml:space="preserve">Placement organisations; IPT periods with mark weights; student requests and placement with supervisors; numbered placement letters; weekly logbook approved by the institution supervisor; visits; IPT marks sent to results; coordinators limited to a department.</w:t>
+            </w:r>
+          </w:p>
+        </w:tc>
+        <w:tc>
+          <w:tcPr>
+            <w:tcW w:type="dxa" w:w="2528"/>
+            <w:tcBorders>
+              <w:top w:val="single" w:color="BFC9D6" w:sz="4"/>
+              <w:left w:val="single" w:color="BFC9D6" w:sz="4"/>
+              <w:bottom w:val="single" w:color="BFC9D6" w:sz="4"/>
+              <w:right w:val="single" w:color="BFC9D6" w:sz="4"/>
+            </w:tcBorders>
+            <w:tcMar>
+              <w:top w:type="dxa" w:w="60"/>
+              <w:left w:type="dxa" w:w="100"/>
+              <w:bottom w:type="dxa" w:w="60"/>
+              <w:right w:type="dxa" w:w="100"/>
+            </w:tcMar>
+            <w:vAlign w:val="center"/>
+          </w:tcPr>
+          <w:p>
+            <w:pPr>
+              <w:spacing w:after="30" w:before="30"/>
+              <w:jc w:val="left"/>
+            </w:pPr>
+            <w:r>
+              <w:rPr>
+                <w:rFonts w:ascii="Calibri" w:cs="Calibri" w:eastAsia="Calibri" w:hAnsi="Calibri"/>
+                <w:sz w:val="16"/>
+                <w:szCs w:val="16"/>
+              </w:rPr>
+              <w:t xml:space="preserve">Online access for workplace supervisors to enter their mark.</w:t>
+            </w:r>
+          </w:p>
+        </w:tc>
+      </w:tr>
+      <w:tr>
+        <w:trPr>
+          <w:cantSplit/>
+        </w:trPr>
+        <w:tc>
+          <w:tcPr>
+            <w:tcW w:type="dxa" w:w="1534"/>
+            <w:tcBorders>
+              <w:top w:val="single" w:color="BFC9D6" w:sz="4"/>
+              <w:left w:val="single" w:color="BFC9D6" w:sz="4"/>
+              <w:bottom w:val="single" w:color="BFC9D6" w:sz="4"/>
+              <w:right w:val="single" w:color="BFC9D6" w:sz="4"/>
+            </w:tcBorders>
+            <w:shd w:fill="EEF3F8" w:color="auto" w:val="clear"/>
+            <w:tcMar>
+              <w:top w:type="dxa" w:w="60"/>
+              <w:left w:type="dxa" w:w="100"/>
+              <w:bottom w:type="dxa" w:w="60"/>
+              <w:right w:type="dxa" w:w="100"/>
+            </w:tcMar>
+            <w:vAlign w:val="center"/>
+          </w:tcPr>
+          <w:p>
+            <w:pPr>
+              <w:spacing w:after="30" w:before="30"/>
+              <w:jc w:val="left"/>
+            </w:pPr>
+            <w:r>
+              <w:rPr>
+                <w:rFonts w:ascii="Calibri" w:cs="Calibri" w:eastAsia="Calibri" w:hAnsi="Calibri"/>
+                <w:b/>
+                <w:bCs/>
+                <w:sz w:val="16"/>
+                <w:szCs w:val="16"/>
+              </w:rPr>
+              <w:t xml:space="preserve">M09 Clearance, Graduation &amp; Alumni</w:t>
+            </w:r>
+          </w:p>
+        </w:tc>
+        <w:tc>
+          <w:tcPr>
+            <w:tcW w:type="dxa" w:w="4964"/>
+            <w:tcBorders>
+              <w:top w:val="single" w:color="BFC9D6" w:sz="4"/>
+              <w:left w:val="single" w:color="BFC9D6" w:sz="4"/>
+              <w:bottom w:val="single" w:color="BFC9D6" w:sz="4"/>
+              <w:right w:val="single" w:color="BFC9D6" w:sz="4"/>
+            </w:tcBorders>
+            <w:shd w:fill="EEF3F8" w:color="auto" w:val="clear"/>
+            <w:tcMar>
+              <w:top w:type="dxa" w:w="60"/>
+              <w:left w:type="dxa" w:w="100"/>
+              <w:bottom w:type="dxa" w:w="60"/>
+              <w:right w:type="dxa" w:w="100"/>
+            </w:tcMar>
+            <w:vAlign w:val="center"/>
+          </w:tcPr>
+          <w:p>
+            <w:pPr>
+              <w:spacing w:after="30" w:before="30"/>
+              <w:jc w:val="left"/>
+            </w:pPr>
+            <w:r>
+              <w:rPr>
+                <w:rFonts w:ascii="Calibri" w:cs="Calibri" w:eastAsia="Calibri" w:hAnsi="Calibri"/>
+                <w:sz w:val="16"/>
+                <w:szCs w:val="16"/>
+              </w:rPr>
+              <w:t xml:space="preserve">Clearance offices (finance clears itself when nothing is owed); clearance started by the student; graduand lists approved by the Governing Board; NACTVET graduand file; numbered certificates with QR code; public verification page.</w:t>
+            </w:r>
+          </w:p>
+        </w:tc>
+        <w:tc>
+          <w:tcPr>
+            <w:tcW w:type="dxa" w:w="2528"/>
+            <w:tcBorders>
+              <w:top w:val="single" w:color="BFC9D6" w:sz="4"/>
+              <w:left w:val="single" w:color="BFC9D6" w:sz="4"/>
+              <w:bottom w:val="single" w:color="BFC9D6" w:sz="4"/>
+              <w:right w:val="single" w:color="BFC9D6" w:sz="4"/>
+            </w:tcBorders>
+            <w:shd w:fill="EEF3F8" w:color="auto" w:val="clear"/>
+            <w:tcMar>
+              <w:top w:type="dxa" w:w="60"/>
+              <w:left w:type="dxa" w:w="100"/>
+              <w:bottom w:type="dxa" w:w="60"/>
+              <w:right w:type="dxa" w:w="100"/>
+            </w:tcMar>
+            <w:vAlign w:val="center"/>
+          </w:tcPr>
+          <w:p>
+            <w:pPr>
+              <w:spacing w:after="30" w:before="30"/>
+              <w:jc w:val="left"/>
+            </w:pPr>
+            <w:r>
+              <w:rPr>
+                <w:rFonts w:ascii="Calibri" w:cs="Calibri" w:eastAsia="Calibri" w:hAnsi="Calibri"/>
+                <w:sz w:val="16"/>
+                <w:szCs w:val="16"/>
+              </w:rPr>
+              <w:t xml:space="preserve">Alumni contacts and tracer surveys.</w:t>
+            </w:r>
+          </w:p>
+        </w:tc>
+      </w:tr>
+      <w:tr>
+        <w:trPr>
+          <w:cantSplit/>
+        </w:trPr>
+        <w:tc>
+          <w:tcPr>
+            <w:tcW w:type="dxa" w:w="1534"/>
+            <w:tcBorders>
+              <w:top w:val="single" w:color="BFC9D6" w:sz="4"/>
+              <w:left w:val="single" w:color="BFC9D6" w:sz="4"/>
+              <w:bottom w:val="single" w:color="BFC9D6" w:sz="4"/>
+              <w:right w:val="single" w:color="BFC9D6" w:sz="4"/>
+            </w:tcBorders>
+            <w:tcMar>
+              <w:top w:type="dxa" w:w="60"/>
+              <w:left w:type="dxa" w:w="100"/>
+              <w:bottom w:type="dxa" w:w="60"/>
+              <w:right w:type="dxa" w:w="100"/>
+            </w:tcMar>
+            <w:vAlign w:val="center"/>
+          </w:tcPr>
+          <w:p>
+            <w:pPr>
+              <w:spacing w:after="30" w:before="30"/>
+              <w:jc w:val="left"/>
+            </w:pPr>
+            <w:r>
+              <w:rPr>
+                <w:rFonts w:ascii="Calibri" w:cs="Calibri" w:eastAsia="Calibri" w:hAnsi="Calibri"/>
+                <w:b/>
+                <w:bCs/>
+                <w:sz w:val="16"/>
+                <w:szCs w:val="16"/>
+              </w:rPr>
+              <w:t xml:space="preserve">M10 Student Self-Service</w:t>
+            </w:r>
+          </w:p>
+        </w:tc>
+        <w:tc>
+          <w:tcPr>
+            <w:tcW w:type="dxa" w:w="4964"/>
+            <w:tcBorders>
+              <w:top w:val="single" w:color="BFC9D6" w:sz="4"/>
+              <w:left w:val="single" w:color="BFC9D6" w:sz="4"/>
+              <w:bottom w:val="single" w:color="BFC9D6" w:sz="4"/>
+              <w:right w:val="single" w:color="BFC9D6" w:sz="4"/>
+            </w:tcBorders>
+            <w:tcMar>
+              <w:top w:type="dxa" w:w="60"/>
+              <w:left w:type="dxa" w:w="100"/>
+              <w:bottom w:type="dxa" w:w="60"/>
+              <w:right w:type="dxa" w:w="100"/>
+            </w:tcMar>
+            <w:vAlign w:val="center"/>
+          </w:tcPr>
+          <w:p>
+            <w:pPr>
+              <w:spacing w:after="30" w:before="30"/>
+              <w:jc w:val="left"/>
+            </w:pPr>
+            <w:r>
+              <w:rPr>
+                <w:rFonts w:ascii="Calibri" w:cs="Calibri" w:eastAsia="Calibri" w:hAnsi="Calibri"/>
+                <w:sz w:val="16"/>
+                <w:szCs w:val="16"/>
+              </w:rPr>
+              <w:t xml:space="preserve">Installable student portal in English and Kiswahili: what to do next, fees, control numbers and receipts, semester registration, results, resits and appeals, attendance and check-in, hostel and repairs, IPT logbook, clearance, notices and detail changes.</w:t>
+            </w:r>
+          </w:p>
+        </w:tc>
+        <w:tc>
+          <w:tcPr>
+            <w:tcW w:type="dxa" w:w="2528"/>
+            <w:tcBorders>
+              <w:top w:val="single" w:color="BFC9D6" w:sz="4"/>
+              <w:left w:val="single" w:color="BFC9D6" w:sz="4"/>
+              <w:bottom w:val="single" w:color="BFC9D6" w:sz="4"/>
+              <w:right w:val="single" w:color="BFC9D6" w:sz="4"/>
+            </w:tcBorders>
+            <w:tcMar>
+              <w:top w:type="dxa" w:w="60"/>
+              <w:left w:type="dxa" w:w="100"/>
+              <w:bottom w:type="dxa" w:w="60"/>
+              <w:right w:type="dxa" w:w="100"/>
+            </w:tcMar>
+            <w:vAlign w:val="center"/>
+          </w:tcPr>
+          <w:p>
+            <w:pPr>
+              <w:spacing w:after="30" w:before="30"/>
+              <w:jc w:val="left"/>
+            </w:pPr>
+            <w:r>
+              <w:rPr>
+                <w:rFonts w:ascii="Calibri" w:cs="Calibri" w:eastAsia="Calibri" w:hAnsi="Calibri"/>
+                <w:sz w:val="16"/>
+                <w:szCs w:val="16"/>
+              </w:rPr>
+              <w:t xml:space="preserve">Offline caching of results and receipts.</w:t>
+            </w:r>
+          </w:p>
+        </w:tc>
+      </w:tr>
+      <w:tr>
+        <w:trPr>
+          <w:cantSplit/>
+        </w:trPr>
+        <w:tc>
+          <w:tcPr>
+            <w:tcW w:type="dxa" w:w="1534"/>
+            <w:tcBorders>
+              <w:top w:val="single" w:color="BFC9D6" w:sz="4"/>
+              <w:left w:val="single" w:color="BFC9D6" w:sz="4"/>
+              <w:bottom w:val="single" w:color="BFC9D6" w:sz="4"/>
+              <w:right w:val="single" w:color="BFC9D6" w:sz="4"/>
+            </w:tcBorders>
+            <w:shd w:fill="EEF3F8" w:color="auto" w:val="clear"/>
+            <w:tcMar>
+              <w:top w:type="dxa" w:w="60"/>
+              <w:left w:type="dxa" w:w="100"/>
+              <w:bottom w:type="dxa" w:w="60"/>
+              <w:right w:type="dxa" w:w="100"/>
+            </w:tcMar>
+            <w:vAlign w:val="center"/>
+          </w:tcPr>
+          <w:p>
+            <w:pPr>
+              <w:spacing w:after="30" w:before="30"/>
+              <w:jc w:val="left"/>
+            </w:pPr>
+            <w:r>
+              <w:rPr>
+                <w:rFonts w:ascii="Calibri" w:cs="Calibri" w:eastAsia="Calibri" w:hAnsi="Calibri"/>
+                <w:b/>
+                <w:bCs/>
+                <w:sz w:val="16"/>
+                <w:szCs w:val="16"/>
+              </w:rPr>
+              <w:t xml:space="preserve">M11 Reports &amp; Dashboards</w:t>
+            </w:r>
+          </w:p>
+        </w:tc>
+        <w:tc>
+          <w:tcPr>
+            <w:tcW w:type="dxa" w:w="4964"/>
+            <w:tcBorders>
+              <w:top w:val="single" w:color="BFC9D6" w:sz="4"/>
+              <w:left w:val="single" w:color="BFC9D6" w:sz="4"/>
+              <w:bottom w:val="single" w:color="BFC9D6" w:sz="4"/>
+              <w:right w:val="single" w:color="BFC9D6" w:sz="4"/>
+            </w:tcBorders>
+            <w:shd w:fill="EEF3F8" w:color="auto" w:val="clear"/>
+            <w:tcMar>
+              <w:top w:type="dxa" w:w="60"/>
+              <w:left w:type="dxa" w:w="100"/>
+              <w:bottom w:type="dxa" w:w="60"/>
+              <w:right w:type="dxa" w:w="100"/>
+            </w:tcMar>
+            <w:vAlign w:val="center"/>
+          </w:tcPr>
+          <w:p>
+            <w:pPr>
+              <w:spacing w:after="30" w:before="30"/>
+              <w:jc w:val="left"/>
+            </w:pPr>
+            <w:r>
+              <w:rPr>
+                <w:rFonts w:ascii="Calibri" w:cs="Calibri" w:eastAsia="Calibri" w:hAnsi="Calibri"/>
+                <w:sz w:val="16"/>
+                <w:szCs w:val="16"/>
+              </w:rPr>
+              <w:t xml:space="preserve">Role-based landing pages (institution overview, finance overview, examinations office, My teaching); one Approvals list; role dashboards; 35 standard reports on screen, in Excel and PDF; every export recorded.</w:t>
+            </w:r>
+          </w:p>
+        </w:tc>
+        <w:tc>
+          <w:tcPr>
+            <w:tcW w:type="dxa" w:w="2528"/>
+            <w:tcBorders>
+              <w:top w:val="single" w:color="BFC9D6" w:sz="4"/>
+              <w:left w:val="single" w:color="BFC9D6" w:sz="4"/>
+              <w:bottom w:val="single" w:color="BFC9D6" w:sz="4"/>
+              <w:right w:val="single" w:color="BFC9D6" w:sz="4"/>
+            </w:tcBorders>
+            <w:shd w:fill="EEF3F8" w:color="auto" w:val="clear"/>
+            <w:tcMar>
+              <w:top w:type="dxa" w:w="60"/>
+              <w:left w:type="dxa" w:w="100"/>
+              <w:bottom w:type="dxa" w:w="60"/>
+              <w:right w:type="dxa" w:w="100"/>
+            </w:tcMar>
+            <w:vAlign w:val="center"/>
+          </w:tcPr>
+          <w:p>
+            <w:pPr>
+              <w:spacing w:after="30" w:before="30"/>
+              <w:jc w:val="left"/>
+            </w:pPr>
+            <w:r>
+              <w:rPr>
+                <w:rFonts w:ascii="Calibri" w:cs="Calibri" w:eastAsia="Calibri" w:hAnsi="Calibri"/>
+                <w:sz w:val="16"/>
+                <w:szCs w:val="16"/>
+              </w:rPr>
+              <w:t xml:space="preserve">Scheduled reports by email; regulator returns beyond the NACTVET files.</w:t>
+            </w:r>
+          </w:p>
+        </w:tc>
+      </w:tr>
+      <w:tr>
+        <w:trPr>
+          <w:cantSplit/>
+        </w:trPr>
+        <w:tc>
+          <w:tcPr>
+            <w:tcW w:type="dxa" w:w="1534"/>
+            <w:tcBorders>
+              <w:top w:val="single" w:color="BFC9D6" w:sz="4"/>
+              <w:left w:val="single" w:color="BFC9D6" w:sz="4"/>
+              <w:bottom w:val="single" w:color="BFC9D6" w:sz="4"/>
+              <w:right w:val="single" w:color="BFC9D6" w:sz="4"/>
+            </w:tcBorders>
+            <w:tcMar>
+              <w:top w:type="dxa" w:w="60"/>
+              <w:left w:type="dxa" w:w="100"/>
+              <w:bottom w:type="dxa" w:w="60"/>
+              <w:right w:type="dxa" w:w="100"/>
+            </w:tcMar>
+            <w:vAlign w:val="center"/>
+          </w:tcPr>
+          <w:p>
+            <w:pPr>
+              <w:spacing w:after="30" w:before="30"/>
+              <w:jc w:val="left"/>
+            </w:pPr>
+            <w:r>
+              <w:rPr>
+                <w:rFonts w:ascii="Calibri" w:cs="Calibri" w:eastAsia="Calibri" w:hAnsi="Calibri"/>
+                <w:b/>
+                <w:bCs/>
+                <w:sz w:val="16"/>
+                <w:szCs w:val="16"/>
+              </w:rPr>
+              <w:t xml:space="preserve">M12 Communication</w:t>
+            </w:r>
+          </w:p>
+        </w:tc>
+        <w:tc>
+          <w:tcPr>
+            <w:tcW w:type="dxa" w:w="4964"/>
+            <w:tcBorders>
+              <w:top w:val="single" w:color="BFC9D6" w:sz="4"/>
+              <w:left w:val="single" w:color="BFC9D6" w:sz="4"/>
+              <w:bottom w:val="single" w:color="BFC9D6" w:sz="4"/>
+              <w:right w:val="single" w:color="BFC9D6" w:sz="4"/>
+            </w:tcBorders>
+            <w:tcMar>
+              <w:top w:type="dxa" w:w="60"/>
+              <w:left w:type="dxa" w:w="100"/>
+              <w:bottom w:type="dxa" w:w="60"/>
+              <w:right w:type="dxa" w:w="100"/>
+            </w:tcMar>
+            <w:vAlign w:val="center"/>
+          </w:tcPr>
+          <w:p>
+            <w:pPr>
+              <w:spacing w:after="30" w:before="30"/>
+              <w:jc w:val="left"/>
+            </w:pPr>
+            <w:r>
+              <w:rPr>
+                <w:rFonts w:ascii="Calibri" w:cs="Calibri" w:eastAsia="Calibri" w:hAnsi="Calibri"/>
+                <w:sz w:val="16"/>
+                <w:szCs w:val="16"/>
+              </w:rPr>
+              <w:t xml:space="preserve">44 event SMS messages in English and Kiswahili that each institution can reword or switch off; outbox with retries and delivery reports; bulk messages with recipient and cost preview; prepaid SMS bundles; notices with read tracking.</w:t>
+            </w:r>
+          </w:p>
+        </w:tc>
+        <w:tc>
+          <w:tcPr>
+            <w:tcW w:type="dxa" w:w="2528"/>
+            <w:tcBorders>
+              <w:top w:val="single" w:color="BFC9D6" w:sz="4"/>
+              <w:left w:val="single" w:color="BFC9D6" w:sz="4"/>
+              <w:bottom w:val="single" w:color="BFC9D6" w:sz="4"/>
+              <w:right w:val="single" w:color="BFC9D6" w:sz="4"/>
+            </w:tcBorders>
+            <w:tcMar>
+              <w:top w:type="dxa" w:w="60"/>
+              <w:left w:type="dxa" w:w="100"/>
+              <w:bottom w:type="dxa" w:w="60"/>
+              <w:right w:type="dxa" w:w="100"/>
+            </w:tcMar>
+            <w:vAlign w:val="center"/>
+          </w:tcPr>
+          <w:p>
+            <w:pPr>
+              <w:spacing w:after="30" w:before="30"/>
+              <w:jc w:val="left"/>
+            </w:pPr>
+            <w:r>
+              <w:rPr>
+                <w:rFonts w:ascii="Calibri" w:cs="Calibri" w:eastAsia="Calibri" w:hAnsi="Calibri"/>
+                <w:sz w:val="16"/>
+                <w:szCs w:val="16"/>
+              </w:rPr>
+              <w:t xml:space="preserve">Email channel; connection to a live SMS aggregator (simulated today).</w:t>
+            </w:r>
+          </w:p>
+        </w:tc>
+      </w:tr>
+      <w:tr>
+        <w:trPr>
+          <w:cantSplit/>
+        </w:trPr>
+        <w:tc>
+          <w:tcPr>
+            <w:tcW w:type="dxa" w:w="1534"/>
+            <w:tcBorders>
+              <w:top w:val="single" w:color="BFC9D6" w:sz="4"/>
+              <w:left w:val="single" w:color="BFC9D6" w:sz="4"/>
+              <w:bottom w:val="single" w:color="BFC9D6" w:sz="4"/>
+              <w:right w:val="single" w:color="BFC9D6" w:sz="4"/>
+            </w:tcBorders>
+            <w:shd w:fill="EEF3F8" w:color="auto" w:val="clear"/>
+            <w:tcMar>
+              <w:top w:type="dxa" w:w="60"/>
+              <w:left w:type="dxa" w:w="100"/>
+              <w:bottom w:type="dxa" w:w="60"/>
+              <w:right w:type="dxa" w:w="100"/>
+            </w:tcMar>
+            <w:vAlign w:val="center"/>
+          </w:tcPr>
+          <w:p>
+            <w:pPr>
+              <w:spacing w:after="30" w:before="30"/>
+              <w:jc w:val="left"/>
+            </w:pPr>
+            <w:r>
+              <w:rPr>
+                <w:rFonts w:ascii="Calibri" w:cs="Calibri" w:eastAsia="Calibri" w:hAnsi="Calibri"/>
+                <w:b/>
+                <w:bCs/>
+                <w:sz w:val="16"/>
+                <w:szCs w:val="16"/>
+              </w:rPr>
+              <w:t xml:space="preserve">M13 Administration &amp; Security</w:t>
+            </w:r>
+          </w:p>
+        </w:tc>
+        <w:tc>
+          <w:tcPr>
+            <w:tcW w:type="dxa" w:w="4964"/>
+            <w:tcBorders>
+              <w:top w:val="single" w:color="BFC9D6" w:sz="4"/>
+              <w:left w:val="single" w:color="BFC9D6" w:sz="4"/>
+              <w:bottom w:val="single" w:color="BFC9D6" w:sz="4"/>
+              <w:right w:val="single" w:color="BFC9D6" w:sz="4"/>
+            </w:tcBorders>
+            <w:shd w:fill="EEF3F8" w:color="auto" w:val="clear"/>
+            <w:tcMar>
+              <w:top w:type="dxa" w:w="60"/>
+              <w:left w:type="dxa" w:w="100"/>
+              <w:bottom w:type="dxa" w:w="60"/>
+              <w:right w:type="dxa" w:w="100"/>
+            </w:tcMar>
+            <w:vAlign w:val="center"/>
+          </w:tcPr>
+          <w:p>
+            <w:pPr>
+              <w:spacing w:after="30" w:before="30"/>
+              <w:jc w:val="left"/>
+            </w:pPr>
+            <w:r>
+              <w:rPr>
+                <w:rFonts w:ascii="Calibri" w:cs="Calibri" w:eastAsia="Calibri" w:hAnsi="Calibri"/>
+                <w:sz w:val="16"/>
+                <w:szCs w:val="16"/>
+              </w:rPr>
+              <w:t xml:space="preserve">Msingi platform console (onboarding from the NACTVET catalogue, suspension, SMS credit, integration health); staff users and roles with department and programme scopes (20 roles); temporary passwords replaced at first sign-in; audit trail page and export; PostgreSQL row-level security for every institution table.</w:t>
+            </w:r>
+          </w:p>
+        </w:tc>
+        <w:tc>
+          <w:tcPr>
+            <w:tcW w:type="dxa" w:w="2528"/>
+            <w:tcBorders>
+              <w:top w:val="single" w:color="BFC9D6" w:sz="4"/>
+              <w:left w:val="single" w:color="BFC9D6" w:sz="4"/>
+              <w:bottom w:val="single" w:color="BFC9D6" w:sz="4"/>
+              <w:right w:val="single" w:color="BFC9D6" w:sz="4"/>
+            </w:tcBorders>
+            <w:shd w:fill="EEF3F8" w:color="auto" w:val="clear"/>
+            <w:tcMar>
+              <w:top w:type="dxa" w:w="60"/>
+              <w:left w:type="dxa" w:w="100"/>
+              <w:bottom w:type="dxa" w:w="60"/>
+              <w:right w:type="dxa" w:w="100"/>
+            </w:tcMar>
+            <w:vAlign w:val="center"/>
+          </w:tcPr>
+          <w:p>
+            <w:pPr>
+              <w:spacing w:after="30" w:before="30"/>
+              <w:jc w:val="left"/>
+            </w:pPr>
+            <w:r>
+              <w:rPr>
+                <w:rFonts w:ascii="Calibri" w:cs="Calibri" w:eastAsia="Calibri" w:hAnsi="Calibri"/>
+                <w:sz w:val="16"/>
+                <w:szCs w:val="16"/>
+              </w:rPr>
+              <w:t xml:space="preserve">Multi-factor authentication; configurable approval chains (approval steps are fixed in the software); data subject requests and retention jobs; data import tools for migration.</w:t>
+            </w:r>
+          </w:p>
+        </w:tc>
+      </w:tr>
+      <w:tr>
+        <w:trPr>
+          <w:cantSplit/>
+        </w:trPr>
+        <w:tc>
+          <w:tcPr>
+            <w:tcW w:type="dxa" w:w="1534"/>
+            <w:tcBorders>
+              <w:top w:val="single" w:color="BFC9D6" w:sz="4"/>
+              <w:left w:val="single" w:color="BFC9D6" w:sz="4"/>
+              <w:bottom w:val="single" w:color="BFC9D6" w:sz="4"/>
+              <w:right w:val="single" w:color="BFC9D6" w:sz="4"/>
+            </w:tcBorders>
+            <w:tcMar>
+              <w:top w:type="dxa" w:w="60"/>
+              <w:left w:type="dxa" w:w="100"/>
+              <w:bottom w:type="dxa" w:w="60"/>
+              <w:right w:type="dxa" w:w="100"/>
+            </w:tcMar>
+            <w:vAlign w:val="center"/>
+          </w:tcPr>
+          <w:p>
+            <w:pPr>
+              <w:spacing w:after="30" w:before="30"/>
+              <w:jc w:val="left"/>
+            </w:pPr>
+            <w:r>
+              <w:rPr>
+                <w:rFonts w:ascii="Calibri" w:cs="Calibri" w:eastAsia="Calibri" w:hAnsi="Calibri"/>
+                <w:b/>
+                <w:bCs/>
+                <w:sz w:val="16"/>
+                <w:szCs w:val="16"/>
+              </w:rPr>
+              <w:t xml:space="preserve">M14 Integration Hub</w:t>
+            </w:r>
+          </w:p>
+        </w:tc>
+        <w:tc>
+          <w:tcPr>
+            <w:tcW w:type="dxa" w:w="4964"/>
+            <w:tcBorders>
+              <w:top w:val="single" w:color="BFC9D6" w:sz="4"/>
+              <w:left w:val="single" w:color="BFC9D6" w:sz="4"/>
+              <w:bottom w:val="single" w:color="BFC9D6" w:sz="4"/>
+              <w:right w:val="single" w:color="BFC9D6" w:sz="4"/>
+            </w:tcBorders>
+            <w:tcMar>
+              <w:top w:type="dxa" w:w="60"/>
+              <w:left w:type="dxa" w:w="100"/>
+              <w:bottom w:type="dxa" w:w="60"/>
+              <w:right w:type="dxa" w:w="100"/>
+            </w:tcMar>
+            <w:vAlign w:val="center"/>
+          </w:tcPr>
+          <w:p>
+            <w:pPr>
+              <w:spacing w:after="30" w:before="30"/>
+              <w:jc w:val="left"/>
+            </w:pPr>
+            <w:r>
+              <w:rPr>
+                <w:rFonts w:ascii="Calibri" w:cs="Calibri" w:eastAsia="Calibri" w:hAnsi="Calibri"/>
+                <w:sz w:val="16"/>
+                <w:szCs w:val="16"/>
+              </w:rPr>
+              <w:t xml:space="preserve">NECTA results (simulated and live client); NACTVET particulars and institution catalogue (live); NACTVET verification (simulated, and a live HTTP adapter tested against a NACTVET test server); GePG (simulated, signed callback, reconciliation file); SMS (simulated, with outbox); log of every call to an outside system.</w:t>
+            </w:r>
+          </w:p>
+        </w:tc>
+        <w:tc>
+          <w:tcPr>
+            <w:tcW w:type="dxa" w:w="2528"/>
+            <w:tcBorders>
+              <w:top w:val="single" w:color="BFC9D6" w:sz="4"/>
+              <w:left w:val="single" w:color="BFC9D6" w:sz="4"/>
+              <w:bottom w:val="single" w:color="BFC9D6" w:sz="4"/>
+              <w:right w:val="single" w:color="BFC9D6" w:sz="4"/>
+            </w:tcBorders>
+            <w:tcMar>
+              <w:top w:type="dxa" w:w="60"/>
+              <w:left w:type="dxa" w:w="100"/>
+              <w:bottom w:type="dxa" w:w="60"/>
+              <w:right w:type="dxa" w:w="100"/>
+            </w:tcMar>
+            <w:vAlign w:val="center"/>
+          </w:tcPr>
+          <w:p>
+            <w:pPr>
+              <w:spacing w:after="30" w:before="30"/>
+              <w:jc w:val="left"/>
+            </w:pPr>
+            <w:r>
+              <w:rPr>
+                <w:rFonts w:ascii="Calibri" w:cs="Calibri" w:eastAsia="Calibri" w:hAnsi="Calibri"/>
+                <w:sz w:val="16"/>
+                <w:szCs w:val="16"/>
+              </w:rPr>
+              <w:t xml:space="preserve">Live GePG, SMS aggregator and NACTVET verification endpoints; HESLB, NIDA, MUSE, TAMISEMI and GovESB connectors; OAuth2 client access for third parties.</w:t>
+            </w:r>
+          </w:p>
+        </w:tc>
+      </w:tr>
+    </w:tbl>
+    <w:p>
+      <w:pPr>
+        <w:spacing w:after="120"/>
+      </w:pPr>
+    </w:p>
+    <w:p>
+      <w:pPr>
+        <w:spacing w:after="200" w:before="60"/>
+        <w:jc w:val="center"/>
+      </w:pPr>
+      <w:r>
+        <w:rPr>
+          <w:rFonts w:ascii="Calibri" w:cs="Calibri" w:eastAsia="Calibri" w:hAnsi="Calibri"/>
+          <w:i/>
+          <w:iCs/>
+          <w:color w:val="595959"/>
+          <w:sz w:val="18"/>
+          <w:szCs w:val="18"/>
+        </w:rPr>
+        <w:t xml:space="preserve">Table 2: CIMS modules as built, October 2026</w:t>
+      </w:r>
+    </w:p>
+    <w:p>
+      <w:pPr>
+        <w:pStyle w:val="Heading2"/>
+      </w:pPr>
+      <w:r>
+        <w:rPr>
+          <w:rFonts w:ascii="Calibri" w:cs="Calibri" w:eastAsia="Calibri" w:hAnsi="Calibri"/>
+        </w:rPr>
+        <w:t xml:space="preserve">5.5 Connections to national systems as built</w:t>
+      </w:r>
+    </w:p>
+    <w:p>
+      <w:pPr>
+        <w:spacing w:after="120" w:line="276"/>
+        <w:jc w:val="both"/>
+      </w:pPr>
+      <w:r>
+        <w:rPr>
+          <w:rFonts w:ascii="Calibri" w:cs="Calibri" w:eastAsia="Calibri" w:hAnsi="Calibri"/>
+        </w:rPr>
+        <w:t xml:space="preserve">Each connection has a simulated mode for development and testing and, where the external body provides an interface, a live mode. The mode is a setting, so an institution moves to live without any change to its processes.</w:t>
+      </w:r>
+    </w:p>
+    <w:tbl>
+      <w:tblPr>
+        <w:tblW w:type="dxa" w:w="9026"/>
+        <w:tblBorders>
+          <w:top w:val="single" w:color="auto" w:sz="4"/>
+          <w:left w:val="single" w:color="auto" w:sz="4"/>
+          <w:bottom w:val="single" w:color="auto" w:sz="4"/>
+          <w:right w:val="single" w:color="auto" w:sz="4"/>
+          <w:insideH w:val="single" w:color="auto" w:sz="4"/>
+          <w:insideV w:val="single" w:color="auto" w:sz="4"/>
+        </w:tblBorders>
+        <w:tblLayout w:type="fixed"/>
+      </w:tblPr>
+      <w:tblGrid>
+        <w:gridCol w:w="1985"/>
+        <w:gridCol w:w="1263"/>
+        <w:gridCol w:w="5778"/>
+      </w:tblGrid>
+      <w:tr>
+        <w:trPr>
+          <w:tblHeader/>
+          <w:cantSplit/>
+        </w:trPr>
+        <w:tc>
+          <w:tcPr>
+            <w:tcW w:type="dxa" w:w="1985"/>
+            <w:tcBorders>
+              <w:top w:val="single" w:color="BFC9D6" w:sz="4"/>
+              <w:left w:val="single" w:color="BFC9D6" w:sz="4"/>
+              <w:bottom w:val="single" w:color="BFC9D6" w:sz="4"/>
+              <w:right w:val="single" w:color="BFC9D6" w:sz="4"/>
+            </w:tcBorders>
+            <w:shd w:fill="1F3864" w:color="auto" w:val="clear"/>
+            <w:tcMar>
+              <w:top w:type="dxa" w:w="60"/>
+              <w:left w:type="dxa" w:w="100"/>
+              <w:bottom w:type="dxa" w:w="60"/>
+              <w:right w:type="dxa" w:w="100"/>
+            </w:tcMar>
+            <w:vAlign w:val="center"/>
+          </w:tcPr>
+          <w:p>
+            <w:pPr>
+              <w:spacing w:after="30" w:before="30"/>
+              <w:jc w:val="left"/>
+            </w:pPr>
+            <w:r>
+              <w:rPr>
+                <w:rFonts w:ascii="Calibri" w:cs="Calibri" w:eastAsia="Calibri" w:hAnsi="Calibri"/>
+                <w:b/>
+                <w:bCs/>
+                <w:color w:val="FFFFFF"/>
+                <w:sz w:val="16"/>
+                <w:szCs w:val="16"/>
+              </w:rPr>
+              <w:t xml:space="preserve">System</w:t>
+            </w:r>
+          </w:p>
+        </w:tc>
+        <w:tc>
+          <w:tcPr>
+            <w:tcW w:type="dxa" w:w="1263"/>
+            <w:tcBorders>
+              <w:top w:val="single" w:color="BFC9D6" w:sz="4"/>
+              <w:left w:val="single" w:color="BFC9D6" w:sz="4"/>
+              <w:bottom w:val="single" w:color="BFC9D6" w:sz="4"/>
+              <w:right w:val="single" w:color="BFC9D6" w:sz="4"/>
+            </w:tcBorders>
+            <w:shd w:fill="1F3864" w:color="auto" w:val="clear"/>
+            <w:tcMar>
+              <w:top w:type="dxa" w:w="60"/>
+              <w:left w:type="dxa" w:w="100"/>
+              <w:bottom w:type="dxa" w:w="60"/>
+              <w:right w:type="dxa" w:w="100"/>
+            </w:tcMar>
+            <w:vAlign w:val="center"/>
+          </w:tcPr>
+          <w:p>
+            <w:pPr>
+              <w:spacing w:after="30" w:before="30"/>
+              <w:jc w:val="left"/>
+            </w:pPr>
+            <w:r>
+              <w:rPr>
+                <w:rFonts w:ascii="Calibri" w:cs="Calibri" w:eastAsia="Calibri" w:hAnsi="Calibri"/>
+                <w:b/>
+                <w:bCs/>
+                <w:color w:val="FFFFFF"/>
+                <w:sz w:val="16"/>
+                <w:szCs w:val="16"/>
+              </w:rPr>
+              <w:t xml:space="preserve">Status</w:t>
+            </w:r>
+          </w:p>
+        </w:tc>
+        <w:tc>
+          <w:tcPr>
+            <w:tcW w:type="dxa" w:w="5778"/>
+            <w:tcBorders>
+              <w:top w:val="single" w:color="BFC9D6" w:sz="4"/>
+              <w:left w:val="single" w:color="BFC9D6" w:sz="4"/>
+              <w:bottom w:val="single" w:color="BFC9D6" w:sz="4"/>
+              <w:right w:val="single" w:color="BFC9D6" w:sz="4"/>
+            </w:tcBorders>
+            <w:shd w:fill="1F3864" w:color="auto" w:val="clear"/>
+            <w:tcMar>
+              <w:top w:type="dxa" w:w="60"/>
+              <w:left w:type="dxa" w:w="100"/>
+              <w:bottom w:type="dxa" w:w="60"/>
+              <w:right w:type="dxa" w:w="100"/>
+            </w:tcMar>
+            <w:vAlign w:val="center"/>
+          </w:tcPr>
+          <w:p>
+            <w:pPr>
+              <w:spacing w:after="30" w:before="30"/>
+              <w:jc w:val="left"/>
+            </w:pPr>
+            <w:r>
+              <w:rPr>
+                <w:rFonts w:ascii="Calibri" w:cs="Calibri" w:eastAsia="Calibri" w:hAnsi="Calibri"/>
+                <w:b/>
+                <w:bCs/>
+                <w:color w:val="FFFFFF"/>
+                <w:sz w:val="16"/>
+                <w:szCs w:val="16"/>
+              </w:rPr>
+              <w:t xml:space="preserve">As built</w:t>
+            </w:r>
+          </w:p>
+        </w:tc>
+      </w:tr>
+      <w:tr>
+        <w:trPr>
+          <w:cantSplit/>
+        </w:trPr>
+        <w:tc>
+          <w:tcPr>
+            <w:tcW w:type="dxa" w:w="1985"/>
+            <w:tcBorders>
+              <w:top w:val="single" w:color="BFC9D6" w:sz="4"/>
+              <w:left w:val="single" w:color="BFC9D6" w:sz="4"/>
+              <w:bottom w:val="single" w:color="BFC9D6" w:sz="4"/>
+              <w:right w:val="single" w:color="BFC9D6" w:sz="4"/>
+            </w:tcBorders>
+            <w:shd w:fill="EEF3F8" w:color="auto" w:val="clear"/>
+            <w:tcMar>
+              <w:top w:type="dxa" w:w="60"/>
+              <w:left w:type="dxa" w:w="100"/>
+              <w:bottom w:type="dxa" w:w="60"/>
+              <w:right w:type="dxa" w:w="100"/>
+            </w:tcMar>
+            <w:vAlign w:val="center"/>
+          </w:tcPr>
+          <w:p>
+            <w:pPr>
+              <w:spacing w:after="30" w:before="30"/>
+              <w:jc w:val="left"/>
+            </w:pPr>
+            <w:r>
+              <w:rPr>
+                <w:rFonts w:ascii="Calibri" w:cs="Calibri" w:eastAsia="Calibri" w:hAnsi="Calibri"/>
+                <w:b/>
+                <w:bCs/>
+                <w:sz w:val="16"/>
+                <w:szCs w:val="16"/>
+              </w:rPr>
+              <w:t xml:space="preserve">NECTA</w:t>
+            </w:r>
+          </w:p>
+        </w:tc>
+        <w:tc>
+          <w:tcPr>
+            <w:tcW w:type="dxa" w:w="1263"/>
+            <w:tcBorders>
+              <w:top w:val="single" w:color="BFC9D6" w:sz="4"/>
+              <w:left w:val="single" w:color="BFC9D6" w:sz="4"/>
+              <w:bottom w:val="single" w:color="BFC9D6" w:sz="4"/>
+              <w:right w:val="single" w:color="BFC9D6" w:sz="4"/>
+            </w:tcBorders>
+            <w:shd w:fill="EEF3F8" w:color="auto" w:val="clear"/>
+            <w:tcMar>
+              <w:top w:type="dxa" w:w="60"/>
+              <w:left w:type="dxa" w:w="100"/>
+              <w:bottom w:type="dxa" w:w="60"/>
+              <w:right w:type="dxa" w:w="100"/>
+            </w:tcMar>
+            <w:vAlign w:val="center"/>
+          </w:tcPr>
+          <w:p>
+            <w:pPr>
+              <w:spacing w:after="30" w:before="30"/>
+              <w:jc w:val="left"/>
+            </w:pPr>
+            <w:r>
+              <w:rPr>
+                <w:rFonts w:ascii="Calibri" w:cs="Calibri" w:eastAsia="Calibri" w:hAnsi="Calibri"/>
+                <w:sz w:val="16"/>
+                <w:szCs w:val="16"/>
+              </w:rPr>
+              <w:t xml:space="preserve">Built</w:t>
+            </w:r>
+          </w:p>
+        </w:tc>
+        <w:tc>
+          <w:tcPr>
+            <w:tcW w:type="dxa" w:w="5778"/>
+            <w:tcBorders>
+              <w:top w:val="single" w:color="BFC9D6" w:sz="4"/>
+              <w:left w:val="single" w:color="BFC9D6" w:sz="4"/>
+              <w:bottom w:val="single" w:color="BFC9D6" w:sz="4"/>
+              <w:right w:val="single" w:color="BFC9D6" w:sz="4"/>
+            </w:tcBorders>
+            <w:shd w:fill="EEF3F8" w:color="auto" w:val="clear"/>
+            <w:tcMar>
+              <w:top w:type="dxa" w:w="60"/>
+              <w:left w:type="dxa" w:w="100"/>
+              <w:bottom w:type="dxa" w:w="60"/>
+              <w:right w:type="dxa" w:w="100"/>
+            </w:tcMar>
+            <w:vAlign w:val="center"/>
+          </w:tcPr>
+          <w:p>
+            <w:pPr>
+              <w:spacing w:after="30" w:before="30"/>
+              <w:jc w:val="left"/>
+            </w:pPr>
+            <w:r>
+              <w:rPr>
+                <w:rFonts w:ascii="Calibri" w:cs="Calibri" w:eastAsia="Calibri" w:hAnsi="Calibri"/>
+                <w:sz w:val="16"/>
+                <w:szCs w:val="16"/>
+              </w:rPr>
+              <w:t xml:space="preserve">Results API client used at sign-up and for other sittings; simulated in development, live with the NECTA API key.</w:t>
+            </w:r>
+          </w:p>
+        </w:tc>
+      </w:tr>
+      <w:tr>
+        <w:trPr>
+          <w:cantSplit/>
+        </w:trPr>
+        <w:tc>
+          <w:tcPr>
+            <w:tcW w:type="dxa" w:w="1985"/>
+            <w:tcBorders>
+              <w:top w:val="single" w:color="BFC9D6" w:sz="4"/>
+              <w:left w:val="single" w:color="BFC9D6" w:sz="4"/>
+              <w:bottom w:val="single" w:color="BFC9D6" w:sz="4"/>
+              <w:right w:val="single" w:color="BFC9D6" w:sz="4"/>
+            </w:tcBorders>
+            <w:tcMar>
+              <w:top w:type="dxa" w:w="60"/>
+              <w:left w:type="dxa" w:w="100"/>
+              <w:bottom w:type="dxa" w:w="60"/>
+              <w:right w:type="dxa" w:w="100"/>
+            </w:tcMar>
+            <w:vAlign w:val="center"/>
+          </w:tcPr>
+          <w:p>
+            <w:pPr>
+              <w:spacing w:after="30" w:before="30"/>
+              <w:jc w:val="left"/>
+            </w:pPr>
+            <w:r>
+              <w:rPr>
+                <w:rFonts w:ascii="Calibri" w:cs="Calibri" w:eastAsia="Calibri" w:hAnsi="Calibri"/>
+                <w:b/>
+                <w:bCs/>
+                <w:sz w:val="16"/>
+                <w:szCs w:val="16"/>
+              </w:rPr>
+              <w:t xml:space="preserve">NACTVET: awards and catalogue</w:t>
+            </w:r>
+          </w:p>
+        </w:tc>
+        <w:tc>
+          <w:tcPr>
+            <w:tcW w:type="dxa" w:w="1263"/>
+            <w:tcBorders>
+              <w:top w:val="single" w:color="BFC9D6" w:sz="4"/>
+              <w:left w:val="single" w:color="BFC9D6" w:sz="4"/>
+              <w:bottom w:val="single" w:color="BFC9D6" w:sz="4"/>
+              <w:right w:val="single" w:color="BFC9D6" w:sz="4"/>
+            </w:tcBorders>
+            <w:tcMar>
+              <w:top w:type="dxa" w:w="60"/>
+              <w:left w:type="dxa" w:w="100"/>
+              <w:bottom w:type="dxa" w:w="60"/>
+              <w:right w:type="dxa" w:w="100"/>
+            </w:tcMar>
+            <w:vAlign w:val="center"/>
+          </w:tcPr>
+          <w:p>
+            <w:pPr>
+              <w:spacing w:after="30" w:before="30"/>
+              <w:jc w:val="left"/>
+            </w:pPr>
+            <w:r>
+              <w:rPr>
+                <w:rFonts w:ascii="Calibri" w:cs="Calibri" w:eastAsia="Calibri" w:hAnsi="Calibri"/>
+                <w:sz w:val="16"/>
+                <w:szCs w:val="16"/>
+              </w:rPr>
+              <w:t xml:space="preserve">Built</w:t>
+            </w:r>
+          </w:p>
+        </w:tc>
+        <w:tc>
+          <w:tcPr>
+            <w:tcW w:type="dxa" w:w="5778"/>
+            <w:tcBorders>
+              <w:top w:val="single" w:color="BFC9D6" w:sz="4"/>
+              <w:left w:val="single" w:color="BFC9D6" w:sz="4"/>
+              <w:bottom w:val="single" w:color="BFC9D6" w:sz="4"/>
+              <w:right w:val="single" w:color="BFC9D6" w:sz="4"/>
+            </w:tcBorders>
+            <w:tcMar>
+              <w:top w:type="dxa" w:w="60"/>
+              <w:left w:type="dxa" w:w="100"/>
+              <w:bottom w:type="dxa" w:w="60"/>
+              <w:right w:type="dxa" w:w="100"/>
+            </w:tcMar>
+            <w:vAlign w:val="center"/>
+          </w:tcPr>
+          <w:p>
+            <w:pPr>
+              <w:spacing w:after="30" w:before="30"/>
+              <w:jc w:val="left"/>
+            </w:pPr>
+            <w:r>
+              <w:rPr>
+                <w:rFonts w:ascii="Calibri" w:cs="Calibri" w:eastAsia="Calibri" w:hAnsi="Calibri"/>
+                <w:sz w:val="16"/>
+                <w:szCs w:val="16"/>
+              </w:rPr>
+              <w:t xml:space="preserve">Particulars service (NTA awards of applicants) and the registered institution and programme catalogue, live with NACTE credentials, as in NOAS.</w:t>
+            </w:r>
+          </w:p>
+        </w:tc>
+      </w:tr>
+      <w:tr>
+        <w:trPr>
+          <w:cantSplit/>
+        </w:trPr>
+        <w:tc>
+          <w:tcPr>
+            <w:tcW w:type="dxa" w:w="1985"/>
+            <w:tcBorders>
+              <w:top w:val="single" w:color="BFC9D6" w:sz="4"/>
+              <w:left w:val="single" w:color="BFC9D6" w:sz="4"/>
+              <w:bottom w:val="single" w:color="BFC9D6" w:sz="4"/>
+              <w:right w:val="single" w:color="BFC9D6" w:sz="4"/>
+            </w:tcBorders>
+            <w:shd w:fill="EEF3F8" w:color="auto" w:val="clear"/>
+            <w:tcMar>
+              <w:top w:type="dxa" w:w="60"/>
+              <w:left w:type="dxa" w:w="100"/>
+              <w:bottom w:type="dxa" w:w="60"/>
+              <w:right w:type="dxa" w:w="100"/>
+            </w:tcMar>
+            <w:vAlign w:val="center"/>
+          </w:tcPr>
+          <w:p>
+            <w:pPr>
+              <w:spacing w:after="30" w:before="30"/>
+              <w:jc w:val="left"/>
+            </w:pPr>
+            <w:r>
+              <w:rPr>
+                <w:rFonts w:ascii="Calibri" w:cs="Calibri" w:eastAsia="Calibri" w:hAnsi="Calibri"/>
+                <w:b/>
+                <w:bCs/>
+                <w:sz w:val="16"/>
+                <w:szCs w:val="16"/>
+              </w:rPr>
+              <w:t xml:space="preserve">NACTVET: admission verification</w:t>
+            </w:r>
+          </w:p>
+        </w:tc>
+        <w:tc>
+          <w:tcPr>
+            <w:tcW w:type="dxa" w:w="1263"/>
+            <w:tcBorders>
+              <w:top w:val="single" w:color="BFC9D6" w:sz="4"/>
+              <w:left w:val="single" w:color="BFC9D6" w:sz="4"/>
+              <w:bottom w:val="single" w:color="BFC9D6" w:sz="4"/>
+              <w:right w:val="single" w:color="BFC9D6" w:sz="4"/>
+            </w:tcBorders>
+            <w:shd w:fill="EEF3F8" w:color="auto" w:val="clear"/>
+            <w:tcMar>
+              <w:top w:type="dxa" w:w="60"/>
+              <w:left w:type="dxa" w:w="100"/>
+              <w:bottom w:type="dxa" w:w="60"/>
+              <w:right w:type="dxa" w:w="100"/>
+            </w:tcMar>
+            <w:vAlign w:val="center"/>
+          </w:tcPr>
+          <w:p>
+            <w:pPr>
+              <w:spacing w:after="30" w:before="30"/>
+              <w:jc w:val="left"/>
+            </w:pPr>
+            <w:r>
+              <w:rPr>
+                <w:rFonts w:ascii="Calibri" w:cs="Calibri" w:eastAsia="Calibri" w:hAnsi="Calibri"/>
+                <w:sz w:val="16"/>
+                <w:szCs w:val="16"/>
+              </w:rPr>
+              <w:t xml:space="preserve">Partly built</w:t>
+            </w:r>
+          </w:p>
+        </w:tc>
+        <w:tc>
+          <w:tcPr>
+            <w:tcW w:type="dxa" w:w="5778"/>
+            <w:tcBorders>
+              <w:top w:val="single" w:color="BFC9D6" w:sz="4"/>
+              <w:left w:val="single" w:color="BFC9D6" w:sz="4"/>
+              <w:bottom w:val="single" w:color="BFC9D6" w:sz="4"/>
+              <w:right w:val="single" w:color="BFC9D6" w:sz="4"/>
+            </w:tcBorders>
+            <w:shd w:fill="EEF3F8" w:color="auto" w:val="clear"/>
+            <w:tcMar>
+              <w:top w:type="dxa" w:w="60"/>
+              <w:left w:type="dxa" w:w="100"/>
+              <w:bottom w:type="dxa" w:w="60"/>
+              <w:right w:type="dxa" w:w="100"/>
+            </w:tcMar>
+            <w:vAlign w:val="center"/>
+          </w:tcPr>
+          <w:p>
+            <w:pPr>
+              <w:spacing w:after="30" w:before="30"/>
+              <w:jc w:val="left"/>
+            </w:pPr>
+            <w:r>
+              <w:rPr>
+                <w:rFonts w:ascii="Calibri" w:cs="Calibri" w:eastAsia="Calibri" w:hAnsi="Calibri"/>
+                <w:sz w:val="16"/>
+                <w:szCs w:val="16"/>
+              </w:rPr>
+              <w:t xml:space="preserve">Submission by API or NACTVET template file, outcomes, queries and confirmation codes work end to end. The live HTTP adapter uses placeholder endpoints until NACTVET publishes its API; it is tested against the nactvet-mock server.</w:t>
+            </w:r>
+          </w:p>
+        </w:tc>
+      </w:tr>
+      <w:tr>
+        <w:trPr>
+          <w:cantSplit/>
+        </w:trPr>
+        <w:tc>
+          <w:tcPr>
+            <w:tcW w:type="dxa" w:w="1985"/>
+            <w:tcBorders>
+              <w:top w:val="single" w:color="BFC9D6" w:sz="4"/>
+              <w:left w:val="single" w:color="BFC9D6" w:sz="4"/>
+              <w:bottom w:val="single" w:color="BFC9D6" w:sz="4"/>
+              <w:right w:val="single" w:color="BFC9D6" w:sz="4"/>
+            </w:tcBorders>
+            <w:tcMar>
+              <w:top w:type="dxa" w:w="60"/>
+              <w:left w:type="dxa" w:w="100"/>
+              <w:bottom w:type="dxa" w:w="60"/>
+              <w:right w:type="dxa" w:w="100"/>
+            </w:tcMar>
+            <w:vAlign w:val="center"/>
+          </w:tcPr>
+          <w:p>
+            <w:pPr>
+              <w:spacing w:after="30" w:before="30"/>
+              <w:jc w:val="left"/>
+            </w:pPr>
+            <w:r>
+              <w:rPr>
+                <w:rFonts w:ascii="Calibri" w:cs="Calibri" w:eastAsia="Calibri" w:hAnsi="Calibri"/>
+                <w:b/>
+                <w:bCs/>
+                <w:sz w:val="16"/>
+                <w:szCs w:val="16"/>
+              </w:rPr>
+              <w:t xml:space="preserve">NACTVET: results, graduands, NVA awards</w:t>
+            </w:r>
+          </w:p>
+        </w:tc>
+        <w:tc>
+          <w:tcPr>
+            <w:tcW w:type="dxa" w:w="1263"/>
+            <w:tcBorders>
+              <w:top w:val="single" w:color="BFC9D6" w:sz="4"/>
+              <w:left w:val="single" w:color="BFC9D6" w:sz="4"/>
+              <w:bottom w:val="single" w:color="BFC9D6" w:sz="4"/>
+              <w:right w:val="single" w:color="BFC9D6" w:sz="4"/>
+            </w:tcBorders>
+            <w:tcMar>
+              <w:top w:type="dxa" w:w="60"/>
+              <w:left w:type="dxa" w:w="100"/>
+              <w:bottom w:type="dxa" w:w="60"/>
+              <w:right w:type="dxa" w:w="100"/>
+            </w:tcMar>
+            <w:vAlign w:val="center"/>
+          </w:tcPr>
+          <w:p>
+            <w:pPr>
+              <w:spacing w:after="30" w:before="30"/>
+              <w:jc w:val="left"/>
+            </w:pPr>
+            <w:r>
+              <w:rPr>
+                <w:rFonts w:ascii="Calibri" w:cs="Calibri" w:eastAsia="Calibri" w:hAnsi="Calibri"/>
+                <w:sz w:val="16"/>
+                <w:szCs w:val="16"/>
+              </w:rPr>
+              <w:t xml:space="preserve">Partly built</w:t>
+            </w:r>
+          </w:p>
+        </w:tc>
+        <w:tc>
+          <w:tcPr>
+            <w:tcW w:type="dxa" w:w="5778"/>
+            <w:tcBorders>
+              <w:top w:val="single" w:color="BFC9D6" w:sz="4"/>
+              <w:left w:val="single" w:color="BFC9D6" w:sz="4"/>
+              <w:bottom w:val="single" w:color="BFC9D6" w:sz="4"/>
+              <w:right w:val="single" w:color="BFC9D6" w:sz="4"/>
+            </w:tcBorders>
+            <w:tcMar>
+              <w:top w:type="dxa" w:w="60"/>
+              <w:left w:type="dxa" w:w="100"/>
+              <w:bottom w:type="dxa" w:w="60"/>
+              <w:right w:type="dxa" w:w="100"/>
+            </w:tcMar>
+            <w:vAlign w:val="center"/>
+          </w:tcPr>
+          <w:p>
+            <w:pPr>
+              <w:spacing w:after="30" w:before="30"/>
+              <w:jc w:val="left"/>
+            </w:pPr>
+            <w:r>
+              <w:rPr>
+                <w:rFonts w:ascii="Calibri" w:cs="Calibri" w:eastAsia="Calibri" w:hAnsi="Calibri"/>
+                <w:sz w:val="16"/>
+                <w:szCs w:val="16"/>
+              </w:rPr>
+              <w:t xml:space="preserve">Excel files in an indicative layout and a record of each submission and response; NACTVET's official templates or API are awaited.</w:t>
+            </w:r>
+          </w:p>
+        </w:tc>
+      </w:tr>
+      <w:tr>
+        <w:trPr>
+          <w:cantSplit/>
+        </w:trPr>
+        <w:tc>
+          <w:tcPr>
+            <w:tcW w:type="dxa" w:w="1985"/>
+            <w:tcBorders>
+              <w:top w:val="single" w:color="BFC9D6" w:sz="4"/>
+              <w:left w:val="single" w:color="BFC9D6" w:sz="4"/>
+              <w:bottom w:val="single" w:color="BFC9D6" w:sz="4"/>
+              <w:right w:val="single" w:color="BFC9D6" w:sz="4"/>
+            </w:tcBorders>
+            <w:shd w:fill="EEF3F8" w:color="auto" w:val="clear"/>
+            <w:tcMar>
+              <w:top w:type="dxa" w:w="60"/>
+              <w:left w:type="dxa" w:w="100"/>
+              <w:bottom w:type="dxa" w:w="60"/>
+              <w:right w:type="dxa" w:w="100"/>
+            </w:tcMar>
+            <w:vAlign w:val="center"/>
+          </w:tcPr>
+          <w:p>
+            <w:pPr>
+              <w:spacing w:after="30" w:before="30"/>
+              <w:jc w:val="left"/>
+            </w:pPr>
+            <w:r>
+              <w:rPr>
+                <w:rFonts w:ascii="Calibri" w:cs="Calibri" w:eastAsia="Calibri" w:hAnsi="Calibri"/>
+                <w:b/>
+                <w:bCs/>
+                <w:sz w:val="16"/>
+                <w:szCs w:val="16"/>
+              </w:rPr>
+              <w:t xml:space="preserve">NACTVET: student registration</w:t>
+            </w:r>
+          </w:p>
+        </w:tc>
+        <w:tc>
+          <w:tcPr>
+            <w:tcW w:type="dxa" w:w="1263"/>
+            <w:tcBorders>
+              <w:top w:val="single" w:color="BFC9D6" w:sz="4"/>
+              <w:left w:val="single" w:color="BFC9D6" w:sz="4"/>
+              <w:bottom w:val="single" w:color="BFC9D6" w:sz="4"/>
+              <w:right w:val="single" w:color="BFC9D6" w:sz="4"/>
+            </w:tcBorders>
+            <w:shd w:fill="EEF3F8" w:color="auto" w:val="clear"/>
+            <w:tcMar>
+              <w:top w:type="dxa" w:w="60"/>
+              <w:left w:type="dxa" w:w="100"/>
+              <w:bottom w:type="dxa" w:w="60"/>
+              <w:right w:type="dxa" w:w="100"/>
+            </w:tcMar>
+            <w:vAlign w:val="center"/>
+          </w:tcPr>
+          <w:p>
+            <w:pPr>
+              <w:spacing w:after="30" w:before="30"/>
+              <w:jc w:val="left"/>
+            </w:pPr>
+            <w:r>
+              <w:rPr>
+                <w:rFonts w:ascii="Calibri" w:cs="Calibri" w:eastAsia="Calibri" w:hAnsi="Calibri"/>
+                <w:sz w:val="16"/>
+                <w:szCs w:val="16"/>
+              </w:rPr>
+              <w:t xml:space="preserve">Not yet built</w:t>
+            </w:r>
+          </w:p>
+        </w:tc>
+        <w:tc>
+          <w:tcPr>
+            <w:tcW w:type="dxa" w:w="5778"/>
+            <w:tcBorders>
+              <w:top w:val="single" w:color="BFC9D6" w:sz="4"/>
+              <w:left w:val="single" w:color="BFC9D6" w:sz="4"/>
+              <w:bottom w:val="single" w:color="BFC9D6" w:sz="4"/>
+              <w:right w:val="single" w:color="BFC9D6" w:sz="4"/>
+            </w:tcBorders>
+            <w:shd w:fill="EEF3F8" w:color="auto" w:val="clear"/>
+            <w:tcMar>
+              <w:top w:type="dxa" w:w="60"/>
+              <w:left w:type="dxa" w:w="100"/>
+              <w:bottom w:type="dxa" w:w="60"/>
+              <w:right w:type="dxa" w:w="100"/>
+            </w:tcMar>
+            <w:vAlign w:val="center"/>
+          </w:tcPr>
+          <w:p>
+            <w:pPr>
+              <w:spacing w:after="30" w:before="30"/>
+              <w:jc w:val="left"/>
+            </w:pPr>
+            <w:r>
+              <w:rPr>
+                <w:rFonts w:ascii="Calibri" w:cs="Calibri" w:eastAsia="Calibri" w:hAnsi="Calibri"/>
+                <w:sz w:val="16"/>
+                <w:szCs w:val="16"/>
+              </w:rPr>
+              <w:t xml:space="preserve">Planned with the registration template from NACTVET.</w:t>
+            </w:r>
+          </w:p>
+        </w:tc>
+      </w:tr>
+      <w:tr>
+        <w:trPr>
+          <w:cantSplit/>
+        </w:trPr>
+        <w:tc>
+          <w:tcPr>
+            <w:tcW w:type="dxa" w:w="1985"/>
+            <w:tcBorders>
+              <w:top w:val="single" w:color="BFC9D6" w:sz="4"/>
+              <w:left w:val="single" w:color="BFC9D6" w:sz="4"/>
+              <w:bottom w:val="single" w:color="BFC9D6" w:sz="4"/>
+              <w:right w:val="single" w:color="BFC9D6" w:sz="4"/>
+            </w:tcBorders>
+            <w:tcMar>
+              <w:top w:type="dxa" w:w="60"/>
+              <w:left w:type="dxa" w:w="100"/>
+              <w:bottom w:type="dxa" w:w="60"/>
+              <w:right w:type="dxa" w:w="100"/>
+            </w:tcMar>
+            <w:vAlign w:val="center"/>
+          </w:tcPr>
+          <w:p>
+            <w:pPr>
+              <w:spacing w:after="30" w:before="30"/>
+              <w:jc w:val="left"/>
+            </w:pPr>
+            <w:r>
+              <w:rPr>
+                <w:rFonts w:ascii="Calibri" w:cs="Calibri" w:eastAsia="Calibri" w:hAnsi="Calibri"/>
+                <w:b/>
+                <w:bCs/>
+                <w:sz w:val="16"/>
+                <w:szCs w:val="16"/>
+              </w:rPr>
+              <w:t xml:space="preserve">GePG</w:t>
+            </w:r>
+          </w:p>
+        </w:tc>
+        <w:tc>
+          <w:tcPr>
+            <w:tcW w:type="dxa" w:w="1263"/>
+            <w:tcBorders>
+              <w:top w:val="single" w:color="BFC9D6" w:sz="4"/>
+              <w:left w:val="single" w:color="BFC9D6" w:sz="4"/>
+              <w:bottom w:val="single" w:color="BFC9D6" w:sz="4"/>
+              <w:right w:val="single" w:color="BFC9D6" w:sz="4"/>
+            </w:tcBorders>
+            <w:tcMar>
+              <w:top w:type="dxa" w:w="60"/>
+              <w:left w:type="dxa" w:w="100"/>
+              <w:bottom w:type="dxa" w:w="60"/>
+              <w:right w:type="dxa" w:w="100"/>
+            </w:tcMar>
+            <w:vAlign w:val="center"/>
+          </w:tcPr>
+          <w:p>
+            <w:pPr>
+              <w:spacing w:after="30" w:before="30"/>
+              <w:jc w:val="left"/>
+            </w:pPr>
+            <w:r>
+              <w:rPr>
+                <w:rFonts w:ascii="Calibri" w:cs="Calibri" w:eastAsia="Calibri" w:hAnsi="Calibri"/>
+                <w:sz w:val="16"/>
+                <w:szCs w:val="16"/>
+              </w:rPr>
+              <w:t xml:space="preserve">Partly built</w:t>
+            </w:r>
+          </w:p>
+        </w:tc>
+        <w:tc>
+          <w:tcPr>
+            <w:tcW w:type="dxa" w:w="5778"/>
+            <w:tcBorders>
+              <w:top w:val="single" w:color="BFC9D6" w:sz="4"/>
+              <w:left w:val="single" w:color="BFC9D6" w:sz="4"/>
+              <w:bottom w:val="single" w:color="BFC9D6" w:sz="4"/>
+              <w:right w:val="single" w:color="BFC9D6" w:sz="4"/>
+            </w:tcBorders>
+            <w:tcMar>
+              <w:top w:type="dxa" w:w="60"/>
+              <w:left w:type="dxa" w:w="100"/>
+              <w:bottom w:type="dxa" w:w="60"/>
+              <w:right w:type="dxa" w:w="100"/>
+            </w:tcMar>
+            <w:vAlign w:val="center"/>
+          </w:tcPr>
+          <w:p>
+            <w:pPr>
+              <w:spacing w:after="30" w:before="30"/>
+              <w:jc w:val="left"/>
+            </w:pPr>
+            <w:r>
+              <w:rPr>
+                <w:rFonts w:ascii="Calibri" w:cs="Calibri" w:eastAsia="Calibri" w:hAnsi="Calibri"/>
+                <w:sz w:val="16"/>
+                <w:szCs w:val="16"/>
+              </w:rPr>
+              <w:t xml:space="preserve">Bills, control numbers, signed (HMAC) payment callback, idempotent posting and daily reconciliation file import work against a simulator. The live adapter (signed bill submission and RSA signatures per the GePG specification) needs the service provider code and test access.</w:t>
+            </w:r>
+          </w:p>
+        </w:tc>
+      </w:tr>
+      <w:tr>
+        <w:trPr>
+          <w:cantSplit/>
+        </w:trPr>
+        <w:tc>
+          <w:tcPr>
+            <w:tcW w:type="dxa" w:w="1985"/>
+            <w:tcBorders>
+              <w:top w:val="single" w:color="BFC9D6" w:sz="4"/>
+              <w:left w:val="single" w:color="BFC9D6" w:sz="4"/>
+              <w:bottom w:val="single" w:color="BFC9D6" w:sz="4"/>
+              <w:right w:val="single" w:color="BFC9D6" w:sz="4"/>
+            </w:tcBorders>
+            <w:shd w:fill="EEF3F8" w:color="auto" w:val="clear"/>
+            <w:tcMar>
+              <w:top w:type="dxa" w:w="60"/>
+              <w:left w:type="dxa" w:w="100"/>
+              <w:bottom w:type="dxa" w:w="60"/>
+              <w:right w:type="dxa" w:w="100"/>
+            </w:tcMar>
+            <w:vAlign w:val="center"/>
+          </w:tcPr>
+          <w:p>
+            <w:pPr>
+              <w:spacing w:after="30" w:before="30"/>
+              <w:jc w:val="left"/>
+            </w:pPr>
+            <w:r>
+              <w:rPr>
+                <w:rFonts w:ascii="Calibri" w:cs="Calibri" w:eastAsia="Calibri" w:hAnsi="Calibri"/>
+                <w:b/>
+                <w:bCs/>
+                <w:sz w:val="16"/>
+                <w:szCs w:val="16"/>
+              </w:rPr>
+              <w:t xml:space="preserve">SMS gateway</w:t>
+            </w:r>
+          </w:p>
+        </w:tc>
+        <w:tc>
+          <w:tcPr>
+            <w:tcW w:type="dxa" w:w="1263"/>
+            <w:tcBorders>
+              <w:top w:val="single" w:color="BFC9D6" w:sz="4"/>
+              <w:left w:val="single" w:color="BFC9D6" w:sz="4"/>
+              <w:bottom w:val="single" w:color="BFC9D6" w:sz="4"/>
+              <w:right w:val="single" w:color="BFC9D6" w:sz="4"/>
+            </w:tcBorders>
+            <w:shd w:fill="EEF3F8" w:color="auto" w:val="clear"/>
+            <w:tcMar>
+              <w:top w:type="dxa" w:w="60"/>
+              <w:left w:type="dxa" w:w="100"/>
+              <w:bottom w:type="dxa" w:w="60"/>
+              <w:right w:type="dxa" w:w="100"/>
+            </w:tcMar>
+            <w:vAlign w:val="center"/>
+          </w:tcPr>
+          <w:p>
+            <w:pPr>
+              <w:spacing w:after="30" w:before="30"/>
+              <w:jc w:val="left"/>
+            </w:pPr>
+            <w:r>
+              <w:rPr>
+                <w:rFonts w:ascii="Calibri" w:cs="Calibri" w:eastAsia="Calibri" w:hAnsi="Calibri"/>
+                <w:sz w:val="16"/>
+                <w:szCs w:val="16"/>
+              </w:rPr>
+              <w:t xml:space="preserve">Partly built</w:t>
+            </w:r>
+          </w:p>
+        </w:tc>
+        <w:tc>
+          <w:tcPr>
+            <w:tcW w:type="dxa" w:w="5778"/>
+            <w:tcBorders>
+              <w:top w:val="single" w:color="BFC9D6" w:sz="4"/>
+              <w:left w:val="single" w:color="BFC9D6" w:sz="4"/>
+              <w:bottom w:val="single" w:color="BFC9D6" w:sz="4"/>
+              <w:right w:val="single" w:color="BFC9D6" w:sz="4"/>
+            </w:tcBorders>
+            <w:shd w:fill="EEF3F8" w:color="auto" w:val="clear"/>
+            <w:tcMar>
+              <w:top w:type="dxa" w:w="60"/>
+              <w:left w:type="dxa" w:w="100"/>
+              <w:bottom w:type="dxa" w:w="60"/>
+              <w:right w:type="dxa" w:w="100"/>
+            </w:tcMar>
+            <w:vAlign w:val="center"/>
+          </w:tcPr>
+          <w:p>
+            <w:pPr>
+              <w:spacing w:after="30" w:before="30"/>
+              <w:jc w:val="left"/>
+            </w:pPr>
+            <w:r>
+              <w:rPr>
+                <w:rFonts w:ascii="Calibri" w:cs="Calibri" w:eastAsia="Calibri" w:hAnsi="Calibri"/>
+                <w:sz w:val="16"/>
+                <w:szCs w:val="16"/>
+              </w:rPr>
+              <w:t xml:space="preserve">Outbox, retries, delivery-report callback and bundles work; a simulated gateway stands in for the aggregator to be chosen.</w:t>
+            </w:r>
+          </w:p>
+        </w:tc>
+      </w:tr>
+      <w:tr>
+        <w:trPr>
+          <w:cantSplit/>
+        </w:trPr>
+        <w:tc>
+          <w:tcPr>
+            <w:tcW w:type="dxa" w:w="1985"/>
+            <w:tcBorders>
+              <w:top w:val="single" w:color="BFC9D6" w:sz="4"/>
+              <w:left w:val="single" w:color="BFC9D6" w:sz="4"/>
+              <w:bottom w:val="single" w:color="BFC9D6" w:sz="4"/>
+              <w:right w:val="single" w:color="BFC9D6" w:sz="4"/>
+            </w:tcBorders>
+            <w:tcMar>
+              <w:top w:type="dxa" w:w="60"/>
+              <w:left w:type="dxa" w:w="100"/>
+              <w:bottom w:type="dxa" w:w="60"/>
+              <w:right w:type="dxa" w:w="100"/>
+            </w:tcMar>
+            <w:vAlign w:val="center"/>
+          </w:tcPr>
+          <w:p>
+            <w:pPr>
+              <w:spacing w:after="30" w:before="30"/>
+              <w:jc w:val="left"/>
+            </w:pPr>
+            <w:r>
+              <w:rPr>
+                <w:rFonts w:ascii="Calibri" w:cs="Calibri" w:eastAsia="Calibri" w:hAnsi="Calibri"/>
+                <w:b/>
+                <w:bCs/>
+                <w:sz w:val="16"/>
+                <w:szCs w:val="16"/>
+              </w:rPr>
+              <w:t xml:space="preserve">Email</w:t>
+            </w:r>
+          </w:p>
+        </w:tc>
+        <w:tc>
+          <w:tcPr>
+            <w:tcW w:type="dxa" w:w="1263"/>
+            <w:tcBorders>
+              <w:top w:val="single" w:color="BFC9D6" w:sz="4"/>
+              <w:left w:val="single" w:color="BFC9D6" w:sz="4"/>
+              <w:bottom w:val="single" w:color="BFC9D6" w:sz="4"/>
+              <w:right w:val="single" w:color="BFC9D6" w:sz="4"/>
+            </w:tcBorders>
+            <w:tcMar>
+              <w:top w:type="dxa" w:w="60"/>
+              <w:left w:type="dxa" w:w="100"/>
+              <w:bottom w:type="dxa" w:w="60"/>
+              <w:right w:type="dxa" w:w="100"/>
+            </w:tcMar>
+            <w:vAlign w:val="center"/>
+          </w:tcPr>
+          <w:p>
+            <w:pPr>
+              <w:spacing w:after="30" w:before="30"/>
+              <w:jc w:val="left"/>
+            </w:pPr>
+            <w:r>
+              <w:rPr>
+                <w:rFonts w:ascii="Calibri" w:cs="Calibri" w:eastAsia="Calibri" w:hAnsi="Calibri"/>
+                <w:sz w:val="16"/>
+                <w:szCs w:val="16"/>
+              </w:rPr>
+              <w:t xml:space="preserve">Not yet built</w:t>
+            </w:r>
+          </w:p>
+        </w:tc>
+        <w:tc>
+          <w:tcPr>
+            <w:tcW w:type="dxa" w:w="5778"/>
+            <w:tcBorders>
+              <w:top w:val="single" w:color="BFC9D6" w:sz="4"/>
+              <w:left w:val="single" w:color="BFC9D6" w:sz="4"/>
+              <w:bottom w:val="single" w:color="BFC9D6" w:sz="4"/>
+              <w:right w:val="single" w:color="BFC9D6" w:sz="4"/>
+            </w:tcBorders>
+            <w:tcMar>
+              <w:top w:type="dxa" w:w="60"/>
+              <w:left w:type="dxa" w:w="100"/>
+              <w:bottom w:type="dxa" w:w="60"/>
+              <w:right w:type="dxa" w:w="100"/>
+            </w:tcMar>
+            <w:vAlign w:val="center"/>
+          </w:tcPr>
+          <w:p>
+            <w:pPr>
+              <w:spacing w:after="30" w:before="30"/>
+              <w:jc w:val="left"/>
+            </w:pPr>
+            <w:r>
+              <w:rPr>
+                <w:rFonts w:ascii="Calibri" w:cs="Calibri" w:eastAsia="Calibri" w:hAnsi="Calibri"/>
+                <w:sz w:val="16"/>
+                <w:szCs w:val="16"/>
+              </w:rPr>
+              <w:t xml:space="preserve">Planned for notifications and letters.</w:t>
+            </w:r>
+          </w:p>
+        </w:tc>
+      </w:tr>
+      <w:tr>
+        <w:trPr>
+          <w:cantSplit/>
+        </w:trPr>
+        <w:tc>
+          <w:tcPr>
+            <w:tcW w:type="dxa" w:w="1985"/>
+            <w:tcBorders>
+              <w:top w:val="single" w:color="BFC9D6" w:sz="4"/>
+              <w:left w:val="single" w:color="BFC9D6" w:sz="4"/>
+              <w:bottom w:val="single" w:color="BFC9D6" w:sz="4"/>
+              <w:right w:val="single" w:color="BFC9D6" w:sz="4"/>
+            </w:tcBorders>
+            <w:shd w:fill="EEF3F8" w:color="auto" w:val="clear"/>
+            <w:tcMar>
+              <w:top w:type="dxa" w:w="60"/>
+              <w:left w:type="dxa" w:w="100"/>
+              <w:bottom w:type="dxa" w:w="60"/>
+              <w:right w:type="dxa" w:w="100"/>
+            </w:tcMar>
+            <w:vAlign w:val="center"/>
+          </w:tcPr>
+          <w:p>
+            <w:pPr>
+              <w:spacing w:after="30" w:before="30"/>
+              <w:jc w:val="left"/>
+            </w:pPr>
+            <w:r>
+              <w:rPr>
+                <w:rFonts w:ascii="Calibri" w:cs="Calibri" w:eastAsia="Calibri" w:hAnsi="Calibri"/>
+                <w:b/>
+                <w:bCs/>
+                <w:sz w:val="16"/>
+                <w:szCs w:val="16"/>
+              </w:rPr>
+              <w:t xml:space="preserve">HESLB</w:t>
+            </w:r>
+          </w:p>
+        </w:tc>
+        <w:tc>
+          <w:tcPr>
+            <w:tcW w:type="dxa" w:w="1263"/>
+            <w:tcBorders>
+              <w:top w:val="single" w:color="BFC9D6" w:sz="4"/>
+              <w:left w:val="single" w:color="BFC9D6" w:sz="4"/>
+              <w:bottom w:val="single" w:color="BFC9D6" w:sz="4"/>
+              <w:right w:val="single" w:color="BFC9D6" w:sz="4"/>
+            </w:tcBorders>
+            <w:shd w:fill="EEF3F8" w:color="auto" w:val="clear"/>
+            <w:tcMar>
+              <w:top w:type="dxa" w:w="60"/>
+              <w:left w:type="dxa" w:w="100"/>
+              <w:bottom w:type="dxa" w:w="60"/>
+              <w:right w:type="dxa" w:w="100"/>
+            </w:tcMar>
+            <w:vAlign w:val="center"/>
+          </w:tcPr>
+          <w:p>
+            <w:pPr>
+              <w:spacing w:after="30" w:before="30"/>
+              <w:jc w:val="left"/>
+            </w:pPr>
+            <w:r>
+              <w:rPr>
+                <w:rFonts w:ascii="Calibri" w:cs="Calibri" w:eastAsia="Calibri" w:hAnsi="Calibri"/>
+                <w:sz w:val="16"/>
+                <w:szCs w:val="16"/>
+              </w:rPr>
+              <w:t xml:space="preserve">Partly built</w:t>
+            </w:r>
+          </w:p>
+        </w:tc>
+        <w:tc>
+          <w:tcPr>
+            <w:tcW w:type="dxa" w:w="5778"/>
+            <w:tcBorders>
+              <w:top w:val="single" w:color="BFC9D6" w:sz="4"/>
+              <w:left w:val="single" w:color="BFC9D6" w:sz="4"/>
+              <w:bottom w:val="single" w:color="BFC9D6" w:sz="4"/>
+              <w:right w:val="single" w:color="BFC9D6" w:sz="4"/>
+            </w:tcBorders>
+            <w:shd w:fill="EEF3F8" w:color="auto" w:val="clear"/>
+            <w:tcMar>
+              <w:top w:type="dxa" w:w="60"/>
+              <w:left w:type="dxa" w:w="100"/>
+              <w:bottom w:type="dxa" w:w="60"/>
+              <w:right w:type="dxa" w:w="100"/>
+            </w:tcMar>
+            <w:vAlign w:val="center"/>
+          </w:tcPr>
+          <w:p>
+            <w:pPr>
+              <w:spacing w:after="30" w:before="30"/>
+              <w:jc w:val="left"/>
+            </w:pPr>
+            <w:r>
+              <w:rPr>
+                <w:rFonts w:ascii="Calibri" w:cs="Calibri" w:eastAsia="Calibri" w:hAnsi="Calibri"/>
+                <w:sz w:val="16"/>
+                <w:szCs w:val="16"/>
+              </w:rPr>
+              <w:t xml:space="preserve">HESLB is handled as a sponsor (shares, sponsor invoices, remittances, CSV list import); HESLB's own file or API exchange is not built.</w:t>
+            </w:r>
+          </w:p>
+        </w:tc>
+      </w:tr>
+      <w:tr>
+        <w:trPr>
+          <w:cantSplit/>
+        </w:trPr>
+        <w:tc>
+          <w:tcPr>
+            <w:tcW w:type="dxa" w:w="1985"/>
+            <w:tcBorders>
+              <w:top w:val="single" w:color="BFC9D6" w:sz="4"/>
+              <w:left w:val="single" w:color="BFC9D6" w:sz="4"/>
+              <w:bottom w:val="single" w:color="BFC9D6" w:sz="4"/>
+              <w:right w:val="single" w:color="BFC9D6" w:sz="4"/>
+            </w:tcBorders>
+            <w:tcMar>
+              <w:top w:type="dxa" w:w="60"/>
+              <w:left w:type="dxa" w:w="100"/>
+              <w:bottom w:type="dxa" w:w="60"/>
+              <w:right w:type="dxa" w:w="100"/>
+            </w:tcMar>
+            <w:vAlign w:val="center"/>
+          </w:tcPr>
+          <w:p>
+            <w:pPr>
+              <w:spacing w:after="30" w:before="30"/>
+              <w:jc w:val="left"/>
+            </w:pPr>
+            <w:r>
+              <w:rPr>
+                <w:rFonts w:ascii="Calibri" w:cs="Calibri" w:eastAsia="Calibri" w:hAnsi="Calibri"/>
+                <w:b/>
+                <w:bCs/>
+                <w:sz w:val="16"/>
+                <w:szCs w:val="16"/>
+              </w:rPr>
+              <w:t xml:space="preserve">NIDA, MUSE/ERP, TAMISEMI, GovESB</w:t>
+            </w:r>
+          </w:p>
+        </w:tc>
+        <w:tc>
+          <w:tcPr>
+            <w:tcW w:type="dxa" w:w="1263"/>
+            <w:tcBorders>
+              <w:top w:val="single" w:color="BFC9D6" w:sz="4"/>
+              <w:left w:val="single" w:color="BFC9D6" w:sz="4"/>
+              <w:bottom w:val="single" w:color="BFC9D6" w:sz="4"/>
+              <w:right w:val="single" w:color="BFC9D6" w:sz="4"/>
+            </w:tcBorders>
+            <w:tcMar>
+              <w:top w:type="dxa" w:w="60"/>
+              <w:left w:type="dxa" w:w="100"/>
+              <w:bottom w:type="dxa" w:w="60"/>
+              <w:right w:type="dxa" w:w="100"/>
+            </w:tcMar>
+            <w:vAlign w:val="center"/>
+          </w:tcPr>
+          <w:p>
+            <w:pPr>
+              <w:spacing w:after="30" w:before="30"/>
+              <w:jc w:val="left"/>
+            </w:pPr>
+            <w:r>
+              <w:rPr>
+                <w:rFonts w:ascii="Calibri" w:cs="Calibri" w:eastAsia="Calibri" w:hAnsi="Calibri"/>
+                <w:sz w:val="16"/>
+                <w:szCs w:val="16"/>
+              </w:rPr>
+              <w:t xml:space="preserve">Not yet built</w:t>
+            </w:r>
+          </w:p>
+        </w:tc>
+        <w:tc>
+          <w:tcPr>
+            <w:tcW w:type="dxa" w:w="5778"/>
+            <w:tcBorders>
+              <w:top w:val="single" w:color="BFC9D6" w:sz="4"/>
+              <w:left w:val="single" w:color="BFC9D6" w:sz="4"/>
+              <w:bottom w:val="single" w:color="BFC9D6" w:sz="4"/>
+              <w:right w:val="single" w:color="BFC9D6" w:sz="4"/>
+            </w:tcBorders>
+            <w:tcMar>
+              <w:top w:type="dxa" w:w="60"/>
+              <w:left w:type="dxa" w:w="100"/>
+              <w:bottom w:type="dxa" w:w="60"/>
+              <w:right w:type="dxa" w:w="100"/>
+            </w:tcMar>
+            <w:vAlign w:val="center"/>
+          </w:tcPr>
+          <w:p>
+            <w:pPr>
+              <w:spacing w:after="30" w:before="30"/>
+              <w:jc w:val="left"/>
+            </w:pPr>
+            <w:r>
+              <w:rPr>
+                <w:rFonts w:ascii="Calibri" w:cs="Calibri" w:eastAsia="Calibri" w:hAnsi="Calibri"/>
+                <w:sz w:val="16"/>
+                <w:szCs w:val="16"/>
+              </w:rPr>
+              <w:t xml:space="preserve">A postings CSV for the accounting system exists; the other connectors are planned.</w:t>
+            </w:r>
+          </w:p>
+        </w:tc>
+      </w:tr>
+    </w:tbl>
+    <w:p>
+      <w:pPr>
+        <w:spacing w:after="120"/>
+      </w:pPr>
+    </w:p>
+    <w:p>
+      <w:pPr>
+        <w:spacing w:after="200" w:before="60"/>
+        <w:jc w:val="center"/>
+      </w:pPr>
+      <w:r>
+        <w:rPr>
+          <w:rFonts w:ascii="Calibri" w:cs="Calibri" w:eastAsia="Calibri" w:hAnsi="Calibri"/>
+          <w:i/>
+          <w:iCs/>
+          <w:color w:val="595959"/>
+          <w:sz w:val="18"/>
+          <w:szCs w:val="18"/>
+        </w:rPr>
+        <w:t xml:space="preserve">Table 3: Integration status, October 2026</w:t>
       </w:r>
     </w:p>
     <w:p>
@@ -8306,6 +11327,30 @@
     </w:p>
     <w:p>
       <w:pPr>
+        <w:pBdr>
+          <w:left w:val="single" w:sz="18" w:space="8" w:color="1F3864"/>
+        </w:pBdr>
+        <w:shd w:val="clear" w:color="auto" w:fill="EEF3F8"/>
+        <w:spacing w:before="60" w:after="120" w:line="276"/>
+        <w:ind w:left="170" w:right="113"/>
+      </w:pPr>
+      <w:r>
+        <w:rPr>
+          <w:rFonts w:ascii="Calibri" w:cs="Calibri" w:eastAsia="Calibri" w:hAnsi="Calibri"/>
+          <w:b/>
+          <w:bCs/>
+        </w:rPr>
+        <w:t xml:space="preserve">As built:</w:t>
+      </w:r>
+      <w:r>
+        <w:rPr>
+          <w:rFonts w:ascii="Calibri" w:cs="Calibri" w:eastAsia="Calibri" w:hAnsi="Calibri"/>
+        </w:rPr>
+        <w:t xml:space="preserve"> the scope boundaries above still hold. Within scope, campuses, programme transfers, document uploads, email notifications, multi-factor authentication, alumni and tracer surveys, scheduled reports and the data migration tools are not yet built (section 5.4).</w:t>
+      </w:r>
+    </w:p>
+    <w:p>
+      <w:pPr>
         <w:pStyle w:val="Heading1"/>
       </w:pPr>
       <w:r>
@@ -9540,6 +12585,30 @@
     </w:p>
     <w:p>
       <w:pPr>
+        <w:pBdr>
+          <w:left w:val="single" w:sz="18" w:space="8" w:color="1F3864"/>
+        </w:pBdr>
+        <w:shd w:val="clear" w:color="auto" w:fill="EEF3F8"/>
+        <w:spacing w:before="60" w:after="120" w:line="276"/>
+        <w:ind w:left="170" w:right="113"/>
+      </w:pPr>
+      <w:r>
+        <w:rPr>
+          <w:rFonts w:ascii="Calibri" w:cs="Calibri" w:eastAsia="Calibri" w:hAnsi="Calibri"/>
+          <w:b/>
+          <w:bCs/>
+        </w:rPr>
+        <w:t xml:space="preserve">Progress (October 2026):</w:t>
+      </w:r>
+      <w:r>
+        <w:rPr>
+          <w:rFonts w:ascii="Calibri" w:cs="Calibri" w:eastAsia="Calibri" w:hAnsi="Calibri"/>
+        </w:rPr>
+        <w:t xml:space="preserve"> the build of all three releases' core scope is complete in the development environment, with 200 automated tests. Before the first go-live the remaining work is: live GePG, SMS and NACTVET connections, multi-factor authentication, data migration tools, performance and security testing, production hosting, and pilot user acceptance. The revised plan is in Document 07, section 3.2.</w:t>
+      </w:r>
+    </w:p>
+    <w:p>
+      <w:pPr>
         <w:pStyle w:val="Heading1"/>
       </w:pPr>
       <w:r>
@@ -10561,7 +13630,7 @@
         <w:rPr>
           <w:rFonts w:ascii="Calibri" w:cs="Calibri" w:eastAsia="Calibri" w:hAnsi="Calibri"/>
         </w:rPr>
-        <w:t xml:space="preserve">It is recommended that stakeholders approve the CIMS concept and authorise the inception phase. The immediate next steps are:</w:t>
+        <w:t xml:space="preserve">It is recommended that stakeholders approve CIMS as built and authorise the pilot and go-live phase. The immediate next steps are:</w:t>
       </w:r>
     </w:p>
     <w:p>
@@ -10577,7 +13646,7 @@
         <w:rPr>
           <w:rFonts w:ascii="Calibri" w:cs="Calibri" w:eastAsia="Calibri" w:hAnsi="Calibri"/>
         </w:rPr>
-        <w:t xml:space="preserve">Approve this Concept Note and the companion requirements documents (Documents 02 and 03).</w:t>
+        <w:t xml:space="preserve">Approve the version 3.0 documents (01–07) as the as-built baseline for pilots and acceptance.</w:t>
       </w:r>
     </w:p>
     <w:p>
@@ -10593,7 +13662,7 @@
         <w:rPr>
           <w:rFonts w:ascii="Calibri" w:cs="Calibri" w:eastAsia="Calibri" w:hAnsi="Calibri"/>
         </w:rPr>
-        <w:t xml:space="preserve">Nominate two pilot institutions and a focal person in each office (admissions, registry, examinations, finance, hostel, ICT).</w:t>
+        <w:t xml:space="preserve">Nominate two pilot institutions (one NTA-focused, one NVA-focused) and a focal person in each office (admissions, registry, examinations, finance, hostel, ICT) to run user acceptance on the built system.</w:t>
       </w:r>
     </w:p>
     <w:p>
@@ -10609,7 +13678,7 @@
         <w:rPr>
           <w:rFonts w:ascii="Calibri" w:cs="Calibri" w:eastAsia="Calibri" w:hAnsi="Calibri"/>
         </w:rPr>
-        <w:t xml:space="preserve">Start engagement with NACTVET, GePG, NECTA and HESLB on integration access and test environments.</w:t>
+        <w:t xml:space="preserve">Obtain live access: GePG service provider code and test environment, NACTVET admission verification API specification and credentials, NECTA API key, and an SMS aggregator account with a registered sender ID.</w:t>
       </w:r>
     </w:p>
     <w:p>
@@ -10625,7 +13694,7 @@
         <w:rPr>
           <w:rFonts w:ascii="Calibri" w:cs="Calibri" w:eastAsia="Calibri" w:hAnsi="Calibri"/>
         </w:rPr>
-        <w:t xml:space="preserve">Confirm the preferred deployment option (cloud subscription or dedicated installation).</w:t>
+        <w:t xml:space="preserve">Confirm the preferred deployment option (cloud subscription or dedicated installation) so production hosting can be set up.</w:t>
       </w:r>
     </w:p>
     <w:p>
@@ -10641,7 +13710,7 @@
         <w:rPr>
           <w:rFonts w:ascii="Calibri" w:cs="Calibri" w:eastAsia="Calibri" w:hAnsi="Calibri"/>
         </w:rPr>
-        <w:t xml:space="preserve">Approve the Release 1 budget and start the inception phase in November 2026.</w:t>
+        <w:t xml:space="preserve">Approve the remaining work in Document 07, section 3.2, so the first institutions go live before the 2027/28 application window.</w:t>
       </w:r>
     </w:p>
     <w:sectPr>

</xml_diff>

<commit_message>
Docs: section preambles, filled tables of contents, V50 in database design, section 12 numbering in architecture
</commit_message>
<xml_diff>
--- a/docs/01_Concept_Note_College_Institution_Management_System.docx
+++ b/docs/01_Concept_Note_College_Institution_Management_System.docx
@@ -788,6 +788,21 @@
         <w:t xml:space="preserve">Document Control</w:t>
       </w:r>
     </w:p>
+    <w:p>
+      <w:pPr>
+        <w:spacing w:after="300"/>
+      </w:pPr>
+      <w:r>
+        <w:rPr>
+          <w:i/>
+          <w:rFonts w:ascii="Calibri" w:cs="Calibri" w:eastAsia="Calibri" w:hAnsi="Calibri"/>
+          <w:color w:val="595959"/>
+          <w:sz w:val="22"/>
+          <w:szCs w:val="22"/>
+        </w:rPr>
+        <w:t xml:space="preserve">This section records the versions of this concept note, who prepared each one and what changed, so that readers know they are working from the current approved text.</w:t>
+      </w:r>
+    </w:p>
     <w:tbl>
       <w:tblPr>
         <w:tblW w:type="dxa" w:w="9026"/>
@@ -1511,6 +1526,21 @@
           <w:rFonts w:ascii="Calibri" w:cs="Calibri" w:eastAsia="Calibri" w:hAnsi="Calibri"/>
         </w:rPr>
         <w:t xml:space="preserve">Review and Approval</w:t>
+      </w:r>
+    </w:p>
+    <w:p>
+      <w:pPr>
+        <w:spacing w:after="300"/>
+      </w:pPr>
+      <w:r>
+        <w:rPr>
+          <w:i/>
+          <w:rFonts w:ascii="Calibri" w:cs="Calibri" w:eastAsia="Calibri" w:hAnsi="Calibri"/>
+          <w:color w:val="595959"/>
+          <w:sz w:val="22"/>
+          <w:szCs w:val="22"/>
+        </w:rPr>
+        <w:t xml:space="preserve">The people listed below review this document and confirm, by signing, that it is accepted as the basis for decisions on CIMS.</w:t>
       </w:r>
     </w:p>
     <w:tbl>
@@ -2136,6 +2166,21 @@
           <w:rFonts w:ascii="Calibri" w:cs="Calibri" w:eastAsia="Calibri" w:hAnsi="Calibri"/>
         </w:rPr>
         <w:t xml:space="preserve">Related Documents</w:t>
+      </w:r>
+    </w:p>
+    <w:p>
+      <w:pPr>
+        <w:spacing w:after="300"/>
+      </w:pPr>
+      <w:r>
+        <w:rPr>
+          <w:i/>
+          <w:rFonts w:ascii="Calibri" w:cs="Calibri" w:eastAsia="Calibri" w:hAnsi="Calibri"/>
+          <w:color w:val="595959"/>
+          <w:sz w:val="22"/>
+          <w:szCs w:val="22"/>
+        </w:rPr>
+        <w:t xml:space="preserve">CIMS is described in a set of eight documents, each written for a different purpose and audience. This table shows where each topic is covered, so a reader can go straight to the document that answers their question.</w:t>
       </w:r>
     </w:p>
     <w:tbl>
@@ -3015,6 +3060,722 @@
             <w:instrText xml:space="preserve">TOC \h \o "1-2"</w:instrText>
             <w:fldChar w:fldCharType="separate"/>
           </w:r>
+        </w:p>
+        <w:p>
+          <w:pPr>
+            <w:tabs>
+              <w:tab w:val="right" w:leader="dot" w:pos="9020"/>
+            </w:tabs>
+            <w:spacing w:before="120" w:after="20"/>
+            <w:ind w:left="0"/>
+          </w:pPr>
+          <w:hyperlink w:anchor="_TocV11_1" w:history="1">
+            <w:r>
+              <w:rPr>
+                <w:rFonts w:ascii="Calibri" w:cs="Calibri" w:eastAsia="Calibri" w:hAnsi="Calibri"/>
+                <w:b/>
+                <w:bCs/>
+                <w:color w:val="1F3864"/>
+                <w:sz w:val="21"/>
+                <w:szCs w:val="21"/>
+              </w:rPr>
+              <w:t xml:space="preserve">1. Executive Summary</w:t>
+            </w:r>
+            <w:r>
+              <w:rPr>
+                <w:rFonts w:ascii="Calibri" w:cs="Calibri" w:eastAsia="Calibri" w:hAnsi="Calibri"/>
+                <w:b/>
+                <w:bCs/>
+                <w:color w:val="1F3864"/>
+                <w:sz w:val="21"/>
+                <w:szCs w:val="21"/>
+              </w:rPr>
+              <w:tab/>
+              <w:t>5</w:t>
+            </w:r>
+          </w:hyperlink>
+        </w:p>
+        <w:p>
+          <w:pPr>
+            <w:tabs>
+              <w:tab w:val="right" w:leader="dot" w:pos="9020"/>
+            </w:tabs>
+            <w:spacing w:before="120" w:after="20"/>
+            <w:ind w:left="0"/>
+          </w:pPr>
+          <w:hyperlink w:anchor="_TocV11_2" w:history="1">
+            <w:r>
+              <w:rPr>
+                <w:rFonts w:ascii="Calibri" w:cs="Calibri" w:eastAsia="Calibri" w:hAnsi="Calibri"/>
+                <w:b/>
+                <w:bCs/>
+                <w:color w:val="1F3864"/>
+                <w:sz w:val="21"/>
+                <w:szCs w:val="21"/>
+              </w:rPr>
+              <w:t xml:space="preserve">2. Background and Context</w:t>
+            </w:r>
+            <w:r>
+              <w:rPr>
+                <w:rFonts w:ascii="Calibri" w:cs="Calibri" w:eastAsia="Calibri" w:hAnsi="Calibri"/>
+                <w:b/>
+                <w:bCs/>
+                <w:color w:val="1F3864"/>
+                <w:sz w:val="21"/>
+                <w:szCs w:val="21"/>
+              </w:rPr>
+              <w:tab/>
+              <w:t>6</w:t>
+            </w:r>
+          </w:hyperlink>
+        </w:p>
+        <w:p>
+          <w:pPr>
+            <w:tabs>
+              <w:tab w:val="right" w:leader="dot" w:pos="9020"/>
+            </w:tabs>
+            <w:spacing w:before="20" w:after="20"/>
+            <w:ind w:left="360"/>
+          </w:pPr>
+          <w:hyperlink w:anchor="_TocV11_3" w:history="1">
+            <w:r>
+              <w:rPr>
+                <w:rFonts w:ascii="Calibri" w:cs="Calibri" w:eastAsia="Calibri" w:hAnsi="Calibri"/>
+                <w:sz w:val="20"/>
+                <w:szCs w:val="20"/>
+              </w:rPr>
+              <w:t xml:space="preserve">2.1 The TVET sector and NACTVET</w:t>
+            </w:r>
+            <w:r>
+              <w:rPr>
+                <w:rFonts w:ascii="Calibri" w:cs="Calibri" w:eastAsia="Calibri" w:hAnsi="Calibri"/>
+                <w:sz w:val="20"/>
+                <w:szCs w:val="20"/>
+              </w:rPr>
+              <w:tab/>
+              <w:t>6</w:t>
+            </w:r>
+          </w:hyperlink>
+        </w:p>
+        <w:p>
+          <w:pPr>
+            <w:tabs>
+              <w:tab w:val="right" w:leader="dot" w:pos="9020"/>
+            </w:tabs>
+            <w:spacing w:before="20" w:after="20"/>
+            <w:ind w:left="360"/>
+          </w:pPr>
+          <w:hyperlink w:anchor="_TocV11_4" w:history="1">
+            <w:r>
+              <w:rPr>
+                <w:rFonts w:ascii="Calibri" w:cs="Calibri" w:eastAsia="Calibri" w:hAnsi="Calibri"/>
+                <w:sz w:val="20"/>
+                <w:szCs w:val="20"/>
+              </w:rPr>
+              <w:t xml:space="preserve">2.2 How admissions work today</w:t>
+            </w:r>
+            <w:r>
+              <w:rPr>
+                <w:rFonts w:ascii="Calibri" w:cs="Calibri" w:eastAsia="Calibri" w:hAnsi="Calibri"/>
+                <w:sz w:val="20"/>
+                <w:szCs w:val="20"/>
+              </w:rPr>
+              <w:tab/>
+              <w:t>6</w:t>
+            </w:r>
+          </w:hyperlink>
+        </w:p>
+        <w:p>
+          <w:pPr>
+            <w:tabs>
+              <w:tab w:val="right" w:leader="dot" w:pos="9020"/>
+            </w:tabs>
+            <w:spacing w:before="120" w:after="20"/>
+            <w:ind w:left="0"/>
+          </w:pPr>
+          <w:hyperlink w:anchor="_TocV11_5" w:history="1">
+            <w:r>
+              <w:rPr>
+                <w:rFonts w:ascii="Calibri" w:cs="Calibri" w:eastAsia="Calibri" w:hAnsi="Calibri"/>
+                <w:b/>
+                <w:bCs/>
+                <w:color w:val="1F3864"/>
+                <w:sz w:val="21"/>
+                <w:szCs w:val="21"/>
+              </w:rPr>
+              <w:t xml:space="preserve">3. Problem Statement</w:t>
+            </w:r>
+            <w:r>
+              <w:rPr>
+                <w:rFonts w:ascii="Calibri" w:cs="Calibri" w:eastAsia="Calibri" w:hAnsi="Calibri"/>
+                <w:b/>
+                <w:bCs/>
+                <w:color w:val="1F3864"/>
+                <w:sz w:val="21"/>
+                <w:szCs w:val="21"/>
+              </w:rPr>
+              <w:tab/>
+              <w:t>6</w:t>
+            </w:r>
+          </w:hyperlink>
+        </w:p>
+        <w:p>
+          <w:pPr>
+            <w:tabs>
+              <w:tab w:val="right" w:leader="dot" w:pos="9020"/>
+            </w:tabs>
+            <w:spacing w:before="120" w:after="20"/>
+            <w:ind w:left="0"/>
+          </w:pPr>
+          <w:hyperlink w:anchor="_TocV11_6" w:history="1">
+            <w:r>
+              <w:rPr>
+                <w:rFonts w:ascii="Calibri" w:cs="Calibri" w:eastAsia="Calibri" w:hAnsi="Calibri"/>
+                <w:b/>
+                <w:bCs/>
+                <w:color w:val="1F3864"/>
+                <w:sz w:val="21"/>
+                <w:szCs w:val="21"/>
+              </w:rPr>
+              <w:t xml:space="preserve">4. Vision and Objectives</w:t>
+            </w:r>
+            <w:r>
+              <w:rPr>
+                <w:rFonts w:ascii="Calibri" w:cs="Calibri" w:eastAsia="Calibri" w:hAnsi="Calibri"/>
+                <w:b/>
+                <w:bCs/>
+                <w:color w:val="1F3864"/>
+                <w:sz w:val="21"/>
+                <w:szCs w:val="21"/>
+              </w:rPr>
+              <w:tab/>
+              <w:t>7</w:t>
+            </w:r>
+          </w:hyperlink>
+        </w:p>
+        <w:p>
+          <w:pPr>
+            <w:tabs>
+              <w:tab w:val="right" w:leader="dot" w:pos="9020"/>
+            </w:tabs>
+            <w:spacing w:before="120" w:after="20"/>
+            <w:ind w:left="0"/>
+          </w:pPr>
+          <w:hyperlink w:anchor="_TocV11_7" w:history="1">
+            <w:r>
+              <w:rPr>
+                <w:rFonts w:ascii="Calibri" w:cs="Calibri" w:eastAsia="Calibri" w:hAnsi="Calibri"/>
+                <w:b/>
+                <w:bCs/>
+                <w:color w:val="1F3864"/>
+                <w:sz w:val="21"/>
+                <w:szCs w:val="21"/>
+              </w:rPr>
+              <w:t xml:space="preserve">5. Proposed Solution</w:t>
+            </w:r>
+            <w:r>
+              <w:rPr>
+                <w:rFonts w:ascii="Calibri" w:cs="Calibri" w:eastAsia="Calibri" w:hAnsi="Calibri"/>
+                <w:b/>
+                <w:bCs/>
+                <w:color w:val="1F3864"/>
+                <w:sz w:val="21"/>
+                <w:szCs w:val="21"/>
+              </w:rPr>
+              <w:tab/>
+              <w:t>8</w:t>
+            </w:r>
+          </w:hyperlink>
+        </w:p>
+        <w:p>
+          <w:pPr>
+            <w:tabs>
+              <w:tab w:val="right" w:leader="dot" w:pos="9020"/>
+            </w:tabs>
+            <w:spacing w:before="20" w:after="20"/>
+            <w:ind w:left="360"/>
+          </w:pPr>
+          <w:hyperlink w:anchor="_TocV11_8" w:history="1">
+            <w:r>
+              <w:rPr>
+                <w:rFonts w:ascii="Calibri" w:cs="Calibri" w:eastAsia="Calibri" w:hAnsi="Calibri"/>
+                <w:sz w:val="20"/>
+                <w:szCs w:val="20"/>
+              </w:rPr>
+              <w:t xml:space="preserve">5.1 The student lifecycle on one platform</w:t>
+            </w:r>
+            <w:r>
+              <w:rPr>
+                <w:rFonts w:ascii="Calibri" w:cs="Calibri" w:eastAsia="Calibri" w:hAnsi="Calibri"/>
+                <w:sz w:val="20"/>
+                <w:szCs w:val="20"/>
+              </w:rPr>
+              <w:tab/>
+              <w:t>8</w:t>
+            </w:r>
+          </w:hyperlink>
+        </w:p>
+        <w:p>
+          <w:pPr>
+            <w:tabs>
+              <w:tab w:val="right" w:leader="dot" w:pos="9020"/>
+            </w:tabs>
+            <w:spacing w:before="20" w:after="20"/>
+            <w:ind w:left="360"/>
+          </w:pPr>
+          <w:hyperlink w:anchor="_TocV11_9" w:history="1">
+            <w:r>
+              <w:rPr>
+                <w:rFonts w:ascii="Calibri" w:cs="Calibri" w:eastAsia="Calibri" w:hAnsi="Calibri"/>
+                <w:sz w:val="20"/>
+                <w:szCs w:val="20"/>
+              </w:rPr>
+              <w:t xml:space="preserve">5.2 Functional modules</w:t>
+            </w:r>
+            <w:r>
+              <w:rPr>
+                <w:rFonts w:ascii="Calibri" w:cs="Calibri" w:eastAsia="Calibri" w:hAnsi="Calibri"/>
+                <w:sz w:val="20"/>
+                <w:szCs w:val="20"/>
+              </w:rPr>
+              <w:tab/>
+              <w:t>8</w:t>
+            </w:r>
+          </w:hyperlink>
+        </w:p>
+        <w:p>
+          <w:pPr>
+            <w:tabs>
+              <w:tab w:val="right" w:leader="dot" w:pos="9020"/>
+            </w:tabs>
+            <w:spacing w:before="20" w:after="20"/>
+            <w:ind w:left="360"/>
+          </w:pPr>
+          <w:hyperlink w:anchor="_TocV11_10" w:history="1">
+            <w:r>
+              <w:rPr>
+                <w:rFonts w:ascii="Calibri" w:cs="Calibri" w:eastAsia="Calibri" w:hAnsi="Calibri"/>
+                <w:sz w:val="20"/>
+                <w:szCs w:val="20"/>
+              </w:rPr>
+              <w:t xml:space="preserve">5.3 How CIMS connects to the national ecosystem</w:t>
+            </w:r>
+            <w:r>
+              <w:rPr>
+                <w:rFonts w:ascii="Calibri" w:cs="Calibri" w:eastAsia="Calibri" w:hAnsi="Calibri"/>
+                <w:sz w:val="20"/>
+                <w:szCs w:val="20"/>
+              </w:rPr>
+              <w:tab/>
+              <w:t>9</w:t>
+            </w:r>
+          </w:hyperlink>
+        </w:p>
+        <w:p>
+          <w:pPr>
+            <w:tabs>
+              <w:tab w:val="right" w:leader="dot" w:pos="9020"/>
+            </w:tabs>
+            <w:spacing w:before="20" w:after="20"/>
+            <w:ind w:left="360"/>
+          </w:pPr>
+          <w:hyperlink w:anchor="_TocV11_11" w:history="1">
+            <w:r>
+              <w:rPr>
+                <w:rFonts w:ascii="Calibri" w:cs="Calibri" w:eastAsia="Calibri" w:hAnsi="Calibri"/>
+                <w:sz w:val="20"/>
+                <w:szCs w:val="20"/>
+              </w:rPr>
+              <w:t xml:space="preserve">5.4 What has been built (October 2026)</w:t>
+            </w:r>
+            <w:r>
+              <w:rPr>
+                <w:rFonts w:ascii="Calibri" w:cs="Calibri" w:eastAsia="Calibri" w:hAnsi="Calibri"/>
+                <w:sz w:val="20"/>
+                <w:szCs w:val="20"/>
+              </w:rPr>
+              <w:tab/>
+              <w:t>10</w:t>
+            </w:r>
+          </w:hyperlink>
+        </w:p>
+        <w:p>
+          <w:pPr>
+            <w:tabs>
+              <w:tab w:val="right" w:leader="dot" w:pos="9020"/>
+            </w:tabs>
+            <w:spacing w:before="20" w:after="20"/>
+            <w:ind w:left="360"/>
+          </w:pPr>
+          <w:hyperlink w:anchor="_TocV11_12" w:history="1">
+            <w:r>
+              <w:rPr>
+                <w:rFonts w:ascii="Calibri" w:cs="Calibri" w:eastAsia="Calibri" w:hAnsi="Calibri"/>
+                <w:sz w:val="20"/>
+                <w:szCs w:val="20"/>
+              </w:rPr>
+              <w:t xml:space="preserve">5.5 Connections to national systems as built</w:t>
+            </w:r>
+            <w:r>
+              <w:rPr>
+                <w:rFonts w:ascii="Calibri" w:cs="Calibri" w:eastAsia="Calibri" w:hAnsi="Calibri"/>
+                <w:sz w:val="20"/>
+                <w:szCs w:val="20"/>
+              </w:rPr>
+              <w:tab/>
+              <w:t>12</w:t>
+            </w:r>
+          </w:hyperlink>
+        </w:p>
+        <w:p>
+          <w:pPr>
+            <w:tabs>
+              <w:tab w:val="right" w:leader="dot" w:pos="9020"/>
+            </w:tabs>
+            <w:spacing w:before="120" w:after="20"/>
+            <w:ind w:left="0"/>
+          </w:pPr>
+          <w:hyperlink w:anchor="_TocV11_13" w:history="1">
+            <w:r>
+              <w:rPr>
+                <w:rFonts w:ascii="Calibri" w:cs="Calibri" w:eastAsia="Calibri" w:hAnsi="Calibri"/>
+                <w:b/>
+                <w:bCs/>
+                <w:color w:val="1F3864"/>
+                <w:sz w:val="21"/>
+                <w:szCs w:val="21"/>
+              </w:rPr>
+              <w:t xml:space="preserve">6. Value to Stakeholders</w:t>
+            </w:r>
+            <w:r>
+              <w:rPr>
+                <w:rFonts w:ascii="Calibri" w:cs="Calibri" w:eastAsia="Calibri" w:hAnsi="Calibri"/>
+                <w:b/>
+                <w:bCs/>
+                <w:color w:val="1F3864"/>
+                <w:sz w:val="21"/>
+                <w:szCs w:val="21"/>
+              </w:rPr>
+              <w:tab/>
+              <w:t>13</w:t>
+            </w:r>
+          </w:hyperlink>
+        </w:p>
+        <w:p>
+          <w:pPr>
+            <w:tabs>
+              <w:tab w:val="right" w:leader="dot" w:pos="9020"/>
+            </w:tabs>
+            <w:spacing w:before="120" w:after="20"/>
+            <w:ind w:left="0"/>
+          </w:pPr>
+          <w:hyperlink w:anchor="_TocV11_14" w:history="1">
+            <w:r>
+              <w:rPr>
+                <w:rFonts w:ascii="Calibri" w:cs="Calibri" w:eastAsia="Calibri" w:hAnsi="Calibri"/>
+                <w:b/>
+                <w:bCs/>
+                <w:color w:val="1F3864"/>
+                <w:sz w:val="21"/>
+                <w:szCs w:val="21"/>
+              </w:rPr>
+              <w:t xml:space="preserve">7. Scope</w:t>
+            </w:r>
+            <w:r>
+              <w:rPr>
+                <w:rFonts w:ascii="Calibri" w:cs="Calibri" w:eastAsia="Calibri" w:hAnsi="Calibri"/>
+                <w:b/>
+                <w:bCs/>
+                <w:color w:val="1F3864"/>
+                <w:sz w:val="21"/>
+                <w:szCs w:val="21"/>
+              </w:rPr>
+              <w:tab/>
+              <w:t>14</w:t>
+            </w:r>
+          </w:hyperlink>
+        </w:p>
+        <w:p>
+          <w:pPr>
+            <w:tabs>
+              <w:tab w:val="right" w:leader="dot" w:pos="9020"/>
+            </w:tabs>
+            <w:spacing w:before="20" w:after="20"/>
+            <w:ind w:left="360"/>
+          </w:pPr>
+          <w:hyperlink w:anchor="_TocV11_15" w:history="1">
+            <w:r>
+              <w:rPr>
+                <w:rFonts w:ascii="Calibri" w:cs="Calibri" w:eastAsia="Calibri" w:hAnsi="Calibri"/>
+                <w:sz w:val="20"/>
+                <w:szCs w:val="20"/>
+              </w:rPr>
+              <w:t xml:space="preserve">7.1 In scope</w:t>
+            </w:r>
+            <w:r>
+              <w:rPr>
+                <w:rFonts w:ascii="Calibri" w:cs="Calibri" w:eastAsia="Calibri" w:hAnsi="Calibri"/>
+                <w:sz w:val="20"/>
+                <w:szCs w:val="20"/>
+              </w:rPr>
+              <w:tab/>
+              <w:t>14</w:t>
+            </w:r>
+          </w:hyperlink>
+        </w:p>
+        <w:p>
+          <w:pPr>
+            <w:tabs>
+              <w:tab w:val="right" w:leader="dot" w:pos="9020"/>
+            </w:tabs>
+            <w:spacing w:before="20" w:after="20"/>
+            <w:ind w:left="360"/>
+          </w:pPr>
+          <w:hyperlink w:anchor="_TocV11_16" w:history="1">
+            <w:r>
+              <w:rPr>
+                <w:rFonts w:ascii="Calibri" w:cs="Calibri" w:eastAsia="Calibri" w:hAnsi="Calibri"/>
+                <w:sz w:val="20"/>
+                <w:szCs w:val="20"/>
+              </w:rPr>
+              <w:t xml:space="preserve">7.2 Out of scope (initial version)</w:t>
+            </w:r>
+            <w:r>
+              <w:rPr>
+                <w:rFonts w:ascii="Calibri" w:cs="Calibri" w:eastAsia="Calibri" w:hAnsi="Calibri"/>
+                <w:sz w:val="20"/>
+                <w:szCs w:val="20"/>
+              </w:rPr>
+              <w:tab/>
+              <w:t>14</w:t>
+            </w:r>
+          </w:hyperlink>
+        </w:p>
+        <w:p>
+          <w:pPr>
+            <w:tabs>
+              <w:tab w:val="right" w:leader="dot" w:pos="9020"/>
+            </w:tabs>
+            <w:spacing w:before="120" w:after="20"/>
+            <w:ind w:left="0"/>
+          </w:pPr>
+          <w:hyperlink w:anchor="_TocV11_17" w:history="1">
+            <w:r>
+              <w:rPr>
+                <w:rFonts w:ascii="Calibri" w:cs="Calibri" w:eastAsia="Calibri" w:hAnsi="Calibri"/>
+                <w:b/>
+                <w:bCs/>
+                <w:color w:val="1F3864"/>
+                <w:sz w:val="21"/>
+                <w:szCs w:val="21"/>
+              </w:rPr>
+              <w:t xml:space="preserve">8. Delivery and Commercial Model</w:t>
+            </w:r>
+            <w:r>
+              <w:rPr>
+                <w:rFonts w:ascii="Calibri" w:cs="Calibri" w:eastAsia="Calibri" w:hAnsi="Calibri"/>
+                <w:b/>
+                <w:bCs/>
+                <w:color w:val="1F3864"/>
+                <w:sz w:val="21"/>
+                <w:szCs w:val="21"/>
+              </w:rPr>
+              <w:tab/>
+              <w:t>14</w:t>
+            </w:r>
+          </w:hyperlink>
+        </w:p>
+        <w:p>
+          <w:pPr>
+            <w:tabs>
+              <w:tab w:val="right" w:leader="dot" w:pos="9020"/>
+            </w:tabs>
+            <w:spacing w:before="20" w:after="20"/>
+            <w:ind w:left="360"/>
+          </w:pPr>
+          <w:hyperlink w:anchor="_TocV11_18" w:history="1">
+            <w:r>
+              <w:rPr>
+                <w:rFonts w:ascii="Calibri" w:cs="Calibri" w:eastAsia="Calibri" w:hAnsi="Calibri"/>
+                <w:sz w:val="20"/>
+                <w:szCs w:val="20"/>
+              </w:rPr>
+              <w:t xml:space="preserve">8.1 Deployment options</w:t>
+            </w:r>
+            <w:r>
+              <w:rPr>
+                <w:rFonts w:ascii="Calibri" w:cs="Calibri" w:eastAsia="Calibri" w:hAnsi="Calibri"/>
+                <w:sz w:val="20"/>
+                <w:szCs w:val="20"/>
+              </w:rPr>
+              <w:tab/>
+              <w:t>15</w:t>
+            </w:r>
+          </w:hyperlink>
+        </w:p>
+        <w:p>
+          <w:pPr>
+            <w:tabs>
+              <w:tab w:val="right" w:leader="dot" w:pos="9020"/>
+            </w:tabs>
+            <w:spacing w:before="20" w:after="20"/>
+            <w:ind w:left="360"/>
+          </w:pPr>
+          <w:hyperlink w:anchor="_TocV11_19" w:history="1">
+            <w:r>
+              <w:rPr>
+                <w:rFonts w:ascii="Calibri" w:cs="Calibri" w:eastAsia="Calibri" w:hAnsi="Calibri"/>
+                <w:sz w:val="20"/>
+                <w:szCs w:val="20"/>
+              </w:rPr>
+              <w:t xml:space="preserve">8.2 Why a shared platform works for the sector</w:t>
+            </w:r>
+            <w:r>
+              <w:rPr>
+                <w:rFonts w:ascii="Calibri" w:cs="Calibri" w:eastAsia="Calibri" w:hAnsi="Calibri"/>
+                <w:sz w:val="20"/>
+                <w:szCs w:val="20"/>
+              </w:rPr>
+              <w:tab/>
+              <w:t>15</w:t>
+            </w:r>
+          </w:hyperlink>
+        </w:p>
+        <w:p>
+          <w:pPr>
+            <w:tabs>
+              <w:tab w:val="right" w:leader="dot" w:pos="9020"/>
+            </w:tabs>
+            <w:spacing w:before="120" w:after="20"/>
+            <w:ind w:left="0"/>
+          </w:pPr>
+          <w:hyperlink w:anchor="_TocV11_20" w:history="1">
+            <w:r>
+              <w:rPr>
+                <w:rFonts w:ascii="Calibri" w:cs="Calibri" w:eastAsia="Calibri" w:hAnsi="Calibri"/>
+                <w:b/>
+                <w:bCs/>
+                <w:color w:val="1F3864"/>
+                <w:sz w:val="21"/>
+                <w:szCs w:val="21"/>
+              </w:rPr>
+              <w:t xml:space="preserve">9. Implementation Approach</w:t>
+            </w:r>
+            <w:r>
+              <w:rPr>
+                <w:rFonts w:ascii="Calibri" w:cs="Calibri" w:eastAsia="Calibri" w:hAnsi="Calibri"/>
+                <w:b/>
+                <w:bCs/>
+                <w:color w:val="1F3864"/>
+                <w:sz w:val="21"/>
+                <w:szCs w:val="21"/>
+              </w:rPr>
+              <w:tab/>
+              <w:t>15</w:t>
+            </w:r>
+          </w:hyperlink>
+        </w:p>
+        <w:p>
+          <w:pPr>
+            <w:tabs>
+              <w:tab w:val="right" w:leader="dot" w:pos="9020"/>
+            </w:tabs>
+            <w:spacing w:before="120" w:after="20"/>
+            <w:ind w:left="0"/>
+          </w:pPr>
+          <w:hyperlink w:anchor="_TocV11_21" w:history="1">
+            <w:r>
+              <w:rPr>
+                <w:rFonts w:ascii="Calibri" w:cs="Calibri" w:eastAsia="Calibri" w:hAnsi="Calibri"/>
+                <w:b/>
+                <w:bCs/>
+                <w:color w:val="1F3864"/>
+                <w:sz w:val="21"/>
+                <w:szCs w:val="21"/>
+              </w:rPr>
+              <w:t xml:space="preserve">10. Expected Benefits</w:t>
+            </w:r>
+            <w:r>
+              <w:rPr>
+                <w:rFonts w:ascii="Calibri" w:cs="Calibri" w:eastAsia="Calibri" w:hAnsi="Calibri"/>
+                <w:b/>
+                <w:bCs/>
+                <w:color w:val="1F3864"/>
+                <w:sz w:val="21"/>
+                <w:szCs w:val="21"/>
+              </w:rPr>
+              <w:tab/>
+              <w:t>16</w:t>
+            </w:r>
+          </w:hyperlink>
+        </w:p>
+        <w:p>
+          <w:pPr>
+            <w:tabs>
+              <w:tab w:val="right" w:leader="dot" w:pos="9020"/>
+            </w:tabs>
+            <w:spacing w:before="120" w:after="20"/>
+            <w:ind w:left="0"/>
+          </w:pPr>
+          <w:hyperlink w:anchor="_TocV11_22" w:history="1">
+            <w:r>
+              <w:rPr>
+                <w:rFonts w:ascii="Calibri" w:cs="Calibri" w:eastAsia="Calibri" w:hAnsi="Calibri"/>
+                <w:b/>
+                <w:bCs/>
+                <w:color w:val="1F3864"/>
+                <w:sz w:val="21"/>
+                <w:szCs w:val="21"/>
+              </w:rPr>
+              <w:t xml:space="preserve">11. Key Risks</w:t>
+            </w:r>
+            <w:r>
+              <w:rPr>
+                <w:rFonts w:ascii="Calibri" w:cs="Calibri" w:eastAsia="Calibri" w:hAnsi="Calibri"/>
+                <w:b/>
+                <w:bCs/>
+                <w:color w:val="1F3864"/>
+                <w:sz w:val="21"/>
+                <w:szCs w:val="21"/>
+              </w:rPr>
+              <w:tab/>
+              <w:t>16</w:t>
+            </w:r>
+          </w:hyperlink>
+        </w:p>
+        <w:p>
+          <w:pPr>
+            <w:tabs>
+              <w:tab w:val="right" w:leader="dot" w:pos="9020"/>
+            </w:tabs>
+            <w:spacing w:before="120" w:after="20"/>
+            <w:ind w:left="0"/>
+          </w:pPr>
+          <w:hyperlink w:anchor="_TocV11_23" w:history="1">
+            <w:r>
+              <w:rPr>
+                <w:rFonts w:ascii="Calibri" w:cs="Calibri" w:eastAsia="Calibri" w:hAnsi="Calibri"/>
+                <w:b/>
+                <w:bCs/>
+                <w:color w:val="1F3864"/>
+                <w:sz w:val="21"/>
+                <w:szCs w:val="21"/>
+              </w:rPr>
+              <w:t xml:space="preserve">12. Recommendation and Next Steps</w:t>
+            </w:r>
+            <w:r>
+              <w:rPr>
+                <w:rFonts w:ascii="Calibri" w:cs="Calibri" w:eastAsia="Calibri" w:hAnsi="Calibri"/>
+                <w:b/>
+                <w:bCs/>
+                <w:color w:val="1F3864"/>
+                <w:sz w:val="21"/>
+                <w:szCs w:val="21"/>
+              </w:rPr>
+              <w:tab/>
+              <w:t>17</w:t>
+            </w:r>
+          </w:hyperlink>
         </w:p>
         <w:p>
           <w:r>
@@ -3048,11 +3809,28 @@
       <w:pPr>
         <w:pStyle w:val="Heading1"/>
       </w:pPr>
+      <w:bookmarkStart w:id="1" w:name="_TocV11_1"/>
       <w:r>
         <w:rPr>
           <w:rFonts w:ascii="Calibri" w:cs="Calibri" w:eastAsia="Calibri" w:hAnsi="Calibri"/>
         </w:rPr>
         <w:t xml:space="preserve">1. Executive Summary</w:t>
+      </w:r>
+      <w:bookmarkEnd w:id="1"/>
+    </w:p>
+    <w:p>
+      <w:pPr>
+        <w:spacing w:after="300"/>
+      </w:pPr>
+      <w:r>
+        <w:rPr>
+          <w:i/>
+          <w:rFonts w:ascii="Calibri" w:cs="Calibri" w:eastAsia="Calibri" w:hAnsi="Calibri"/>
+          <w:color w:val="595959"/>
+          <w:sz w:val="22"/>
+          <w:szCs w:val="22"/>
+        </w:rPr>
+        <w:t xml:space="preserve">This summary gives decision makers the whole case for CIMS on one page: the problem institutions face, what CIMS does about it, what has been built and what is asked of stakeholders. The sections that follow give the detail.</w:t>
       </w:r>
     </w:p>
     <w:p>
@@ -3704,22 +4482,56 @@
       <w:pPr>
         <w:pStyle w:val="Heading1"/>
       </w:pPr>
+      <w:bookmarkStart w:id="2" w:name="_TocV11_2"/>
       <w:r>
         <w:rPr>
           <w:rFonts w:ascii="Calibri" w:cs="Calibri" w:eastAsia="Calibri" w:hAnsi="Calibri"/>
         </w:rPr>
         <w:t xml:space="preserve">2. Background and Context</w:t>
       </w:r>
+      <w:bookmarkEnd w:id="2"/>
+    </w:p>
+    <w:p>
+      <w:pPr>
+        <w:spacing w:after="300"/>
+      </w:pPr>
+      <w:r>
+        <w:rPr>
+          <w:i/>
+          <w:rFonts w:ascii="Calibri" w:cs="Calibri" w:eastAsia="Calibri" w:hAnsi="Calibri"/>
+          <w:color w:val="595959"/>
+          <w:sz w:val="22"/>
+          <w:szCs w:val="22"/>
+        </w:rPr>
+        <w:t xml:space="preserve">This section sets out the environment in which CIMS will operate: how the technical and vocational education sector is regulated and how admissions and student records are handled today. It explains why the system is designed the way it is.</w:t>
+      </w:r>
     </w:p>
     <w:p>
       <w:pPr>
         <w:pStyle w:val="Heading2"/>
       </w:pPr>
+      <w:bookmarkStart w:id="3" w:name="_TocV11_3"/>
       <w:r>
         <w:rPr>
           <w:rFonts w:ascii="Calibri" w:cs="Calibri" w:eastAsia="Calibri" w:hAnsi="Calibri"/>
         </w:rPr>
         <w:t xml:space="preserve">2.1 The TVET sector and NACTVET</w:t>
+      </w:r>
+      <w:bookmarkEnd w:id="3"/>
+    </w:p>
+    <w:p>
+      <w:pPr>
+        <w:spacing w:after="300"/>
+      </w:pPr>
+      <w:r>
+        <w:rPr>
+          <w:i/>
+          <w:rFonts w:ascii="Calibri" w:cs="Calibri" w:eastAsia="Calibri" w:hAnsi="Calibri"/>
+          <w:color w:val="595959"/>
+          <w:sz w:val="22"/>
+          <w:szCs w:val="22"/>
+        </w:rPr>
+        <w:t xml:space="preserve">Readers new to the sector will find here the role of NACTVET and the award levels CIMS must support. These rules drive much of the system's design, from entry requirements to grading and regulator submissions.</w:t>
       </w:r>
     </w:p>
     <w:p>
@@ -4092,11 +4904,28 @@
       <w:pPr>
         <w:pStyle w:val="Heading2"/>
       </w:pPr>
+      <w:bookmarkStart w:id="4" w:name="_TocV11_4"/>
       <w:r>
         <w:rPr>
           <w:rFonts w:ascii="Calibri" w:cs="Calibri" w:eastAsia="Calibri" w:hAnsi="Calibri"/>
         </w:rPr>
         <w:t xml:space="preserve">2.2 How admissions work today</w:t>
+      </w:r>
+      <w:bookmarkEnd w:id="4"/>
+    </w:p>
+    <w:p>
+      <w:pPr>
+        <w:spacing w:after="300"/>
+      </w:pPr>
+      <w:r>
+        <w:rPr>
+          <w:i/>
+          <w:rFonts w:ascii="Calibri" w:cs="Calibri" w:eastAsia="Calibri" w:hAnsi="Calibri"/>
+          <w:color w:val="595959"/>
+          <w:sz w:val="22"/>
+          <w:szCs w:val="22"/>
+        </w:rPr>
+        <w:t xml:space="preserve">This sub-section describes the current admission process from application to NACTVET verification. Understanding today's steps shows where time is lost and errors occur, which CIMS is designed to remove.</w:t>
       </w:r>
     </w:p>
     <w:p>
@@ -4141,11 +4970,28 @@
       <w:pPr>
         <w:pStyle w:val="Heading1"/>
       </w:pPr>
+      <w:bookmarkStart w:id="5" w:name="_TocV11_5"/>
       <w:r>
         <w:rPr>
           <w:rFonts w:ascii="Calibri" w:cs="Calibri" w:eastAsia="Calibri" w:hAnsi="Calibri"/>
         </w:rPr>
         <w:t xml:space="preserve">3. Problem Statement</w:t>
+      </w:r>
+      <w:bookmarkEnd w:id="5"/>
+    </w:p>
+    <w:p>
+      <w:pPr>
+        <w:spacing w:after="300"/>
+      </w:pPr>
+      <w:r>
+        <w:rPr>
+          <w:i/>
+          <w:rFonts w:ascii="Calibri" w:cs="Calibri" w:eastAsia="Calibri" w:hAnsi="Calibri"/>
+          <w:color w:val="595959"/>
+          <w:sz w:val="22"/>
+          <w:szCs w:val="22"/>
+        </w:rPr>
+        <w:t xml:space="preserve">This section names the problems institutions face today and what each one costs them in money, time, errors and lost applicants. Each problem is answered by a part of CIMS described later in the document.</w:t>
       </w:r>
     </w:p>
     <w:tbl>
@@ -4741,11 +5587,28 @@
       <w:pPr>
         <w:pStyle w:val="Heading1"/>
       </w:pPr>
+      <w:bookmarkStart w:id="6" w:name="_TocV11_6"/>
       <w:r>
         <w:rPr>
           <w:rFonts w:ascii="Calibri" w:cs="Calibri" w:eastAsia="Calibri" w:hAnsi="Calibri"/>
         </w:rPr>
         <w:t xml:space="preserve">4. Vision and Objectives</w:t>
+      </w:r>
+      <w:bookmarkEnd w:id="6"/>
+    </w:p>
+    <w:p>
+      <w:pPr>
+        <w:spacing w:after="300"/>
+      </w:pPr>
+      <w:r>
+        <w:rPr>
+          <w:i/>
+          <w:rFonts w:ascii="Calibri" w:cs="Calibri" w:eastAsia="Calibri" w:hAnsi="Calibri"/>
+          <w:color w:val="595959"/>
+          <w:sz w:val="22"/>
+          <w:szCs w:val="22"/>
+        </w:rPr>
+        <w:t xml:space="preserve">This section states what CIMS aims to achieve: a long-term vision and specific, measurable objectives. The objectives are the yardstick against which stakeholders can judge whether the project has succeeded.</w:t>
       </w:r>
     </w:p>
     <w:p>
@@ -5747,22 +6610,56 @@
       <w:pPr>
         <w:pStyle w:val="Heading1"/>
       </w:pPr>
+      <w:bookmarkStart w:id="7" w:name="_TocV11_7"/>
       <w:r>
         <w:rPr>
           <w:rFonts w:ascii="Calibri" w:cs="Calibri" w:eastAsia="Calibri" w:hAnsi="Calibri"/>
         </w:rPr>
         <w:t xml:space="preserve">5. Proposed Solution</w:t>
       </w:r>
+      <w:bookmarkEnd w:id="7"/>
+    </w:p>
+    <w:p>
+      <w:pPr>
+        <w:spacing w:after="300"/>
+      </w:pPr>
+      <w:r>
+        <w:rPr>
+          <w:i/>
+          <w:rFonts w:ascii="Calibri" w:cs="Calibri" w:eastAsia="Calibri" w:hAnsi="Calibri"/>
+          <w:color w:val="595959"/>
+          <w:sz w:val="22"/>
+          <w:szCs w:val="22"/>
+        </w:rPr>
+        <w:t xml:space="preserve">This section describes CIMS itself: how it covers the whole student lifecycle, the modules it is made of, how it connects to national systems, and what has already been built.</w:t>
+      </w:r>
     </w:p>
     <w:p>
       <w:pPr>
         <w:pStyle w:val="Heading2"/>
       </w:pPr>
+      <w:bookmarkStart w:id="8" w:name="_TocV11_8"/>
       <w:r>
         <w:rPr>
           <w:rFonts w:ascii="Calibri" w:cs="Calibri" w:eastAsia="Calibri" w:hAnsi="Calibri"/>
         </w:rPr>
         <w:t xml:space="preserve">5.1 The student lifecycle on one platform</w:t>
+      </w:r>
+      <w:bookmarkEnd w:id="8"/>
+    </w:p>
+    <w:p>
+      <w:pPr>
+        <w:spacing w:after="300"/>
+      </w:pPr>
+      <w:r>
+        <w:rPr>
+          <w:i/>
+          <w:rFonts w:ascii="Calibri" w:cs="Calibri" w:eastAsia="Calibri" w:hAnsi="Calibri"/>
+          <w:color w:val="595959"/>
+          <w:sz w:val="22"/>
+          <w:szCs w:val="22"/>
+        </w:rPr>
+        <w:t xml:space="preserve">The figure below shows the journey of a student through an institution, from application to graduation, and that every stage is handled in one system rather than in separate tools.</w:t>
       </w:r>
     </w:p>
     <w:p>
@@ -5832,11 +6729,28 @@
       <w:pPr>
         <w:pStyle w:val="Heading2"/>
       </w:pPr>
+      <w:bookmarkStart w:id="9" w:name="_TocV11_9"/>
       <w:r>
         <w:rPr>
           <w:rFonts w:ascii="Calibri" w:cs="Calibri" w:eastAsia="Calibri" w:hAnsi="Calibri"/>
         </w:rPr>
         <w:t xml:space="preserve">5.2 Functional modules</w:t>
+      </w:r>
+      <w:bookmarkEnd w:id="9"/>
+    </w:p>
+    <w:p>
+      <w:pPr>
+        <w:spacing w:after="300"/>
+      </w:pPr>
+      <w:r>
+        <w:rPr>
+          <w:i/>
+          <w:rFonts w:ascii="Calibri" w:cs="Calibri" w:eastAsia="Calibri" w:hAnsi="Calibri"/>
+          <w:color w:val="595959"/>
+          <w:sz w:val="22"/>
+          <w:szCs w:val="22"/>
+        </w:rPr>
+        <w:t xml:space="preserve">CIMS is organised into modules, each serving one area of the institution's work. The table lists what each module does and the release in which it is delivered.</w:t>
       </w:r>
     </w:p>
     <w:tbl>
@@ -7415,11 +8329,28 @@
       <w:pPr>
         <w:pStyle w:val="Heading2"/>
       </w:pPr>
+      <w:bookmarkStart w:id="10" w:name="_TocV11_10"/>
       <w:r>
         <w:rPr>
           <w:rFonts w:ascii="Calibri" w:cs="Calibri" w:eastAsia="Calibri" w:hAnsi="Calibri"/>
         </w:rPr>
         <w:t xml:space="preserve">5.3 How CIMS connects to the national ecosystem</w:t>
+      </w:r>
+      <w:bookmarkEnd w:id="10"/>
+    </w:p>
+    <w:p>
+      <w:pPr>
+        <w:spacing w:after="300"/>
+      </w:pPr>
+      <w:r>
+        <w:rPr>
+          <w:i/>
+          <w:rFonts w:ascii="Calibri" w:cs="Calibri" w:eastAsia="Calibri" w:hAnsi="Calibri"/>
+          <w:color w:val="595959"/>
+          <w:sz w:val="22"/>
+          <w:szCs w:val="22"/>
+        </w:rPr>
+        <w:t xml:space="preserve">Institutions must exchange data with NECTA, NACTVET, GePG and other national bodies. This sub-section explains how CIMS connects to each one, directly where an interface exists and through generated files where it does not.</w:t>
       </w:r>
     </w:p>
     <w:p>
@@ -7501,11 +8432,28 @@
       <w:pPr>
         <w:pStyle w:val="Heading2"/>
       </w:pPr>
+      <w:bookmarkStart w:id="11" w:name="_TocV11_11"/>
       <w:r>
         <w:rPr>
           <w:rFonts w:ascii="Calibri" w:cs="Calibri" w:eastAsia="Calibri" w:hAnsi="Calibri"/>
         </w:rPr>
         <w:t xml:space="preserve">5.4 What has been built (October 2026)</w:t>
+      </w:r>
+      <w:bookmarkEnd w:id="11"/>
+    </w:p>
+    <w:p>
+      <w:pPr>
+        <w:spacing w:after="300"/>
+      </w:pPr>
+      <w:r>
+        <w:rPr>
+          <w:i/>
+          <w:rFonts w:ascii="Calibri" w:cs="Calibri" w:eastAsia="Calibri" w:hAnsi="Calibri"/>
+          <w:color w:val="595959"/>
+          <w:sz w:val="22"/>
+          <w:szCs w:val="22"/>
+        </w:rPr>
+        <w:t xml:space="preserve">This sub-section reports progress honestly: what an institution can do in the system today, module by module, and what remains to be done before full production use.</w:t>
       </w:r>
     </w:p>
     <w:p>
@@ -9142,11 +10090,28 @@
       <w:pPr>
         <w:pStyle w:val="Heading2"/>
       </w:pPr>
+      <w:bookmarkStart w:id="12" w:name="_TocV11_12"/>
       <w:r>
         <w:rPr>
           <w:rFonts w:ascii="Calibri" w:cs="Calibri" w:eastAsia="Calibri" w:hAnsi="Calibri"/>
         </w:rPr>
         <w:t xml:space="preserve">5.5 Connections to national systems as built</w:t>
+      </w:r>
+      <w:bookmarkEnd w:id="12"/>
+    </w:p>
+    <w:p>
+      <w:pPr>
+        <w:spacing w:after="300"/>
+      </w:pPr>
+      <w:r>
+        <w:rPr>
+          <w:i/>
+          <w:rFonts w:ascii="Calibri" w:cs="Calibri" w:eastAsia="Calibri" w:hAnsi="Calibri"/>
+          <w:color w:val="595959"/>
+          <w:sz w:val="22"/>
+          <w:szCs w:val="22"/>
+        </w:rPr>
+        <w:t xml:space="preserve">This table gives the current status of each connection to an outside system, whether it is live, simulated for testing or waiting for the body concerned to grant access.</w:t>
       </w:r>
     </w:p>
     <w:p>
@@ -10365,11 +11330,28 @@
       <w:pPr>
         <w:pStyle w:val="Heading1"/>
       </w:pPr>
+      <w:bookmarkStart w:id="13" w:name="_TocV11_13"/>
       <w:r>
         <w:rPr>
           <w:rFonts w:ascii="Calibri" w:cs="Calibri" w:eastAsia="Calibri" w:hAnsi="Calibri"/>
         </w:rPr>
         <w:t xml:space="preserve">6. Value to Stakeholders</w:t>
+      </w:r>
+      <w:bookmarkEnd w:id="13"/>
+    </w:p>
+    <w:p>
+      <w:pPr>
+        <w:spacing w:after="300"/>
+      </w:pPr>
+      <w:r>
+        <w:rPr>
+          <w:i/>
+          <w:rFonts w:ascii="Calibri" w:cs="Calibri" w:eastAsia="Calibri" w:hAnsi="Calibri"/>
+          <w:color w:val="595959"/>
+          <w:sz w:val="22"/>
+          <w:szCs w:val="22"/>
+        </w:rPr>
+        <w:t xml:space="preserve">A system succeeds only if the people who use it gain from it. This section shows, group by group, what CIMS gives each stakeholder, from the governing board to applicants and parents.</w:t>
       </w:r>
     </w:p>
     <w:p>
@@ -11257,22 +12239,56 @@
       <w:pPr>
         <w:pStyle w:val="Heading1"/>
       </w:pPr>
+      <w:bookmarkStart w:id="14" w:name="_TocV11_14"/>
       <w:r>
         <w:rPr>
           <w:rFonts w:ascii="Calibri" w:cs="Calibri" w:eastAsia="Calibri" w:hAnsi="Calibri"/>
         </w:rPr>
         <w:t xml:space="preserve">7. Scope</w:t>
       </w:r>
+      <w:bookmarkEnd w:id="14"/>
+    </w:p>
+    <w:p>
+      <w:pPr>
+        <w:spacing w:after="300"/>
+      </w:pPr>
+      <w:r>
+        <w:rPr>
+          <w:i/>
+          <w:rFonts w:ascii="Calibri" w:cs="Calibri" w:eastAsia="Calibri" w:hAnsi="Calibri"/>
+          <w:color w:val="595959"/>
+          <w:sz w:val="22"/>
+          <w:szCs w:val="22"/>
+        </w:rPr>
+        <w:t xml:space="preserve">This section defines the boundaries of the project: what CIMS will do and, just as importantly, what it will not do in its first version. Clear boundaries avoid misunderstanding about what institutions will receive.</w:t>
+      </w:r>
     </w:p>
     <w:p>
       <w:pPr>
         <w:pStyle w:val="Heading2"/>
       </w:pPr>
+      <w:bookmarkStart w:id="15" w:name="_TocV11_15"/>
       <w:r>
         <w:rPr>
           <w:rFonts w:ascii="Calibri" w:cs="Calibri" w:eastAsia="Calibri" w:hAnsi="Calibri"/>
         </w:rPr>
         <w:t xml:space="preserve">7.1 In scope</w:t>
+      </w:r>
+      <w:bookmarkEnd w:id="15"/>
+    </w:p>
+    <w:p>
+      <w:pPr>
+        <w:spacing w:after="300"/>
+      </w:pPr>
+      <w:r>
+        <w:rPr>
+          <w:i/>
+          <w:rFonts w:ascii="Calibri" w:cs="Calibri" w:eastAsia="Calibri" w:hAnsi="Calibri"/>
+          <w:color w:val="595959"/>
+          <w:sz w:val="22"/>
+          <w:szCs w:val="22"/>
+        </w:rPr>
+        <w:t xml:space="preserve">The items below are included in the project and will be delivered across the three releases.</w:t>
       </w:r>
     </w:p>
     <w:p>
@@ -11375,11 +12391,28 @@
       <w:pPr>
         <w:pStyle w:val="Heading2"/>
       </w:pPr>
+      <w:bookmarkStart w:id="16" w:name="_TocV11_16"/>
       <w:r>
         <w:rPr>
           <w:rFonts w:ascii="Calibri" w:cs="Calibri" w:eastAsia="Calibri" w:hAnsi="Calibri"/>
         </w:rPr>
         <w:t xml:space="preserve">7.2 Out of scope (initial version)</w:t>
+      </w:r>
+      <w:bookmarkEnd w:id="16"/>
+    </w:p>
+    <w:p>
+      <w:pPr>
+        <w:spacing w:after="300"/>
+      </w:pPr>
+      <w:r>
+        <w:rPr>
+          <w:i/>
+          <w:rFonts w:ascii="Calibri" w:cs="Calibri" w:eastAsia="Calibri" w:hAnsi="Calibri"/>
+          <w:color w:val="595959"/>
+          <w:sz w:val="22"/>
+          <w:szCs w:val="22"/>
+        </w:rPr>
+        <w:t xml:space="preserve">The items below are deliberately left out of the first version, with the reason or the way CIMS works alongside other systems that already cover them.</w:t>
       </w:r>
     </w:p>
     <w:p>
@@ -11484,11 +12517,28 @@
       <w:pPr>
         <w:pStyle w:val="Heading1"/>
       </w:pPr>
+      <w:bookmarkStart w:id="17" w:name="_TocV11_17"/>
       <w:r>
         <w:rPr>
           <w:rFonts w:ascii="Calibri" w:cs="Calibri" w:eastAsia="Calibri" w:hAnsi="Calibri"/>
         </w:rPr>
         <w:t xml:space="preserve">8. Delivery and Commercial Model</w:t>
+      </w:r>
+      <w:bookmarkEnd w:id="17"/>
+    </w:p>
+    <w:p>
+      <w:pPr>
+        <w:spacing w:after="300"/>
+      </w:pPr>
+      <w:r>
+        <w:rPr>
+          <w:i/>
+          <w:rFonts w:ascii="Calibri" w:cs="Calibri" w:eastAsia="Calibri" w:hAnsi="Calibri"/>
+          <w:color w:val="595959"/>
+          <w:sz w:val="22"/>
+          <w:szCs w:val="22"/>
+        </w:rPr>
+        <w:t xml:space="preserve">This section explains who builds, runs and supports CIMS, how institutions can obtain it and why a shared platform is the most cost-effective model for the sector.</w:t>
       </w:r>
     </w:p>
     <w:p>
@@ -11521,11 +12571,28 @@
       <w:pPr>
         <w:pStyle w:val="Heading2"/>
       </w:pPr>
+      <w:bookmarkStart w:id="18" w:name="_TocV11_18"/>
       <w:r>
         <w:rPr>
           <w:rFonts w:ascii="Calibri" w:cs="Calibri" w:eastAsia="Calibri" w:hAnsi="Calibri"/>
         </w:rPr>
         <w:t xml:space="preserve">8.1 Deployment options</w:t>
+      </w:r>
+      <w:bookmarkEnd w:id="18"/>
+    </w:p>
+    <w:p>
+      <w:pPr>
+        <w:spacing w:after="300"/>
+      </w:pPr>
+      <w:r>
+        <w:rPr>
+          <w:i/>
+          <w:rFonts w:ascii="Calibri" w:cs="Calibri" w:eastAsia="Calibri" w:hAnsi="Calibri"/>
+          <w:color w:val="595959"/>
+          <w:sz w:val="22"/>
+          <w:szCs w:val="22"/>
+        </w:rPr>
+        <w:t xml:space="preserve">Institutions can choose how CIMS is hosted. The table compares the two options on hosting, cost, upgrades and responsibilities to help each institution choose.</w:t>
       </w:r>
     </w:p>
     <w:tbl>
@@ -12169,11 +13236,28 @@
       <w:pPr>
         <w:pStyle w:val="Heading2"/>
       </w:pPr>
+      <w:bookmarkStart w:id="19" w:name="_TocV11_19"/>
       <w:r>
         <w:rPr>
           <w:rFonts w:ascii="Calibri" w:cs="Calibri" w:eastAsia="Calibri" w:hAnsi="Calibri"/>
         </w:rPr>
         <w:t xml:space="preserve">8.2 Why a shared platform works for the sector</w:t>
+      </w:r>
+      <w:bookmarkEnd w:id="19"/>
+    </w:p>
+    <w:p>
+      <w:pPr>
+        <w:spacing w:after="300"/>
+      </w:pPr>
+      <w:r>
+        <w:rPr>
+          <w:i/>
+          <w:rFonts w:ascii="Calibri" w:cs="Calibri" w:eastAsia="Calibri" w:hAnsi="Calibri"/>
+          <w:color w:val="595959"/>
+          <w:sz w:val="22"/>
+          <w:szCs w:val="22"/>
+        </w:rPr>
+        <w:t xml:space="preserve">This sub-section explains why many institutions sharing one secure platform is better value than each institution commissioning its own system, while each keeps full ownership of its data.</w:t>
       </w:r>
     </w:p>
     <w:p>
@@ -12240,11 +13324,28 @@
       <w:pPr>
         <w:pStyle w:val="Heading1"/>
       </w:pPr>
+      <w:bookmarkStart w:id="20" w:name="_TocV11_20"/>
       <w:r>
         <w:rPr>
           <w:rFonts w:ascii="Calibri" w:cs="Calibri" w:eastAsia="Calibri" w:hAnsi="Calibri"/>
         </w:rPr>
         <w:t xml:space="preserve">9. Implementation Approach</w:t>
+      </w:r>
+      <w:bookmarkEnd w:id="20"/>
+    </w:p>
+    <w:p>
+      <w:pPr>
+        <w:spacing w:after="300"/>
+      </w:pPr>
+      <w:r>
+        <w:rPr>
+          <w:i/>
+          <w:rFonts w:ascii="Calibri" w:cs="Calibri" w:eastAsia="Calibri" w:hAnsi="Calibri"/>
+          <w:color w:val="595959"/>
+          <w:sz w:val="22"/>
+          <w:szCs w:val="22"/>
+        </w:rPr>
+        <w:t xml:space="preserve">This section describes how CIMS will be introduced: in three releases timed to the academic calendar, each one stabilised before the next goes live, so institutions are never asked to change everything at once.</w:t>
       </w:r>
     </w:p>
     <w:p>
@@ -12736,11 +13837,28 @@
       <w:pPr>
         <w:pStyle w:val="Heading1"/>
       </w:pPr>
+      <w:bookmarkStart w:id="21" w:name="_TocV11_21"/>
       <w:r>
         <w:rPr>
           <w:rFonts w:ascii="Calibri" w:cs="Calibri" w:eastAsia="Calibri" w:hAnsi="Calibri"/>
         </w:rPr>
         <w:t xml:space="preserve">10. Expected Benefits</w:t>
+      </w:r>
+      <w:bookmarkEnd w:id="21"/>
+    </w:p>
+    <w:p>
+      <w:pPr>
+        <w:spacing w:after="300"/>
+      </w:pPr>
+      <w:r>
+        <w:rPr>
+          <w:i/>
+          <w:rFonts w:ascii="Calibri" w:cs="Calibri" w:eastAsia="Calibri" w:hAnsi="Calibri"/>
+          <w:color w:val="595959"/>
+          <w:sz w:val="22"/>
+          <w:szCs w:val="22"/>
+        </w:rPr>
+        <w:t xml:space="preserve">This section lists the benefits institutions can expect from CIMS, grouped by area, so stakeholders can see the return on their investment of time and money.</w:t>
       </w:r>
     </w:p>
     <w:tbl>
@@ -13267,11 +14385,28 @@
       <w:pPr>
         <w:pStyle w:val="Heading1"/>
       </w:pPr>
+      <w:bookmarkStart w:id="22" w:name="_TocV11_22"/>
       <w:r>
         <w:rPr>
           <w:rFonts w:ascii="Calibri" w:cs="Calibri" w:eastAsia="Calibri" w:hAnsi="Calibri"/>
         </w:rPr>
         <w:t xml:space="preserve">11. Key Risks</w:t>
+      </w:r>
+      <w:bookmarkEnd w:id="22"/>
+    </w:p>
+    <w:p>
+      <w:pPr>
+        <w:spacing w:after="300"/>
+      </w:pPr>
+      <w:r>
+        <w:rPr>
+          <w:i/>
+          <w:rFonts w:ascii="Calibri" w:cs="Calibri" w:eastAsia="Calibri" w:hAnsi="Calibri"/>
+          <w:color w:val="595959"/>
+          <w:sz w:val="22"/>
+          <w:szCs w:val="22"/>
+        </w:rPr>
+        <w:t xml:space="preserve">Every project faces risks. This section names the main risks to CIMS and how each one is reduced or managed, so stakeholders can judge that they are under control.</w:t>
       </w:r>
     </w:p>
     <w:tbl>
@@ -13739,11 +14874,28 @@
       <w:pPr>
         <w:pStyle w:val="Heading1"/>
       </w:pPr>
+      <w:bookmarkStart w:id="23" w:name="_TocV11_23"/>
       <w:r>
         <w:rPr>
           <w:rFonts w:ascii="Calibri" w:cs="Calibri" w:eastAsia="Calibri" w:hAnsi="Calibri"/>
         </w:rPr>
         <w:t xml:space="preserve">12. Recommendation and Next Steps</w:t>
+      </w:r>
+      <w:bookmarkEnd w:id="23"/>
+    </w:p>
+    <w:p>
+      <w:pPr>
+        <w:spacing w:after="300"/>
+      </w:pPr>
+      <w:r>
+        <w:rPr>
+          <w:i/>
+          <w:rFonts w:ascii="Calibri" w:cs="Calibri" w:eastAsia="Calibri" w:hAnsi="Calibri"/>
+          <w:color w:val="595959"/>
+          <w:sz w:val="22"/>
+          <w:szCs w:val="22"/>
+        </w:rPr>
+        <w:t xml:space="preserve">This final section states what stakeholders are asked to decide and the immediate steps that follow approval.</w:t>
       </w:r>
     </w:p>
     <w:p>

</xml_diff>

<commit_message>
Batch 10: late registration fee, fee reminders, status-change waivers, hostel bed changes and refunds, entry-rule test tool; CI updates
</commit_message>
<xml_diff>
--- a/docs/01_Concept_Note_College_Institution_Management_System.docx
+++ b/docs/01_Concept_Note_College_Institution_Management_System.docx
@@ -12510,7 +12510,13 @@
           <w:b/>
           <w:bCs/>
         </w:rPr>
-        <w:t xml:space="preserve">As built: the scope boundaries above still hold. Everything within scope is in the development build; what remains is switching the outside connections to live as each body grants access, timetabling, and production hosting (section 5.4).</w:t>
+        <w:t>As built:</w:t>
+      </w:r>
+      <w:r>
+        <w:rPr>
+          <w:rFonts w:ascii="Calibri" w:cs="Calibri" w:eastAsia="Calibri" w:hAnsi="Calibri"/>
+        </w:rPr>
+        <w:t xml:space="preserve"> the scope boundaries above still hold. Everything within scope is in the development build; what remains is switching the outside connections to live as each body grants access, timetabling, and production hosting (section 5.4).</w:t>
       </w:r>
     </w:p>
     <w:p>

</xml_diff>

<commit_message>
Docs: abbreviations and glossary in every document; CI shows Trivy findings and test failures as annotations
</commit_message>
<xml_diff>
--- a/docs/01_Concept_Note_College_Institution_Management_System.docx
+++ b/docs/01_Concept_Note_College_Institution_Management_System.docx
@@ -1510,7 +1510,7 @@
                 <w:sz w:val="18"/>
                 <w:szCs w:val="18"/>
               </w:rPr>
-              <w:t xml:space="preserve">Sections 5.4, 5.5 and the progress note brought up to date after the completion batches (campuses and transfers; instalments, penalties and discounts; email; two-step sign-in, API clients and personal-data requests; data import and document uploads; configurable approval stages; alumni and tracer surveys; government adapters, deployment and load tests; the staff back-office in Kiswahili). The version 2.0 vision and scope stay the baseline.</w:t>
+              <w:t xml:space="preserve">Sections 5.4, 5.5 and the progress note brought up to date after the completion batches (campuses and transfers; instalments, penalties and discounts; email; two-step sign-in, API clients and personal-data requests; data import and document uploads; configurable approval stages; alumni and tracer surveys; government adapters, deployment and load tests; the staff back-office in Kiswahili). The version 2.0 vision and scope stay the baseline. Abbreviations and glossary table added (Appendix A).</w:t>
             </w:r>
           </w:p>
         </w:tc>
@@ -3774,6 +3774,40 @@
               </w:rPr>
               <w:tab/>
               <w:t>17</w:t>
+            </w:r>
+          </w:hyperlink>
+        </w:p>
+        <w:p>
+          <w:pPr>
+            <w:tabs>
+              <w:tab w:val="right" w:leader="dot" w:pos="9020"/>
+            </w:tabs>
+            <w:spacing w:before="120" w:after="20"/>
+            <w:ind w:left="0"/>
+          </w:pPr>
+          <w:hyperlink w:anchor="_TocV11_24" w:history="1">
+            <w:r>
+              <w:rPr>
+                <w:rFonts w:ascii="Calibri" w:cs="Calibri" w:eastAsia="Calibri" w:hAnsi="Calibri"/>
+                <w:b/>
+                <w:bCs/>
+                <w:color w:val="1F3864"/>
+                <w:sz w:val="21"/>
+                <w:szCs w:val="21"/>
+              </w:rPr>
+              <w:t xml:space="preserve">Appendix A. Abbreviations and glossary</w:t>
+            </w:r>
+            <w:r>
+              <w:rPr>
+                <w:rFonts w:ascii="Calibri" w:cs="Calibri" w:eastAsia="Calibri" w:hAnsi="Calibri"/>
+                <w:b/>
+                <w:bCs/>
+                <w:color w:val="1F3864"/>
+                <w:sz w:val="21"/>
+                <w:szCs w:val="21"/>
+              </w:rPr>
+              <w:tab/>
+              <w:t>18</w:t>
             </w:r>
           </w:hyperlink>
         </w:p>
@@ -14996,6 +15030,3459 @@
         <w:t xml:space="preserve">Approve the remaining work in Document 07, section 3.2, so the first institutions go live before the 2027/28 application window.</w:t>
       </w:r>
     </w:p>
+    <w:p>
+      <w:pPr>
+        <w:spacing w:after="300"/>
+      </w:pPr>
+      <w:r>
+        <w:rPr>
+          <w:i/>
+          <w:rFonts w:ascii="Calibri" w:cs="Calibri" w:eastAsia="Calibri" w:hAnsi="Calibri"/>
+          <w:color w:val="595959"/>
+          <w:sz w:val="22"/>
+          <w:szCs w:val="22"/>
+        </w:rPr>
+        <w:t xml:space="preserve"/>
+      </w:r>
+      <w:r>
+        <w:br w:type="page"/>
+      </w:r>
+    </w:p>
+    <w:p>
+      <w:pPr>
+        <w:pStyle w:val="Heading1"/>
+      </w:pPr>
+      <w:bookmarkStart w:id="24" w:name="_TocV11_24"/>
+      <w:r>
+        <w:rPr>
+          <w:rFonts w:ascii="Calibri" w:cs="Calibri" w:eastAsia="Calibri" w:hAnsi="Calibri"/>
+        </w:rPr>
+        <w:t xml:space="preserve">Appendix A. Abbreviations and glossary</w:t>
+      </w:r>
+      <w:bookmarkEnd w:id="24"/>
+    </w:p>
+    <w:p>
+      <w:pPr>
+        <w:spacing w:after="300"/>
+      </w:pPr>
+      <w:r>
+        <w:rPr>
+          <w:i/>
+          <w:rFonts w:ascii="Calibri" w:cs="Calibri" w:eastAsia="Calibri" w:hAnsi="Calibri"/>
+          <w:color w:val="595959"/>
+          <w:sz w:val="22"/>
+          <w:szCs w:val="22"/>
+        </w:rPr>
+        <w:t xml:space="preserve">This table explains the abbreviations and specialised terms used in this document, so that readers from any office can follow it. Only terms that appear in this document are listed.</w:t>
+      </w:r>
+    </w:p>
+    <w:tbl>
+      <w:tblPr>
+        <w:tblW w:type="dxa" w:w="9026"/>
+        <w:tblBorders>
+          <w:top w:val="single" w:color="auto" w:sz="4"/>
+          <w:left w:val="single" w:color="auto" w:sz="4"/>
+          <w:bottom w:val="single" w:color="auto" w:sz="4"/>
+          <w:right w:val="single" w:color="auto" w:sz="4"/>
+          <w:insideH w:val="single" w:color="auto" w:sz="4"/>
+          <w:insideV w:val="single" w:color="auto" w:sz="4"/>
+        </w:tblBorders>
+        <w:tblLayout w:type="fixed"/>
+      </w:tblPr>
+      <w:tblGrid>
+        <w:gridCol w:w="1985"/>
+        <w:gridCol w:w="7041"/>
+      </w:tblGrid>
+      <w:tr>
+        <w:trPr>
+          <w:tblHeader/>
+        </w:trPr>
+        <w:tc>
+          <w:tcPr>
+            <w:tcW w:type="dxa" w:w="1985"/>
+            <w:tcBorders>
+              <w:top w:val="single" w:color="BFC9D6" w:sz="4"/>
+              <w:left w:val="single" w:color="BFC9D6" w:sz="4"/>
+              <w:bottom w:val="single" w:color="BFC9D6" w:sz="4"/>
+              <w:right w:val="single" w:color="BFC9D6" w:sz="4"/>
+            </w:tcBorders>
+            <w:shd w:fill="1F3864" w:color="auto" w:val="clear"/>
+            <w:tcMar>
+              <w:top w:type="dxa" w:w="60"/>
+              <w:left w:type="dxa" w:w="100"/>
+              <w:bottom w:type="dxa" w:w="60"/>
+              <w:right w:type="dxa" w:w="100"/>
+            </w:tcMar>
+            <w:vAlign w:val="center"/>
+          </w:tcPr>
+          <w:p>
+            <w:pPr>
+              <w:spacing w:after="30" w:before="30"/>
+              <w:jc w:val="left"/>
+            </w:pPr>
+            <w:r>
+              <w:rPr>
+                <w:rFonts w:ascii="Calibri" w:cs="Calibri" w:eastAsia="Calibri" w:hAnsi="Calibri"/>
+                <w:b/>
+                <w:bCs/>
+                <w:color w:val="FFFFFF"/>
+                <w:sz w:val="18"/>
+                <w:szCs w:val="18"/>
+              </w:rPr>
+              <w:t xml:space="preserve">Term</w:t>
+            </w:r>
+          </w:p>
+        </w:tc>
+        <w:tc>
+          <w:tcPr>
+            <w:tcW w:type="dxa" w:w="7041"/>
+            <w:tcBorders>
+              <w:top w:val="single" w:color="BFC9D6" w:sz="4"/>
+              <w:left w:val="single" w:color="BFC9D6" w:sz="4"/>
+              <w:bottom w:val="single" w:color="BFC9D6" w:sz="4"/>
+              <w:right w:val="single" w:color="BFC9D6" w:sz="4"/>
+            </w:tcBorders>
+            <w:shd w:fill="1F3864" w:color="auto" w:val="clear"/>
+            <w:tcMar>
+              <w:top w:type="dxa" w:w="60"/>
+              <w:left w:type="dxa" w:w="100"/>
+              <w:bottom w:type="dxa" w:w="60"/>
+              <w:right w:type="dxa" w:w="100"/>
+            </w:tcMar>
+            <w:vAlign w:val="center"/>
+          </w:tcPr>
+          <w:p>
+            <w:pPr>
+              <w:spacing w:after="30" w:before="30"/>
+              <w:jc w:val="left"/>
+            </w:pPr>
+            <w:r>
+              <w:rPr>
+                <w:rFonts w:ascii="Calibri" w:cs="Calibri" w:eastAsia="Calibri" w:hAnsi="Calibri"/>
+                <w:b/>
+                <w:bCs/>
+                <w:color w:val="FFFFFF"/>
+                <w:sz w:val="18"/>
+                <w:szCs w:val="18"/>
+              </w:rPr>
+              <w:t xml:space="preserve">Meaning</w:t>
+            </w:r>
+          </w:p>
+        </w:tc>
+      </w:tr>
+      <w:tr>
+        <w:trPr>
+          <w:cantSplit/>
+        </w:trPr>
+        <w:tc>
+          <w:tcPr>
+            <w:tcW w:type="dxa" w:w="1985"/>
+            <w:tcBorders>
+              <w:top w:val="single" w:color="BFC9D6" w:sz="4"/>
+              <w:left w:val="single" w:color="BFC9D6" w:sz="4"/>
+              <w:bottom w:val="single" w:color="BFC9D6" w:sz="4"/>
+              <w:right w:val="single" w:color="BFC9D6" w:sz="4"/>
+            </w:tcBorders>
+            <w:tcMar>
+              <w:top w:type="dxa" w:w="60"/>
+              <w:left w:type="dxa" w:w="100"/>
+              <w:bottom w:type="dxa" w:w="60"/>
+              <w:right w:type="dxa" w:w="100"/>
+            </w:tcMar>
+            <w:vAlign w:val="center"/>
+          </w:tcPr>
+          <w:p>
+            <w:pPr>
+              <w:spacing w:after="30" w:before="30"/>
+              <w:jc w:val="left"/>
+            </w:pPr>
+            <w:r>
+              <w:rPr>
+                <w:rFonts w:ascii="Calibri" w:cs="Calibri" w:eastAsia="Calibri" w:hAnsi="Calibri"/>
+                <w:sz w:val="18"/>
+                <w:szCs w:val="18"/>
+              </w:rPr>
+              <w:t xml:space="preserve">ACSEE</w:t>
+            </w:r>
+          </w:p>
+        </w:tc>
+        <w:tc>
+          <w:tcPr>
+            <w:tcW w:type="dxa" w:w="7041"/>
+            <w:tcBorders>
+              <w:top w:val="single" w:color="BFC9D6" w:sz="4"/>
+              <w:left w:val="single" w:color="BFC9D6" w:sz="4"/>
+              <w:bottom w:val="single" w:color="BFC9D6" w:sz="4"/>
+              <w:right w:val="single" w:color="BFC9D6" w:sz="4"/>
+            </w:tcBorders>
+            <w:tcMar>
+              <w:top w:type="dxa" w:w="60"/>
+              <w:left w:type="dxa" w:w="100"/>
+              <w:bottom w:type="dxa" w:w="60"/>
+              <w:right w:type="dxa" w:w="100"/>
+            </w:tcMar>
+            <w:vAlign w:val="center"/>
+          </w:tcPr>
+          <w:p>
+            <w:pPr>
+              <w:spacing w:after="30" w:before="30"/>
+              <w:jc w:val="left"/>
+            </w:pPr>
+            <w:r>
+              <w:rPr>
+                <w:rFonts w:ascii="Calibri" w:cs="Calibri" w:eastAsia="Calibri" w:hAnsi="Calibri"/>
+                <w:sz w:val="18"/>
+                <w:szCs w:val="18"/>
+              </w:rPr>
+              <w:t xml:space="preserve">Advanced Certificate of Secondary Education Examination (Form Six), results from NECTA.</w:t>
+            </w:r>
+          </w:p>
+        </w:tc>
+      </w:tr>
+      <w:tr>
+        <w:trPr>
+          <w:cantSplit/>
+        </w:trPr>
+        <w:tc>
+          <w:tcPr>
+            <w:tcW w:type="dxa" w:w="1985"/>
+            <w:tcBorders>
+              <w:top w:val="single" w:color="BFC9D6" w:sz="4"/>
+              <w:left w:val="single" w:color="BFC9D6" w:sz="4"/>
+              <w:bottom w:val="single" w:color="BFC9D6" w:sz="4"/>
+              <w:right w:val="single" w:color="BFC9D6" w:sz="4"/>
+            </w:tcBorders>
+            <w:tcMar>
+              <w:top w:type="dxa" w:w="60"/>
+              <w:left w:type="dxa" w:w="100"/>
+              <w:bottom w:type="dxa" w:w="60"/>
+              <w:right w:type="dxa" w:w="100"/>
+            </w:tcMar>
+            <w:vAlign w:val="center"/>
+          </w:tcPr>
+          <w:p>
+            <w:pPr>
+              <w:spacing w:after="30" w:before="30"/>
+              <w:jc w:val="left"/>
+            </w:pPr>
+            <w:r>
+              <w:rPr>
+                <w:rFonts w:ascii="Calibri" w:cs="Calibri" w:eastAsia="Calibri" w:hAnsi="Calibri"/>
+                <w:sz w:val="18"/>
+                <w:szCs w:val="18"/>
+              </w:rPr>
+              <w:t xml:space="preserve">Admission window</w:t>
+            </w:r>
+          </w:p>
+        </w:tc>
+        <w:tc>
+          <w:tcPr>
+            <w:tcW w:type="dxa" w:w="7041"/>
+            <w:tcBorders>
+              <w:top w:val="single" w:color="BFC9D6" w:sz="4"/>
+              <w:left w:val="single" w:color="BFC9D6" w:sz="4"/>
+              <w:bottom w:val="single" w:color="BFC9D6" w:sz="4"/>
+              <w:right w:val="single" w:color="BFC9D6" w:sz="4"/>
+            </w:tcBorders>
+            <w:tcMar>
+              <w:top w:type="dxa" w:w="60"/>
+              <w:left w:type="dxa" w:w="100"/>
+              <w:bottom w:type="dxa" w:w="60"/>
+              <w:right w:type="dxa" w:w="100"/>
+            </w:tcMar>
+            <w:vAlign w:val="center"/>
+          </w:tcPr>
+          <w:p>
+            <w:pPr>
+              <w:spacing w:after="30" w:before="30"/>
+              <w:jc w:val="left"/>
+            </w:pPr>
+            <w:r>
+              <w:rPr>
+                <w:rFonts w:ascii="Calibri" w:cs="Calibri" w:eastAsia="Calibri" w:hAnsi="Calibri"/>
+                <w:sz w:val="18"/>
+                <w:szCs w:val="18"/>
+              </w:rPr>
+              <w:t xml:space="preserve">A period, for one academic year and intake, during which applicants can apply for the programmes offered.</w:t>
+            </w:r>
+          </w:p>
+        </w:tc>
+      </w:tr>
+      <w:tr>
+        <w:trPr>
+          <w:cantSplit/>
+        </w:trPr>
+        <w:tc>
+          <w:tcPr>
+            <w:tcW w:type="dxa" w:w="1985"/>
+            <w:tcBorders>
+              <w:top w:val="single" w:color="BFC9D6" w:sz="4"/>
+              <w:left w:val="single" w:color="BFC9D6" w:sz="4"/>
+              <w:bottom w:val="single" w:color="BFC9D6" w:sz="4"/>
+              <w:right w:val="single" w:color="BFC9D6" w:sz="4"/>
+            </w:tcBorders>
+            <w:tcMar>
+              <w:top w:type="dxa" w:w="60"/>
+              <w:left w:type="dxa" w:w="100"/>
+              <w:bottom w:type="dxa" w:w="60"/>
+              <w:right w:type="dxa" w:w="100"/>
+            </w:tcMar>
+            <w:vAlign w:val="center"/>
+          </w:tcPr>
+          <w:p>
+            <w:pPr>
+              <w:spacing w:after="30" w:before="30"/>
+              <w:jc w:val="left"/>
+            </w:pPr>
+            <w:r>
+              <w:rPr>
+                <w:rFonts w:ascii="Calibri" w:cs="Calibri" w:eastAsia="Calibri" w:hAnsi="Calibri"/>
+                <w:sz w:val="18"/>
+                <w:szCs w:val="18"/>
+              </w:rPr>
+              <w:t xml:space="preserve">API</w:t>
+            </w:r>
+          </w:p>
+        </w:tc>
+        <w:tc>
+          <w:tcPr>
+            <w:tcW w:type="dxa" w:w="7041"/>
+            <w:tcBorders>
+              <w:top w:val="single" w:color="BFC9D6" w:sz="4"/>
+              <w:left w:val="single" w:color="BFC9D6" w:sz="4"/>
+              <w:bottom w:val="single" w:color="BFC9D6" w:sz="4"/>
+              <w:right w:val="single" w:color="BFC9D6" w:sz="4"/>
+            </w:tcBorders>
+            <w:tcMar>
+              <w:top w:type="dxa" w:w="60"/>
+              <w:left w:type="dxa" w:w="100"/>
+              <w:bottom w:type="dxa" w:w="60"/>
+              <w:right w:type="dxa" w:w="100"/>
+            </w:tcMar>
+            <w:vAlign w:val="center"/>
+          </w:tcPr>
+          <w:p>
+            <w:pPr>
+              <w:spacing w:after="30" w:before="30"/>
+              <w:jc w:val="left"/>
+            </w:pPr>
+            <w:r>
+              <w:rPr>
+                <w:rFonts w:ascii="Calibri" w:cs="Calibri" w:eastAsia="Calibri" w:hAnsi="Calibri"/>
+                <w:sz w:val="18"/>
+                <w:szCs w:val="18"/>
+              </w:rPr>
+              <w:t xml:space="preserve">Application Programming Interface: the way two systems exchange data automatically.</w:t>
+            </w:r>
+          </w:p>
+        </w:tc>
+      </w:tr>
+      <w:tr>
+        <w:trPr>
+          <w:cantSplit/>
+        </w:trPr>
+        <w:tc>
+          <w:tcPr>
+            <w:tcW w:type="dxa" w:w="1985"/>
+            <w:tcBorders>
+              <w:top w:val="single" w:color="BFC9D6" w:sz="4"/>
+              <w:left w:val="single" w:color="BFC9D6" w:sz="4"/>
+              <w:bottom w:val="single" w:color="BFC9D6" w:sz="4"/>
+              <w:right w:val="single" w:color="BFC9D6" w:sz="4"/>
+            </w:tcBorders>
+            <w:tcMar>
+              <w:top w:type="dxa" w:w="60"/>
+              <w:left w:type="dxa" w:w="100"/>
+              <w:bottom w:type="dxa" w:w="60"/>
+              <w:right w:type="dxa" w:w="100"/>
+            </w:tcMar>
+            <w:vAlign w:val="center"/>
+          </w:tcPr>
+          <w:p>
+            <w:pPr>
+              <w:spacing w:after="30" w:before="30"/>
+              <w:jc w:val="left"/>
+            </w:pPr>
+            <w:r>
+              <w:rPr>
+                <w:rFonts w:ascii="Calibri" w:cs="Calibri" w:eastAsia="Calibri" w:hAnsi="Calibri"/>
+                <w:sz w:val="18"/>
+                <w:szCs w:val="18"/>
+              </w:rPr>
+              <w:t xml:space="preserve">AVN</w:t>
+            </w:r>
+          </w:p>
+        </w:tc>
+        <w:tc>
+          <w:tcPr>
+            <w:tcW w:type="dxa" w:w="7041"/>
+            <w:tcBorders>
+              <w:top w:val="single" w:color="BFC9D6" w:sz="4"/>
+              <w:left w:val="single" w:color="BFC9D6" w:sz="4"/>
+              <w:bottom w:val="single" w:color="BFC9D6" w:sz="4"/>
+              <w:right w:val="single" w:color="BFC9D6" w:sz="4"/>
+            </w:tcBorders>
+            <w:tcMar>
+              <w:top w:type="dxa" w:w="60"/>
+              <w:left w:type="dxa" w:w="100"/>
+              <w:bottom w:type="dxa" w:w="60"/>
+              <w:right w:type="dxa" w:w="100"/>
+            </w:tcMar>
+            <w:vAlign w:val="center"/>
+          </w:tcPr>
+          <w:p>
+            <w:pPr>
+              <w:spacing w:after="30" w:before="30"/>
+              <w:jc w:val="left"/>
+            </w:pPr>
+            <w:r>
+              <w:rPr>
+                <w:rFonts w:ascii="Calibri" w:cs="Calibri" w:eastAsia="Calibri" w:hAnsi="Calibri"/>
+                <w:sz w:val="18"/>
+                <w:szCs w:val="18"/>
+              </w:rPr>
+              <w:t xml:space="preserve">Award Verification Number issued by NACTVET for NTA awards, used to verify prior qualifications.</w:t>
+            </w:r>
+          </w:p>
+        </w:tc>
+      </w:tr>
+      <w:tr>
+        <w:trPr>
+          <w:cantSplit/>
+        </w:trPr>
+        <w:tc>
+          <w:tcPr>
+            <w:tcW w:type="dxa" w:w="1985"/>
+            <w:tcBorders>
+              <w:top w:val="single" w:color="BFC9D6" w:sz="4"/>
+              <w:left w:val="single" w:color="BFC9D6" w:sz="4"/>
+              <w:bottom w:val="single" w:color="BFC9D6" w:sz="4"/>
+              <w:right w:val="single" w:color="BFC9D6" w:sz="4"/>
+            </w:tcBorders>
+            <w:tcMar>
+              <w:top w:type="dxa" w:w="60"/>
+              <w:left w:type="dxa" w:w="100"/>
+              <w:bottom w:type="dxa" w:w="60"/>
+              <w:right w:type="dxa" w:w="100"/>
+            </w:tcMar>
+            <w:vAlign w:val="center"/>
+          </w:tcPr>
+          <w:p>
+            <w:pPr>
+              <w:spacing w:after="30" w:before="30"/>
+              <w:jc w:val="left"/>
+            </w:pPr>
+            <w:r>
+              <w:rPr>
+                <w:rFonts w:ascii="Calibri" w:cs="Calibri" w:eastAsia="Calibri" w:hAnsi="Calibri"/>
+                <w:sz w:val="18"/>
+                <w:szCs w:val="18"/>
+              </w:rPr>
+              <w:t xml:space="preserve">CA / SE</w:t>
+            </w:r>
+          </w:p>
+        </w:tc>
+        <w:tc>
+          <w:tcPr>
+            <w:tcW w:type="dxa" w:w="7041"/>
+            <w:tcBorders>
+              <w:top w:val="single" w:color="BFC9D6" w:sz="4"/>
+              <w:left w:val="single" w:color="BFC9D6" w:sz="4"/>
+              <w:bottom w:val="single" w:color="BFC9D6" w:sz="4"/>
+              <w:right w:val="single" w:color="BFC9D6" w:sz="4"/>
+            </w:tcBorders>
+            <w:tcMar>
+              <w:top w:type="dxa" w:w="60"/>
+              <w:left w:type="dxa" w:w="100"/>
+              <w:bottom w:type="dxa" w:w="60"/>
+              <w:right w:type="dxa" w:w="100"/>
+            </w:tcMar>
+            <w:vAlign w:val="center"/>
+          </w:tcPr>
+          <w:p>
+            <w:pPr>
+              <w:spacing w:after="30" w:before="30"/>
+              <w:jc w:val="left"/>
+            </w:pPr>
+            <w:r>
+              <w:rPr>
+                <w:rFonts w:ascii="Calibri" w:cs="Calibri" w:eastAsia="Calibri" w:hAnsi="Calibri"/>
+                <w:sz w:val="18"/>
+                <w:szCs w:val="18"/>
+              </w:rPr>
+              <w:t xml:space="preserve">Continuous assessment (coursework, tests, practicals) / semester examination.</w:t>
+            </w:r>
+          </w:p>
+        </w:tc>
+      </w:tr>
+      <w:tr>
+        <w:trPr>
+          <w:cantSplit/>
+        </w:trPr>
+        <w:tc>
+          <w:tcPr>
+            <w:tcW w:type="dxa" w:w="1985"/>
+            <w:tcBorders>
+              <w:top w:val="single" w:color="BFC9D6" w:sz="4"/>
+              <w:left w:val="single" w:color="BFC9D6" w:sz="4"/>
+              <w:bottom w:val="single" w:color="BFC9D6" w:sz="4"/>
+              <w:right w:val="single" w:color="BFC9D6" w:sz="4"/>
+            </w:tcBorders>
+            <w:tcMar>
+              <w:top w:type="dxa" w:w="60"/>
+              <w:left w:type="dxa" w:w="100"/>
+              <w:bottom w:type="dxa" w:w="60"/>
+              <w:right w:type="dxa" w:w="100"/>
+            </w:tcMar>
+            <w:vAlign w:val="center"/>
+          </w:tcPr>
+          <w:p>
+            <w:pPr>
+              <w:spacing w:after="30" w:before="30"/>
+              <w:jc w:val="left"/>
+            </w:pPr>
+            <w:r>
+              <w:rPr>
+                <w:rFonts w:ascii="Calibri" w:cs="Calibri" w:eastAsia="Calibri" w:hAnsi="Calibri"/>
+                <w:sz w:val="18"/>
+                <w:szCs w:val="18"/>
+              </w:rPr>
+              <w:t xml:space="preserve">CGPA</w:t>
+            </w:r>
+          </w:p>
+        </w:tc>
+        <w:tc>
+          <w:tcPr>
+            <w:tcW w:type="dxa" w:w="7041"/>
+            <w:tcBorders>
+              <w:top w:val="single" w:color="BFC9D6" w:sz="4"/>
+              <w:left w:val="single" w:color="BFC9D6" w:sz="4"/>
+              <w:bottom w:val="single" w:color="BFC9D6" w:sz="4"/>
+              <w:right w:val="single" w:color="BFC9D6" w:sz="4"/>
+            </w:tcBorders>
+            <w:tcMar>
+              <w:top w:type="dxa" w:w="60"/>
+              <w:left w:type="dxa" w:w="100"/>
+              <w:bottom w:type="dxa" w:w="60"/>
+              <w:right w:type="dxa" w:w="100"/>
+            </w:tcMar>
+            <w:vAlign w:val="center"/>
+          </w:tcPr>
+          <w:p>
+            <w:pPr>
+              <w:spacing w:after="30" w:before="30"/>
+              <w:jc w:val="left"/>
+            </w:pPr>
+            <w:r>
+              <w:rPr>
+                <w:rFonts w:ascii="Calibri" w:cs="Calibri" w:eastAsia="Calibri" w:hAnsi="Calibri"/>
+                <w:sz w:val="18"/>
+                <w:szCs w:val="18"/>
+              </w:rPr>
+              <w:t xml:space="preserve">Cumulative grade point average over all semesters of a programme.</w:t>
+            </w:r>
+          </w:p>
+        </w:tc>
+      </w:tr>
+      <w:tr>
+        <w:trPr>
+          <w:cantSplit/>
+        </w:trPr>
+        <w:tc>
+          <w:tcPr>
+            <w:tcW w:type="dxa" w:w="1985"/>
+            <w:tcBorders>
+              <w:top w:val="single" w:color="BFC9D6" w:sz="4"/>
+              <w:left w:val="single" w:color="BFC9D6" w:sz="4"/>
+              <w:bottom w:val="single" w:color="BFC9D6" w:sz="4"/>
+              <w:right w:val="single" w:color="BFC9D6" w:sz="4"/>
+            </w:tcBorders>
+            <w:tcMar>
+              <w:top w:type="dxa" w:w="60"/>
+              <w:left w:type="dxa" w:w="100"/>
+              <w:bottom w:type="dxa" w:w="60"/>
+              <w:right w:type="dxa" w:w="100"/>
+            </w:tcMar>
+            <w:vAlign w:val="center"/>
+          </w:tcPr>
+          <w:p>
+            <w:pPr>
+              <w:spacing w:after="30" w:before="30"/>
+              <w:jc w:val="left"/>
+            </w:pPr>
+            <w:r>
+              <w:rPr>
+                <w:rFonts w:ascii="Calibri" w:cs="Calibri" w:eastAsia="Calibri" w:hAnsi="Calibri"/>
+                <w:sz w:val="18"/>
+                <w:szCs w:val="18"/>
+              </w:rPr>
+              <w:t xml:space="preserve">CIMS</w:t>
+            </w:r>
+          </w:p>
+        </w:tc>
+        <w:tc>
+          <w:tcPr>
+            <w:tcW w:type="dxa" w:w="7041"/>
+            <w:tcBorders>
+              <w:top w:val="single" w:color="BFC9D6" w:sz="4"/>
+              <w:left w:val="single" w:color="BFC9D6" w:sz="4"/>
+              <w:bottom w:val="single" w:color="BFC9D6" w:sz="4"/>
+              <w:right w:val="single" w:color="BFC9D6" w:sz="4"/>
+            </w:tcBorders>
+            <w:tcMar>
+              <w:top w:type="dxa" w:w="60"/>
+              <w:left w:type="dxa" w:w="100"/>
+              <w:bottom w:type="dxa" w:w="60"/>
+              <w:right w:type="dxa" w:w="100"/>
+            </w:tcMar>
+            <w:vAlign w:val="center"/>
+          </w:tcPr>
+          <w:p>
+            <w:pPr>
+              <w:spacing w:after="30" w:before="30"/>
+              <w:jc w:val="left"/>
+            </w:pPr>
+            <w:r>
+              <w:rPr>
+                <w:rFonts w:ascii="Calibri" w:cs="Calibri" w:eastAsia="Calibri" w:hAnsi="Calibri"/>
+                <w:sz w:val="18"/>
+                <w:szCs w:val="18"/>
+              </w:rPr>
+              <w:t xml:space="preserve">College/Institution Management System, the system these documents describe.</w:t>
+            </w:r>
+          </w:p>
+        </w:tc>
+      </w:tr>
+      <w:tr>
+        <w:trPr>
+          <w:cantSplit/>
+        </w:trPr>
+        <w:tc>
+          <w:tcPr>
+            <w:tcW w:type="dxa" w:w="1985"/>
+            <w:tcBorders>
+              <w:top w:val="single" w:color="BFC9D6" w:sz="4"/>
+              <w:left w:val="single" w:color="BFC9D6" w:sz="4"/>
+              <w:bottom w:val="single" w:color="BFC9D6" w:sz="4"/>
+              <w:right w:val="single" w:color="BFC9D6" w:sz="4"/>
+            </w:tcBorders>
+            <w:tcMar>
+              <w:top w:type="dxa" w:w="60"/>
+              <w:left w:type="dxa" w:w="100"/>
+              <w:bottom w:type="dxa" w:w="60"/>
+              <w:right w:type="dxa" w:w="100"/>
+            </w:tcMar>
+            <w:vAlign w:val="center"/>
+          </w:tcPr>
+          <w:p>
+            <w:pPr>
+              <w:spacing w:after="30" w:before="30"/>
+              <w:jc w:val="left"/>
+            </w:pPr>
+            <w:r>
+              <w:rPr>
+                <w:rFonts w:ascii="Calibri" w:cs="Calibri" w:eastAsia="Calibri" w:hAnsi="Calibri"/>
+                <w:sz w:val="18"/>
+                <w:szCs w:val="18"/>
+              </w:rPr>
+              <w:t xml:space="preserve">Clearance gate</w:t>
+            </w:r>
+          </w:p>
+        </w:tc>
+        <w:tc>
+          <w:tcPr>
+            <w:tcW w:type="dxa" w:w="7041"/>
+            <w:tcBorders>
+              <w:top w:val="single" w:color="BFC9D6" w:sz="4"/>
+              <w:left w:val="single" w:color="BFC9D6" w:sz="4"/>
+              <w:bottom w:val="single" w:color="BFC9D6" w:sz="4"/>
+              <w:right w:val="single" w:color="BFC9D6" w:sz="4"/>
+            </w:tcBorders>
+            <w:tcMar>
+              <w:top w:type="dxa" w:w="60"/>
+              <w:left w:type="dxa" w:w="100"/>
+              <w:bottom w:type="dxa" w:w="60"/>
+              <w:right w:type="dxa" w:w="100"/>
+            </w:tcMar>
+            <w:vAlign w:val="center"/>
+          </w:tcPr>
+          <w:p>
+            <w:pPr>
+              <w:spacing w:after="30" w:before="30"/>
+              <w:jc w:val="left"/>
+            </w:pPr>
+            <w:r>
+              <w:rPr>
+                <w:rFonts w:ascii="Calibri" w:cs="Calibri" w:eastAsia="Calibri" w:hAnsi="Calibri"/>
+                <w:sz w:val="18"/>
+                <w:szCs w:val="18"/>
+              </w:rPr>
+              <w:t xml:space="preserve">A fees rule that must be met before registration, examinations, results, hostel or graduation.</w:t>
+            </w:r>
+          </w:p>
+        </w:tc>
+      </w:tr>
+      <w:tr>
+        <w:trPr>
+          <w:cantSplit/>
+        </w:trPr>
+        <w:tc>
+          <w:tcPr>
+            <w:tcW w:type="dxa" w:w="1985"/>
+            <w:tcBorders>
+              <w:top w:val="single" w:color="BFC9D6" w:sz="4"/>
+              <w:left w:val="single" w:color="BFC9D6" w:sz="4"/>
+              <w:bottom w:val="single" w:color="BFC9D6" w:sz="4"/>
+              <w:right w:val="single" w:color="BFC9D6" w:sz="4"/>
+            </w:tcBorders>
+            <w:tcMar>
+              <w:top w:type="dxa" w:w="60"/>
+              <w:left w:type="dxa" w:w="100"/>
+              <w:bottom w:type="dxa" w:w="60"/>
+              <w:right w:type="dxa" w:w="100"/>
+            </w:tcMar>
+            <w:vAlign w:val="center"/>
+          </w:tcPr>
+          <w:p>
+            <w:pPr>
+              <w:spacing w:after="30" w:before="30"/>
+              <w:jc w:val="left"/>
+            </w:pPr>
+            <w:r>
+              <w:rPr>
+                <w:rFonts w:ascii="Calibri" w:cs="Calibri" w:eastAsia="Calibri" w:hAnsi="Calibri"/>
+                <w:sz w:val="18"/>
+                <w:szCs w:val="18"/>
+              </w:rPr>
+              <w:t xml:space="preserve">Control number</w:t>
+            </w:r>
+          </w:p>
+        </w:tc>
+        <w:tc>
+          <w:tcPr>
+            <w:tcW w:type="dxa" w:w="7041"/>
+            <w:tcBorders>
+              <w:top w:val="single" w:color="BFC9D6" w:sz="4"/>
+              <w:left w:val="single" w:color="BFC9D6" w:sz="4"/>
+              <w:bottom w:val="single" w:color="BFC9D6" w:sz="4"/>
+              <w:right w:val="single" w:color="BFC9D6" w:sz="4"/>
+            </w:tcBorders>
+            <w:tcMar>
+              <w:top w:type="dxa" w:w="60"/>
+              <w:left w:type="dxa" w:w="100"/>
+              <w:bottom w:type="dxa" w:w="60"/>
+              <w:right w:type="dxa" w:w="100"/>
+            </w:tcMar>
+            <w:vAlign w:val="center"/>
+          </w:tcPr>
+          <w:p>
+            <w:pPr>
+              <w:spacing w:after="30" w:before="30"/>
+              <w:jc w:val="left"/>
+            </w:pPr>
+            <w:r>
+              <w:rPr>
+                <w:rFonts w:ascii="Calibri" w:cs="Calibri" w:eastAsia="Calibri" w:hAnsi="Calibri"/>
+                <w:sz w:val="18"/>
+                <w:szCs w:val="18"/>
+              </w:rPr>
+              <w:t xml:space="preserve">The GePG number used to pay an invoice through a bank or mobile money.</w:t>
+            </w:r>
+          </w:p>
+        </w:tc>
+      </w:tr>
+      <w:tr>
+        <w:trPr>
+          <w:cantSplit/>
+        </w:trPr>
+        <w:tc>
+          <w:tcPr>
+            <w:tcW w:type="dxa" w:w="1985"/>
+            <w:tcBorders>
+              <w:top w:val="single" w:color="BFC9D6" w:sz="4"/>
+              <w:left w:val="single" w:color="BFC9D6" w:sz="4"/>
+              <w:bottom w:val="single" w:color="BFC9D6" w:sz="4"/>
+              <w:right w:val="single" w:color="BFC9D6" w:sz="4"/>
+            </w:tcBorders>
+            <w:tcMar>
+              <w:top w:type="dxa" w:w="60"/>
+              <w:left w:type="dxa" w:w="100"/>
+              <w:bottom w:type="dxa" w:w="60"/>
+              <w:right w:type="dxa" w:w="100"/>
+            </w:tcMar>
+            <w:vAlign w:val="center"/>
+          </w:tcPr>
+          <w:p>
+            <w:pPr>
+              <w:spacing w:after="30" w:before="30"/>
+              <w:jc w:val="left"/>
+            </w:pPr>
+            <w:r>
+              <w:rPr>
+                <w:rFonts w:ascii="Calibri" w:cs="Calibri" w:eastAsia="Calibri" w:hAnsi="Calibri"/>
+                <w:sz w:val="18"/>
+                <w:szCs w:val="18"/>
+              </w:rPr>
+              <w:t xml:space="preserve">CSEE</w:t>
+            </w:r>
+          </w:p>
+        </w:tc>
+        <w:tc>
+          <w:tcPr>
+            <w:tcW w:type="dxa" w:w="7041"/>
+            <w:tcBorders>
+              <w:top w:val="single" w:color="BFC9D6" w:sz="4"/>
+              <w:left w:val="single" w:color="BFC9D6" w:sz="4"/>
+              <w:bottom w:val="single" w:color="BFC9D6" w:sz="4"/>
+              <w:right w:val="single" w:color="BFC9D6" w:sz="4"/>
+            </w:tcBorders>
+            <w:tcMar>
+              <w:top w:type="dxa" w:w="60"/>
+              <w:left w:type="dxa" w:w="100"/>
+              <w:bottom w:type="dxa" w:w="60"/>
+              <w:right w:type="dxa" w:w="100"/>
+            </w:tcMar>
+            <w:vAlign w:val="center"/>
+          </w:tcPr>
+          <w:p>
+            <w:pPr>
+              <w:spacing w:after="30" w:before="30"/>
+              <w:jc w:val="left"/>
+            </w:pPr>
+            <w:r>
+              <w:rPr>
+                <w:rFonts w:ascii="Calibri" w:cs="Calibri" w:eastAsia="Calibri" w:hAnsi="Calibri"/>
+                <w:sz w:val="18"/>
+                <w:szCs w:val="18"/>
+              </w:rPr>
+              <w:t xml:space="preserve">Certificate of Secondary Education Examination (Form Four), results from NECTA.</w:t>
+            </w:r>
+          </w:p>
+        </w:tc>
+      </w:tr>
+      <w:tr>
+        <w:trPr>
+          <w:cantSplit/>
+        </w:trPr>
+        <w:tc>
+          <w:tcPr>
+            <w:tcW w:type="dxa" w:w="1985"/>
+            <w:tcBorders>
+              <w:top w:val="single" w:color="BFC9D6" w:sz="4"/>
+              <w:left w:val="single" w:color="BFC9D6" w:sz="4"/>
+              <w:bottom w:val="single" w:color="BFC9D6" w:sz="4"/>
+              <w:right w:val="single" w:color="BFC9D6" w:sz="4"/>
+            </w:tcBorders>
+            <w:tcMar>
+              <w:top w:type="dxa" w:w="60"/>
+              <w:left w:type="dxa" w:w="100"/>
+              <w:bottom w:type="dxa" w:w="60"/>
+              <w:right w:type="dxa" w:w="100"/>
+            </w:tcMar>
+            <w:vAlign w:val="center"/>
+          </w:tcPr>
+          <w:p>
+            <w:pPr>
+              <w:spacing w:after="30" w:before="30"/>
+              <w:jc w:val="left"/>
+            </w:pPr>
+            <w:r>
+              <w:rPr>
+                <w:rFonts w:ascii="Calibri" w:cs="Calibri" w:eastAsia="Calibri" w:hAnsi="Calibri"/>
+                <w:sz w:val="18"/>
+                <w:szCs w:val="18"/>
+              </w:rPr>
+              <w:t xml:space="preserve">CSV</w:t>
+            </w:r>
+          </w:p>
+        </w:tc>
+        <w:tc>
+          <w:tcPr>
+            <w:tcW w:type="dxa" w:w="7041"/>
+            <w:tcBorders>
+              <w:top w:val="single" w:color="BFC9D6" w:sz="4"/>
+              <w:left w:val="single" w:color="BFC9D6" w:sz="4"/>
+              <w:bottom w:val="single" w:color="BFC9D6" w:sz="4"/>
+              <w:right w:val="single" w:color="BFC9D6" w:sz="4"/>
+            </w:tcBorders>
+            <w:tcMar>
+              <w:top w:type="dxa" w:w="60"/>
+              <w:left w:type="dxa" w:w="100"/>
+              <w:bottom w:type="dxa" w:w="60"/>
+              <w:right w:type="dxa" w:w="100"/>
+            </w:tcMar>
+            <w:vAlign w:val="center"/>
+          </w:tcPr>
+          <w:p>
+            <w:pPr>
+              <w:spacing w:after="30" w:before="30"/>
+              <w:jc w:val="left"/>
+            </w:pPr>
+            <w:r>
+              <w:rPr>
+                <w:rFonts w:ascii="Calibri" w:cs="Calibri" w:eastAsia="Calibri" w:hAnsi="Calibri"/>
+                <w:sz w:val="18"/>
+                <w:szCs w:val="18"/>
+              </w:rPr>
+              <w:t xml:space="preserve">Comma-separated values: a plain spreadsheet file that most systems can import and export.</w:t>
+            </w:r>
+          </w:p>
+        </w:tc>
+      </w:tr>
+      <w:tr>
+        <w:trPr>
+          <w:cantSplit/>
+        </w:trPr>
+        <w:tc>
+          <w:tcPr>
+            <w:tcW w:type="dxa" w:w="1985"/>
+            <w:tcBorders>
+              <w:top w:val="single" w:color="BFC9D6" w:sz="4"/>
+              <w:left w:val="single" w:color="BFC9D6" w:sz="4"/>
+              <w:bottom w:val="single" w:color="BFC9D6" w:sz="4"/>
+              <w:right w:val="single" w:color="BFC9D6" w:sz="4"/>
+            </w:tcBorders>
+            <w:tcMar>
+              <w:top w:type="dxa" w:w="60"/>
+              <w:left w:type="dxa" w:w="100"/>
+              <w:bottom w:type="dxa" w:w="60"/>
+              <w:right w:type="dxa" w:w="100"/>
+            </w:tcMar>
+            <w:vAlign w:val="center"/>
+          </w:tcPr>
+          <w:p>
+            <w:pPr>
+              <w:spacing w:after="30" w:before="30"/>
+              <w:jc w:val="left"/>
+            </w:pPr>
+            <w:r>
+              <w:rPr>
+                <w:rFonts w:ascii="Calibri" w:cs="Calibri" w:eastAsia="Calibri" w:hAnsi="Calibri"/>
+                <w:sz w:val="18"/>
+                <w:szCs w:val="18"/>
+              </w:rPr>
+              <w:t xml:space="preserve">Docker / Kubernetes</w:t>
+            </w:r>
+          </w:p>
+        </w:tc>
+        <w:tc>
+          <w:tcPr>
+            <w:tcW w:type="dxa" w:w="7041"/>
+            <w:tcBorders>
+              <w:top w:val="single" w:color="BFC9D6" w:sz="4"/>
+              <w:left w:val="single" w:color="BFC9D6" w:sz="4"/>
+              <w:bottom w:val="single" w:color="BFC9D6" w:sz="4"/>
+              <w:right w:val="single" w:color="BFC9D6" w:sz="4"/>
+            </w:tcBorders>
+            <w:tcMar>
+              <w:top w:type="dxa" w:w="60"/>
+              <w:left w:type="dxa" w:w="100"/>
+              <w:bottom w:type="dxa" w:w="60"/>
+              <w:right w:type="dxa" w:w="100"/>
+            </w:tcMar>
+            <w:vAlign w:val="center"/>
+          </w:tcPr>
+          <w:p>
+            <w:pPr>
+              <w:spacing w:after="30" w:before="30"/>
+              <w:jc w:val="left"/>
+            </w:pPr>
+            <w:r>
+              <w:rPr>
+                <w:rFonts w:ascii="Calibri" w:cs="Calibri" w:eastAsia="Calibri" w:hAnsi="Calibri"/>
+                <w:sz w:val="18"/>
+                <w:szCs w:val="18"/>
+              </w:rPr>
+              <w:t xml:space="preserve">Software that packages and runs CIMS and its parts on servers (Docker), and runs them across many servers (Kubernetes).</w:t>
+            </w:r>
+          </w:p>
+        </w:tc>
+      </w:tr>
+      <w:tr>
+        <w:trPr>
+          <w:cantSplit/>
+        </w:trPr>
+        <w:tc>
+          <w:tcPr>
+            <w:tcW w:type="dxa" w:w="1985"/>
+            <w:tcBorders>
+              <w:top w:val="single" w:color="BFC9D6" w:sz="4"/>
+              <w:left w:val="single" w:color="BFC9D6" w:sz="4"/>
+              <w:bottom w:val="single" w:color="BFC9D6" w:sz="4"/>
+              <w:right w:val="single" w:color="BFC9D6" w:sz="4"/>
+            </w:tcBorders>
+            <w:tcMar>
+              <w:top w:type="dxa" w:w="60"/>
+              <w:left w:type="dxa" w:w="100"/>
+              <w:bottom w:type="dxa" w:w="60"/>
+              <w:right w:type="dxa" w:w="100"/>
+            </w:tcMar>
+            <w:vAlign w:val="center"/>
+          </w:tcPr>
+          <w:p>
+            <w:pPr>
+              <w:spacing w:after="30" w:before="30"/>
+              <w:jc w:val="left"/>
+            </w:pPr>
+            <w:r>
+              <w:rPr>
+                <w:rFonts w:ascii="Calibri" w:cs="Calibri" w:eastAsia="Calibri" w:hAnsi="Calibri"/>
+                <w:sz w:val="18"/>
+                <w:szCs w:val="18"/>
+              </w:rPr>
+              <w:t xml:space="preserve">Entry level</w:t>
+            </w:r>
+          </w:p>
+        </w:tc>
+        <w:tc>
+          <w:tcPr>
+            <w:tcW w:type="dxa" w:w="7041"/>
+            <w:tcBorders>
+              <w:top w:val="single" w:color="BFC9D6" w:sz="4"/>
+              <w:left w:val="single" w:color="BFC9D6" w:sz="4"/>
+              <w:bottom w:val="single" w:color="BFC9D6" w:sz="4"/>
+              <w:right w:val="single" w:color="BFC9D6" w:sz="4"/>
+            </w:tcBorders>
+            <w:tcMar>
+              <w:top w:type="dxa" w:w="60"/>
+              <w:left w:type="dxa" w:w="100"/>
+              <w:bottom w:type="dxa" w:w="60"/>
+              <w:right w:type="dxa" w:w="100"/>
+            </w:tcMar>
+            <w:vAlign w:val="center"/>
+          </w:tcPr>
+          <w:p>
+            <w:pPr>
+              <w:spacing w:after="30" w:before="30"/>
+              <w:jc w:val="left"/>
+            </w:pPr>
+            <w:r>
+              <w:rPr>
+                <w:rFonts w:ascii="Calibri" w:cs="Calibri" w:eastAsia="Calibri" w:hAnsi="Calibri"/>
+                <w:sz w:val="18"/>
+                <w:szCs w:val="18"/>
+              </w:rPr>
+              <w:t xml:space="preserve">The level an applicant may apply at, set by their highest verified qualification (as in NOAS).</w:t>
+            </w:r>
+          </w:p>
+        </w:tc>
+      </w:tr>
+      <w:tr>
+        <w:trPr>
+          <w:cantSplit/>
+        </w:trPr>
+        <w:tc>
+          <w:tcPr>
+            <w:tcW w:type="dxa" w:w="1985"/>
+            <w:tcBorders>
+              <w:top w:val="single" w:color="BFC9D6" w:sz="4"/>
+              <w:left w:val="single" w:color="BFC9D6" w:sz="4"/>
+              <w:bottom w:val="single" w:color="BFC9D6" w:sz="4"/>
+              <w:right w:val="single" w:color="BFC9D6" w:sz="4"/>
+            </w:tcBorders>
+            <w:tcMar>
+              <w:top w:type="dxa" w:w="60"/>
+              <w:left w:type="dxa" w:w="100"/>
+              <w:bottom w:type="dxa" w:w="60"/>
+              <w:right w:type="dxa" w:w="100"/>
+            </w:tcMar>
+            <w:vAlign w:val="center"/>
+          </w:tcPr>
+          <w:p>
+            <w:pPr>
+              <w:spacing w:after="30" w:before="30"/>
+              <w:jc w:val="left"/>
+            </w:pPr>
+            <w:r>
+              <w:rPr>
+                <w:rFonts w:ascii="Calibri" w:cs="Calibri" w:eastAsia="Calibri" w:hAnsi="Calibri"/>
+                <w:sz w:val="18"/>
+                <w:szCs w:val="18"/>
+              </w:rPr>
+              <w:t xml:space="preserve">ERP</w:t>
+            </w:r>
+          </w:p>
+        </w:tc>
+        <w:tc>
+          <w:tcPr>
+            <w:tcW w:type="dxa" w:w="7041"/>
+            <w:tcBorders>
+              <w:top w:val="single" w:color="BFC9D6" w:sz="4"/>
+              <w:left w:val="single" w:color="BFC9D6" w:sz="4"/>
+              <w:bottom w:val="single" w:color="BFC9D6" w:sz="4"/>
+              <w:right w:val="single" w:color="BFC9D6" w:sz="4"/>
+            </w:tcBorders>
+            <w:tcMar>
+              <w:top w:type="dxa" w:w="60"/>
+              <w:left w:type="dxa" w:w="100"/>
+              <w:bottom w:type="dxa" w:w="60"/>
+              <w:right w:type="dxa" w:w="100"/>
+            </w:tcMar>
+            <w:vAlign w:val="center"/>
+          </w:tcPr>
+          <w:p>
+            <w:pPr>
+              <w:spacing w:after="30" w:before="30"/>
+              <w:jc w:val="left"/>
+            </w:pPr>
+            <w:r>
+              <w:rPr>
+                <w:rFonts w:ascii="Calibri" w:cs="Calibri" w:eastAsia="Calibri" w:hAnsi="Calibri"/>
+                <w:sz w:val="18"/>
+                <w:szCs w:val="18"/>
+              </w:rPr>
+              <w:t xml:space="preserve">Enterprise resource planning system, for example the government MUSE financial system.</w:t>
+            </w:r>
+          </w:p>
+        </w:tc>
+      </w:tr>
+      <w:tr>
+        <w:trPr>
+          <w:cantSplit/>
+        </w:trPr>
+        <w:tc>
+          <w:tcPr>
+            <w:tcW w:type="dxa" w:w="1985"/>
+            <w:tcBorders>
+              <w:top w:val="single" w:color="BFC9D6" w:sz="4"/>
+              <w:left w:val="single" w:color="BFC9D6" w:sz="4"/>
+              <w:bottom w:val="single" w:color="BFC9D6" w:sz="4"/>
+              <w:right w:val="single" w:color="BFC9D6" w:sz="4"/>
+            </w:tcBorders>
+            <w:tcMar>
+              <w:top w:type="dxa" w:w="60"/>
+              <w:left w:type="dxa" w:w="100"/>
+              <w:bottom w:type="dxa" w:w="60"/>
+              <w:right w:type="dxa" w:w="100"/>
+            </w:tcMar>
+            <w:vAlign w:val="center"/>
+          </w:tcPr>
+          <w:p>
+            <w:pPr>
+              <w:spacing w:after="30" w:before="30"/>
+              <w:jc w:val="left"/>
+            </w:pPr>
+            <w:r>
+              <w:rPr>
+                <w:rFonts w:ascii="Calibri" w:cs="Calibri" w:eastAsia="Calibri" w:hAnsi="Calibri"/>
+                <w:sz w:val="18"/>
+                <w:szCs w:val="18"/>
+              </w:rPr>
+              <w:t xml:space="preserve">Flyway</w:t>
+            </w:r>
+          </w:p>
+        </w:tc>
+        <w:tc>
+          <w:tcPr>
+            <w:tcW w:type="dxa" w:w="7041"/>
+            <w:tcBorders>
+              <w:top w:val="single" w:color="BFC9D6" w:sz="4"/>
+              <w:left w:val="single" w:color="BFC9D6" w:sz="4"/>
+              <w:bottom w:val="single" w:color="BFC9D6" w:sz="4"/>
+              <w:right w:val="single" w:color="BFC9D6" w:sz="4"/>
+            </w:tcBorders>
+            <w:tcMar>
+              <w:top w:type="dxa" w:w="60"/>
+              <w:left w:type="dxa" w:w="100"/>
+              <w:bottom w:type="dxa" w:w="60"/>
+              <w:right w:type="dxa" w:w="100"/>
+            </w:tcMar>
+            <w:vAlign w:val="center"/>
+          </w:tcPr>
+          <w:p>
+            <w:pPr>
+              <w:spacing w:after="30" w:before="30"/>
+              <w:jc w:val="left"/>
+            </w:pPr>
+            <w:r>
+              <w:rPr>
+                <w:rFonts w:ascii="Calibri" w:cs="Calibri" w:eastAsia="Calibri" w:hAnsi="Calibri"/>
+                <w:sz w:val="18"/>
+                <w:szCs w:val="18"/>
+              </w:rPr>
+              <w:t xml:space="preserve">The tool that applies database migrations in order when CIMS starts.</w:t>
+            </w:r>
+          </w:p>
+        </w:tc>
+      </w:tr>
+      <w:tr>
+        <w:trPr>
+          <w:cantSplit/>
+        </w:trPr>
+        <w:tc>
+          <w:tcPr>
+            <w:tcW w:type="dxa" w:w="1985"/>
+            <w:tcBorders>
+              <w:top w:val="single" w:color="BFC9D6" w:sz="4"/>
+              <w:left w:val="single" w:color="BFC9D6" w:sz="4"/>
+              <w:bottom w:val="single" w:color="BFC9D6" w:sz="4"/>
+              <w:right w:val="single" w:color="BFC9D6" w:sz="4"/>
+            </w:tcBorders>
+            <w:tcMar>
+              <w:top w:type="dxa" w:w="60"/>
+              <w:left w:type="dxa" w:w="100"/>
+              <w:bottom w:type="dxa" w:w="60"/>
+              <w:right w:type="dxa" w:w="100"/>
+            </w:tcMar>
+            <w:vAlign w:val="center"/>
+          </w:tcPr>
+          <w:p>
+            <w:pPr>
+              <w:spacing w:after="30" w:before="30"/>
+              <w:jc w:val="left"/>
+            </w:pPr>
+            <w:r>
+              <w:rPr>
+                <w:rFonts w:ascii="Calibri" w:cs="Calibri" w:eastAsia="Calibri" w:hAnsi="Calibri"/>
+                <w:sz w:val="18"/>
+                <w:szCs w:val="18"/>
+              </w:rPr>
+              <w:t xml:space="preserve">GePG</w:t>
+            </w:r>
+          </w:p>
+        </w:tc>
+        <w:tc>
+          <w:tcPr>
+            <w:tcW w:type="dxa" w:w="7041"/>
+            <w:tcBorders>
+              <w:top w:val="single" w:color="BFC9D6" w:sz="4"/>
+              <w:left w:val="single" w:color="BFC9D6" w:sz="4"/>
+              <w:bottom w:val="single" w:color="BFC9D6" w:sz="4"/>
+              <w:right w:val="single" w:color="BFC9D6" w:sz="4"/>
+            </w:tcBorders>
+            <w:tcMar>
+              <w:top w:type="dxa" w:w="60"/>
+              <w:left w:type="dxa" w:w="100"/>
+              <w:bottom w:type="dxa" w:w="60"/>
+              <w:right w:type="dxa" w:w="100"/>
+            </w:tcMar>
+            <w:vAlign w:val="center"/>
+          </w:tcPr>
+          <w:p>
+            <w:pPr>
+              <w:spacing w:after="30" w:before="30"/>
+              <w:jc w:val="left"/>
+            </w:pPr>
+            <w:r>
+              <w:rPr>
+                <w:rFonts w:ascii="Calibri" w:cs="Calibri" w:eastAsia="Calibri" w:hAnsi="Calibri"/>
+                <w:sz w:val="18"/>
+                <w:szCs w:val="18"/>
+              </w:rPr>
+              <w:t xml:space="preserve">Government electronic Payment Gateway: issues control numbers and confirms payments for public institutions.</w:t>
+            </w:r>
+          </w:p>
+        </w:tc>
+      </w:tr>
+      <w:tr>
+        <w:trPr>
+          <w:cantSplit/>
+        </w:trPr>
+        <w:tc>
+          <w:tcPr>
+            <w:tcW w:type="dxa" w:w="1985"/>
+            <w:tcBorders>
+              <w:top w:val="single" w:color="BFC9D6" w:sz="4"/>
+              <w:left w:val="single" w:color="BFC9D6" w:sz="4"/>
+              <w:bottom w:val="single" w:color="BFC9D6" w:sz="4"/>
+              <w:right w:val="single" w:color="BFC9D6" w:sz="4"/>
+            </w:tcBorders>
+            <w:tcMar>
+              <w:top w:type="dxa" w:w="60"/>
+              <w:left w:type="dxa" w:w="100"/>
+              <w:bottom w:type="dxa" w:w="60"/>
+              <w:right w:type="dxa" w:w="100"/>
+            </w:tcMar>
+            <w:vAlign w:val="center"/>
+          </w:tcPr>
+          <w:p>
+            <w:pPr>
+              <w:spacing w:after="30" w:before="30"/>
+              <w:jc w:val="left"/>
+            </w:pPr>
+            <w:r>
+              <w:rPr>
+                <w:rFonts w:ascii="Calibri" w:cs="Calibri" w:eastAsia="Calibri" w:hAnsi="Calibri"/>
+                <w:sz w:val="18"/>
+                <w:szCs w:val="18"/>
+              </w:rPr>
+              <w:t xml:space="preserve">GFS code</w:t>
+            </w:r>
+          </w:p>
+        </w:tc>
+        <w:tc>
+          <w:tcPr>
+            <w:tcW w:type="dxa" w:w="7041"/>
+            <w:tcBorders>
+              <w:top w:val="single" w:color="BFC9D6" w:sz="4"/>
+              <w:left w:val="single" w:color="BFC9D6" w:sz="4"/>
+              <w:bottom w:val="single" w:color="BFC9D6" w:sz="4"/>
+              <w:right w:val="single" w:color="BFC9D6" w:sz="4"/>
+            </w:tcBorders>
+            <w:tcMar>
+              <w:top w:type="dxa" w:w="60"/>
+              <w:left w:type="dxa" w:w="100"/>
+              <w:bottom w:type="dxa" w:w="60"/>
+              <w:right w:type="dxa" w:w="100"/>
+            </w:tcMar>
+            <w:vAlign w:val="center"/>
+          </w:tcPr>
+          <w:p>
+            <w:pPr>
+              <w:spacing w:after="30" w:before="30"/>
+              <w:jc w:val="left"/>
+            </w:pPr>
+            <w:r>
+              <w:rPr>
+                <w:rFonts w:ascii="Calibri" w:cs="Calibri" w:eastAsia="Calibri" w:hAnsi="Calibri"/>
+                <w:sz w:val="18"/>
+                <w:szCs w:val="18"/>
+              </w:rPr>
+              <w:t xml:space="preserve">Government Finance Statistics code: the revenue classification of a fee item used by GePG and MUSE.</w:t>
+            </w:r>
+          </w:p>
+        </w:tc>
+      </w:tr>
+      <w:tr>
+        <w:trPr>
+          <w:cantSplit/>
+        </w:trPr>
+        <w:tc>
+          <w:tcPr>
+            <w:tcW w:type="dxa" w:w="1985"/>
+            <w:tcBorders>
+              <w:top w:val="single" w:color="BFC9D6" w:sz="4"/>
+              <w:left w:val="single" w:color="BFC9D6" w:sz="4"/>
+              <w:bottom w:val="single" w:color="BFC9D6" w:sz="4"/>
+              <w:right w:val="single" w:color="BFC9D6" w:sz="4"/>
+            </w:tcBorders>
+            <w:tcMar>
+              <w:top w:type="dxa" w:w="60"/>
+              <w:left w:type="dxa" w:w="100"/>
+              <w:bottom w:type="dxa" w:w="60"/>
+              <w:right w:type="dxa" w:w="100"/>
+            </w:tcMar>
+            <w:vAlign w:val="center"/>
+          </w:tcPr>
+          <w:p>
+            <w:pPr>
+              <w:spacing w:after="30" w:before="30"/>
+              <w:jc w:val="left"/>
+            </w:pPr>
+            <w:r>
+              <w:rPr>
+                <w:rFonts w:ascii="Calibri" w:cs="Calibri" w:eastAsia="Calibri" w:hAnsi="Calibri"/>
+                <w:sz w:val="18"/>
+                <w:szCs w:val="18"/>
+              </w:rPr>
+              <w:t xml:space="preserve">GPA</w:t>
+            </w:r>
+          </w:p>
+        </w:tc>
+        <w:tc>
+          <w:tcPr>
+            <w:tcW w:type="dxa" w:w="7041"/>
+            <w:tcBorders>
+              <w:top w:val="single" w:color="BFC9D6" w:sz="4"/>
+              <w:left w:val="single" w:color="BFC9D6" w:sz="4"/>
+              <w:bottom w:val="single" w:color="BFC9D6" w:sz="4"/>
+              <w:right w:val="single" w:color="BFC9D6" w:sz="4"/>
+            </w:tcBorders>
+            <w:tcMar>
+              <w:top w:type="dxa" w:w="60"/>
+              <w:left w:type="dxa" w:w="100"/>
+              <w:bottom w:type="dxa" w:w="60"/>
+              <w:right w:type="dxa" w:w="100"/>
+            </w:tcMar>
+            <w:vAlign w:val="center"/>
+          </w:tcPr>
+          <w:p>
+            <w:pPr>
+              <w:spacing w:after="30" w:before="30"/>
+              <w:jc w:val="left"/>
+            </w:pPr>
+            <w:r>
+              <w:rPr>
+                <w:rFonts w:ascii="Calibri" w:cs="Calibri" w:eastAsia="Calibri" w:hAnsi="Calibri"/>
+                <w:sz w:val="18"/>
+                <w:szCs w:val="18"/>
+              </w:rPr>
+              <w:t xml:space="preserve">Grade point average for a semester or year, computed under the regulations of the award level.</w:t>
+            </w:r>
+          </w:p>
+        </w:tc>
+      </w:tr>
+      <w:tr>
+        <w:trPr>
+          <w:cantSplit/>
+        </w:trPr>
+        <w:tc>
+          <w:tcPr>
+            <w:tcW w:type="dxa" w:w="1985"/>
+            <w:tcBorders>
+              <w:top w:val="single" w:color="BFC9D6" w:sz="4"/>
+              <w:left w:val="single" w:color="BFC9D6" w:sz="4"/>
+              <w:bottom w:val="single" w:color="BFC9D6" w:sz="4"/>
+              <w:right w:val="single" w:color="BFC9D6" w:sz="4"/>
+            </w:tcBorders>
+            <w:tcMar>
+              <w:top w:type="dxa" w:w="60"/>
+              <w:left w:type="dxa" w:w="100"/>
+              <w:bottom w:type="dxa" w:w="60"/>
+              <w:right w:type="dxa" w:w="100"/>
+            </w:tcMar>
+            <w:vAlign w:val="center"/>
+          </w:tcPr>
+          <w:p>
+            <w:pPr>
+              <w:spacing w:after="30" w:before="30"/>
+              <w:jc w:val="left"/>
+            </w:pPr>
+            <w:r>
+              <w:rPr>
+                <w:rFonts w:ascii="Calibri" w:cs="Calibri" w:eastAsia="Calibri" w:hAnsi="Calibri"/>
+                <w:sz w:val="18"/>
+                <w:szCs w:val="18"/>
+              </w:rPr>
+              <w:t xml:space="preserve">Hand-over</w:t>
+            </w:r>
+          </w:p>
+        </w:tc>
+        <w:tc>
+          <w:tcPr>
+            <w:tcW w:type="dxa" w:w="7041"/>
+            <w:tcBorders>
+              <w:top w:val="single" w:color="BFC9D6" w:sz="4"/>
+              <w:left w:val="single" w:color="BFC9D6" w:sz="4"/>
+              <w:bottom w:val="single" w:color="BFC9D6" w:sz="4"/>
+              <w:right w:val="single" w:color="BFC9D6" w:sz="4"/>
+            </w:tcBorders>
+            <w:tcMar>
+              <w:top w:type="dxa" w:w="60"/>
+              <w:left w:type="dxa" w:w="100"/>
+              <w:bottom w:type="dxa" w:w="60"/>
+              <w:right w:type="dxa" w:w="100"/>
+            </w:tcMar>
+            <w:vAlign w:val="center"/>
+          </w:tcPr>
+          <w:p>
+            <w:pPr>
+              <w:spacing w:after="30" w:before="30"/>
+              <w:jc w:val="left"/>
+            </w:pPr>
+            <w:r>
+              <w:rPr>
+                <w:rFonts w:ascii="Calibri" w:cs="Calibri" w:eastAsia="Calibri" w:hAnsi="Calibri"/>
+                <w:sz w:val="18"/>
+                <w:szCs w:val="18"/>
+              </w:rPr>
+              <w:t xml:space="preserve">Registry turning an accepted applicant into a student: record, registration number and portal sign-in.</w:t>
+            </w:r>
+          </w:p>
+        </w:tc>
+      </w:tr>
+      <w:tr>
+        <w:trPr>
+          <w:cantSplit/>
+        </w:trPr>
+        <w:tc>
+          <w:tcPr>
+            <w:tcW w:type="dxa" w:w="1985"/>
+            <w:tcBorders>
+              <w:top w:val="single" w:color="BFC9D6" w:sz="4"/>
+              <w:left w:val="single" w:color="BFC9D6" w:sz="4"/>
+              <w:bottom w:val="single" w:color="BFC9D6" w:sz="4"/>
+              <w:right w:val="single" w:color="BFC9D6" w:sz="4"/>
+            </w:tcBorders>
+            <w:tcMar>
+              <w:top w:type="dxa" w:w="60"/>
+              <w:left w:type="dxa" w:w="100"/>
+              <w:bottom w:type="dxa" w:w="60"/>
+              <w:right w:type="dxa" w:w="100"/>
+            </w:tcMar>
+            <w:vAlign w:val="center"/>
+          </w:tcPr>
+          <w:p>
+            <w:pPr>
+              <w:spacing w:after="30" w:before="30"/>
+              <w:jc w:val="left"/>
+            </w:pPr>
+            <w:r>
+              <w:rPr>
+                <w:rFonts w:ascii="Calibri" w:cs="Calibri" w:eastAsia="Calibri" w:hAnsi="Calibri"/>
+                <w:sz w:val="18"/>
+                <w:szCs w:val="18"/>
+              </w:rPr>
+              <w:t xml:space="preserve">HESLB</w:t>
+            </w:r>
+          </w:p>
+        </w:tc>
+        <w:tc>
+          <w:tcPr>
+            <w:tcW w:type="dxa" w:w="7041"/>
+            <w:tcBorders>
+              <w:top w:val="single" w:color="BFC9D6" w:sz="4"/>
+              <w:left w:val="single" w:color="BFC9D6" w:sz="4"/>
+              <w:bottom w:val="single" w:color="BFC9D6" w:sz="4"/>
+              <w:right w:val="single" w:color="BFC9D6" w:sz="4"/>
+            </w:tcBorders>
+            <w:tcMar>
+              <w:top w:type="dxa" w:w="60"/>
+              <w:left w:type="dxa" w:w="100"/>
+              <w:bottom w:type="dxa" w:w="60"/>
+              <w:right w:type="dxa" w:w="100"/>
+            </w:tcMar>
+            <w:vAlign w:val="center"/>
+          </w:tcPr>
+          <w:p>
+            <w:pPr>
+              <w:spacing w:after="30" w:before="30"/>
+              <w:jc w:val="left"/>
+            </w:pPr>
+            <w:r>
+              <w:rPr>
+                <w:rFonts w:ascii="Calibri" w:cs="Calibri" w:eastAsia="Calibri" w:hAnsi="Calibri"/>
+                <w:sz w:val="18"/>
+                <w:szCs w:val="18"/>
+              </w:rPr>
+              <w:t xml:space="preserve">Higher Education Students' Loans Board: funds eligible students in eligible programmes.</w:t>
+            </w:r>
+          </w:p>
+        </w:tc>
+      </w:tr>
+      <w:tr>
+        <w:trPr>
+          <w:cantSplit/>
+        </w:trPr>
+        <w:tc>
+          <w:tcPr>
+            <w:tcW w:type="dxa" w:w="1985"/>
+            <w:tcBorders>
+              <w:top w:val="single" w:color="BFC9D6" w:sz="4"/>
+              <w:left w:val="single" w:color="BFC9D6" w:sz="4"/>
+              <w:bottom w:val="single" w:color="BFC9D6" w:sz="4"/>
+              <w:right w:val="single" w:color="BFC9D6" w:sz="4"/>
+            </w:tcBorders>
+            <w:tcMar>
+              <w:top w:type="dxa" w:w="60"/>
+              <w:left w:type="dxa" w:w="100"/>
+              <w:bottom w:type="dxa" w:w="60"/>
+              <w:right w:type="dxa" w:w="100"/>
+            </w:tcMar>
+            <w:vAlign w:val="center"/>
+          </w:tcPr>
+          <w:p>
+            <w:pPr>
+              <w:spacing w:after="30" w:before="30"/>
+              <w:jc w:val="left"/>
+            </w:pPr>
+            <w:r>
+              <w:rPr>
+                <w:rFonts w:ascii="Calibri" w:cs="Calibri" w:eastAsia="Calibri" w:hAnsi="Calibri"/>
+                <w:sz w:val="18"/>
+                <w:szCs w:val="18"/>
+              </w:rPr>
+              <w:t xml:space="preserve">ICT</w:t>
+            </w:r>
+          </w:p>
+        </w:tc>
+        <w:tc>
+          <w:tcPr>
+            <w:tcW w:type="dxa" w:w="7041"/>
+            <w:tcBorders>
+              <w:top w:val="single" w:color="BFC9D6" w:sz="4"/>
+              <w:left w:val="single" w:color="BFC9D6" w:sz="4"/>
+              <w:bottom w:val="single" w:color="BFC9D6" w:sz="4"/>
+              <w:right w:val="single" w:color="BFC9D6" w:sz="4"/>
+            </w:tcBorders>
+            <w:tcMar>
+              <w:top w:type="dxa" w:w="60"/>
+              <w:left w:type="dxa" w:w="100"/>
+              <w:bottom w:type="dxa" w:w="60"/>
+              <w:right w:type="dxa" w:w="100"/>
+            </w:tcMar>
+            <w:vAlign w:val="center"/>
+          </w:tcPr>
+          <w:p>
+            <w:pPr>
+              <w:spacing w:after="30" w:before="30"/>
+              <w:jc w:val="left"/>
+            </w:pPr>
+            <w:r>
+              <w:rPr>
+                <w:rFonts w:ascii="Calibri" w:cs="Calibri" w:eastAsia="Calibri" w:hAnsi="Calibri"/>
+                <w:sz w:val="18"/>
+                <w:szCs w:val="18"/>
+              </w:rPr>
+              <w:t xml:space="preserve">Information and communication technology.</w:t>
+            </w:r>
+          </w:p>
+        </w:tc>
+      </w:tr>
+      <w:tr>
+        <w:trPr>
+          <w:cantSplit/>
+        </w:trPr>
+        <w:tc>
+          <w:tcPr>
+            <w:tcW w:type="dxa" w:w="1985"/>
+            <w:tcBorders>
+              <w:top w:val="single" w:color="BFC9D6" w:sz="4"/>
+              <w:left w:val="single" w:color="BFC9D6" w:sz="4"/>
+              <w:bottom w:val="single" w:color="BFC9D6" w:sz="4"/>
+              <w:right w:val="single" w:color="BFC9D6" w:sz="4"/>
+            </w:tcBorders>
+            <w:tcMar>
+              <w:top w:type="dxa" w:w="60"/>
+              <w:left w:type="dxa" w:w="100"/>
+              <w:bottom w:type="dxa" w:w="60"/>
+              <w:right w:type="dxa" w:w="100"/>
+            </w:tcMar>
+            <w:vAlign w:val="center"/>
+          </w:tcPr>
+          <w:p>
+            <w:pPr>
+              <w:spacing w:after="30" w:before="30"/>
+              <w:jc w:val="left"/>
+            </w:pPr>
+            <w:r>
+              <w:rPr>
+                <w:rFonts w:ascii="Calibri" w:cs="Calibri" w:eastAsia="Calibri" w:hAnsi="Calibri"/>
+                <w:sz w:val="18"/>
+                <w:szCs w:val="18"/>
+              </w:rPr>
+              <w:t xml:space="preserve">ID card</w:t>
+            </w:r>
+          </w:p>
+        </w:tc>
+        <w:tc>
+          <w:tcPr>
+            <w:tcW w:type="dxa" w:w="7041"/>
+            <w:tcBorders>
+              <w:top w:val="single" w:color="BFC9D6" w:sz="4"/>
+              <w:left w:val="single" w:color="BFC9D6" w:sz="4"/>
+              <w:bottom w:val="single" w:color="BFC9D6" w:sz="4"/>
+              <w:right w:val="single" w:color="BFC9D6" w:sz="4"/>
+            </w:tcBorders>
+            <w:tcMar>
+              <w:top w:type="dxa" w:w="60"/>
+              <w:left w:type="dxa" w:w="100"/>
+              <w:bottom w:type="dxa" w:w="60"/>
+              <w:right w:type="dxa" w:w="100"/>
+            </w:tcMar>
+            <w:vAlign w:val="center"/>
+          </w:tcPr>
+          <w:p>
+            <w:pPr>
+              <w:spacing w:after="30" w:before="30"/>
+              <w:jc w:val="left"/>
+            </w:pPr>
+            <w:r>
+              <w:rPr>
+                <w:rFonts w:ascii="Calibri" w:cs="Calibri" w:eastAsia="Calibri" w:hAnsi="Calibri"/>
+                <w:sz w:val="18"/>
+                <w:szCs w:val="18"/>
+              </w:rPr>
+              <w:t xml:space="preserve">Student identity card, printed from CIMS with a verification code.</w:t>
+            </w:r>
+          </w:p>
+        </w:tc>
+      </w:tr>
+      <w:tr>
+        <w:trPr>
+          <w:cantSplit/>
+        </w:trPr>
+        <w:tc>
+          <w:tcPr>
+            <w:tcW w:type="dxa" w:w="1985"/>
+            <w:tcBorders>
+              <w:top w:val="single" w:color="BFC9D6" w:sz="4"/>
+              <w:left w:val="single" w:color="BFC9D6" w:sz="4"/>
+              <w:bottom w:val="single" w:color="BFC9D6" w:sz="4"/>
+              <w:right w:val="single" w:color="BFC9D6" w:sz="4"/>
+            </w:tcBorders>
+            <w:tcMar>
+              <w:top w:type="dxa" w:w="60"/>
+              <w:left w:type="dxa" w:w="100"/>
+              <w:bottom w:type="dxa" w:w="60"/>
+              <w:right w:type="dxa" w:w="100"/>
+            </w:tcMar>
+            <w:vAlign w:val="center"/>
+          </w:tcPr>
+          <w:p>
+            <w:pPr>
+              <w:spacing w:after="30" w:before="30"/>
+              <w:jc w:val="left"/>
+            </w:pPr>
+            <w:r>
+              <w:rPr>
+                <w:rFonts w:ascii="Calibri" w:cs="Calibri" w:eastAsia="Calibri" w:hAnsi="Calibri"/>
+                <w:sz w:val="18"/>
+                <w:szCs w:val="18"/>
+              </w:rPr>
+              <w:t xml:space="preserve">IPT</w:t>
+            </w:r>
+          </w:p>
+        </w:tc>
+        <w:tc>
+          <w:tcPr>
+            <w:tcW w:type="dxa" w:w="7041"/>
+            <w:tcBorders>
+              <w:top w:val="single" w:color="BFC9D6" w:sz="4"/>
+              <w:left w:val="single" w:color="BFC9D6" w:sz="4"/>
+              <w:bottom w:val="single" w:color="BFC9D6" w:sz="4"/>
+              <w:right w:val="single" w:color="BFC9D6" w:sz="4"/>
+            </w:tcBorders>
+            <w:tcMar>
+              <w:top w:type="dxa" w:w="60"/>
+              <w:left w:type="dxa" w:w="100"/>
+              <w:bottom w:type="dxa" w:w="60"/>
+              <w:right w:type="dxa" w:w="100"/>
+            </w:tcMar>
+            <w:vAlign w:val="center"/>
+          </w:tcPr>
+          <w:p>
+            <w:pPr>
+              <w:spacing w:after="30" w:before="30"/>
+              <w:jc w:val="left"/>
+            </w:pPr>
+            <w:r>
+              <w:rPr>
+                <w:rFonts w:ascii="Calibri" w:cs="Calibri" w:eastAsia="Calibri" w:hAnsi="Calibri"/>
+                <w:sz w:val="18"/>
+                <w:szCs w:val="18"/>
+              </w:rPr>
+              <w:t xml:space="preserve">Industrial practical training: assessed field attachment in a workplace.</w:t>
+            </w:r>
+          </w:p>
+        </w:tc>
+      </w:tr>
+      <w:tr>
+        <w:trPr>
+          <w:cantSplit/>
+        </w:trPr>
+        <w:tc>
+          <w:tcPr>
+            <w:tcW w:type="dxa" w:w="1985"/>
+            <w:tcBorders>
+              <w:top w:val="single" w:color="BFC9D6" w:sz="4"/>
+              <w:left w:val="single" w:color="BFC9D6" w:sz="4"/>
+              <w:bottom w:val="single" w:color="BFC9D6" w:sz="4"/>
+              <w:right w:val="single" w:color="BFC9D6" w:sz="4"/>
+            </w:tcBorders>
+            <w:tcMar>
+              <w:top w:type="dxa" w:w="60"/>
+              <w:left w:type="dxa" w:w="100"/>
+              <w:bottom w:type="dxa" w:w="60"/>
+              <w:right w:type="dxa" w:w="100"/>
+            </w:tcMar>
+            <w:vAlign w:val="center"/>
+          </w:tcPr>
+          <w:p>
+            <w:pPr>
+              <w:spacing w:after="30" w:before="30"/>
+              <w:jc w:val="left"/>
+            </w:pPr>
+            <w:r>
+              <w:rPr>
+                <w:rFonts w:ascii="Calibri" w:cs="Calibri" w:eastAsia="Calibri" w:hAnsi="Calibri"/>
+                <w:sz w:val="18"/>
+                <w:szCs w:val="18"/>
+              </w:rPr>
+              <w:t xml:space="preserve">Keycloak</w:t>
+            </w:r>
+          </w:p>
+        </w:tc>
+        <w:tc>
+          <w:tcPr>
+            <w:tcW w:type="dxa" w:w="7041"/>
+            <w:tcBorders>
+              <w:top w:val="single" w:color="BFC9D6" w:sz="4"/>
+              <w:left w:val="single" w:color="BFC9D6" w:sz="4"/>
+              <w:bottom w:val="single" w:color="BFC9D6" w:sz="4"/>
+              <w:right w:val="single" w:color="BFC9D6" w:sz="4"/>
+            </w:tcBorders>
+            <w:tcMar>
+              <w:top w:type="dxa" w:w="60"/>
+              <w:left w:type="dxa" w:w="100"/>
+              <w:bottom w:type="dxa" w:w="60"/>
+              <w:right w:type="dxa" w:w="100"/>
+            </w:tcMar>
+            <w:vAlign w:val="center"/>
+          </w:tcPr>
+          <w:p>
+            <w:pPr>
+              <w:spacing w:after="30" w:before="30"/>
+              <w:jc w:val="left"/>
+            </w:pPr>
+            <w:r>
+              <w:rPr>
+                <w:rFonts w:ascii="Calibri" w:cs="Calibri" w:eastAsia="Calibri" w:hAnsi="Calibri"/>
+                <w:sz w:val="18"/>
+                <w:szCs w:val="18"/>
+              </w:rPr>
+              <w:t xml:space="preserve">An open-source sign-in server that could provide single sign-on across systems in future.</w:t>
+            </w:r>
+          </w:p>
+        </w:tc>
+      </w:tr>
+      <w:tr>
+        <w:trPr>
+          <w:cantSplit/>
+        </w:trPr>
+        <w:tc>
+          <w:tcPr>
+            <w:tcW w:type="dxa" w:w="1985"/>
+            <w:tcBorders>
+              <w:top w:val="single" w:color="BFC9D6" w:sz="4"/>
+              <w:left w:val="single" w:color="BFC9D6" w:sz="4"/>
+              <w:bottom w:val="single" w:color="BFC9D6" w:sz="4"/>
+              <w:right w:val="single" w:color="BFC9D6" w:sz="4"/>
+            </w:tcBorders>
+            <w:tcMar>
+              <w:top w:type="dxa" w:w="60"/>
+              <w:left w:type="dxa" w:w="100"/>
+              <w:bottom w:type="dxa" w:w="60"/>
+              <w:right w:type="dxa" w:w="100"/>
+            </w:tcMar>
+            <w:vAlign w:val="center"/>
+          </w:tcPr>
+          <w:p>
+            <w:pPr>
+              <w:spacing w:after="30" w:before="30"/>
+              <w:jc w:val="left"/>
+            </w:pPr>
+            <w:r>
+              <w:rPr>
+                <w:rFonts w:ascii="Calibri" w:cs="Calibri" w:eastAsia="Calibri" w:hAnsi="Calibri"/>
+                <w:sz w:val="18"/>
+                <w:szCs w:val="18"/>
+              </w:rPr>
+              <w:t xml:space="preserve">MFA</w:t>
+            </w:r>
+          </w:p>
+        </w:tc>
+        <w:tc>
+          <w:tcPr>
+            <w:tcW w:type="dxa" w:w="7041"/>
+            <w:tcBorders>
+              <w:top w:val="single" w:color="BFC9D6" w:sz="4"/>
+              <w:left w:val="single" w:color="BFC9D6" w:sz="4"/>
+              <w:bottom w:val="single" w:color="BFC9D6" w:sz="4"/>
+              <w:right w:val="single" w:color="BFC9D6" w:sz="4"/>
+            </w:tcBorders>
+            <w:tcMar>
+              <w:top w:type="dxa" w:w="60"/>
+              <w:left w:type="dxa" w:w="100"/>
+              <w:bottom w:type="dxa" w:w="60"/>
+              <w:right w:type="dxa" w:w="100"/>
+            </w:tcMar>
+            <w:vAlign w:val="center"/>
+          </w:tcPr>
+          <w:p>
+            <w:pPr>
+              <w:spacing w:after="30" w:before="30"/>
+              <w:jc w:val="left"/>
+            </w:pPr>
+            <w:r>
+              <w:rPr>
+                <w:rFonts w:ascii="Calibri" w:cs="Calibri" w:eastAsia="Calibri" w:hAnsi="Calibri"/>
+                <w:sz w:val="18"/>
+                <w:szCs w:val="18"/>
+              </w:rPr>
+              <w:t xml:space="preserve">Multi-factor authentication: signing in with a password and a second proof, such as a code from an authenticator app (two-step sign-in).</w:t>
+            </w:r>
+          </w:p>
+        </w:tc>
+      </w:tr>
+      <w:tr>
+        <w:trPr>
+          <w:cantSplit/>
+        </w:trPr>
+        <w:tc>
+          <w:tcPr>
+            <w:tcW w:type="dxa" w:w="1985"/>
+            <w:tcBorders>
+              <w:top w:val="single" w:color="BFC9D6" w:sz="4"/>
+              <w:left w:val="single" w:color="BFC9D6" w:sz="4"/>
+              <w:bottom w:val="single" w:color="BFC9D6" w:sz="4"/>
+              <w:right w:val="single" w:color="BFC9D6" w:sz="4"/>
+            </w:tcBorders>
+            <w:tcMar>
+              <w:top w:type="dxa" w:w="60"/>
+              <w:left w:type="dxa" w:w="100"/>
+              <w:bottom w:type="dxa" w:w="60"/>
+              <w:right w:type="dxa" w:w="100"/>
+            </w:tcMar>
+            <w:vAlign w:val="center"/>
+          </w:tcPr>
+          <w:p>
+            <w:pPr>
+              <w:spacing w:after="30" w:before="30"/>
+              <w:jc w:val="left"/>
+            </w:pPr>
+            <w:r>
+              <w:rPr>
+                <w:rFonts w:ascii="Calibri" w:cs="Calibri" w:eastAsia="Calibri" w:hAnsi="Calibri"/>
+                <w:sz w:val="18"/>
+                <w:szCs w:val="18"/>
+              </w:rPr>
+              <w:t xml:space="preserve">Migration</w:t>
+            </w:r>
+          </w:p>
+        </w:tc>
+        <w:tc>
+          <w:tcPr>
+            <w:tcW w:type="dxa" w:w="7041"/>
+            <w:tcBorders>
+              <w:top w:val="single" w:color="BFC9D6" w:sz="4"/>
+              <w:left w:val="single" w:color="BFC9D6" w:sz="4"/>
+              <w:bottom w:val="single" w:color="BFC9D6" w:sz="4"/>
+              <w:right w:val="single" w:color="BFC9D6" w:sz="4"/>
+            </w:tcBorders>
+            <w:tcMar>
+              <w:top w:type="dxa" w:w="60"/>
+              <w:left w:type="dxa" w:w="100"/>
+              <w:bottom w:type="dxa" w:w="60"/>
+              <w:right w:type="dxa" w:w="100"/>
+            </w:tcMar>
+            <w:vAlign w:val="center"/>
+          </w:tcPr>
+          <w:p>
+            <w:pPr>
+              <w:spacing w:after="30" w:before="30"/>
+              <w:jc w:val="left"/>
+            </w:pPr>
+            <w:r>
+              <w:rPr>
+                <w:rFonts w:ascii="Calibri" w:cs="Calibri" w:eastAsia="Calibri" w:hAnsi="Calibri"/>
+                <w:sz w:val="18"/>
+                <w:szCs w:val="18"/>
+              </w:rPr>
+              <w:t xml:space="preserve">A numbered script that changes the database structure; applied in order by Flyway and never edited once applied.</w:t>
+            </w:r>
+          </w:p>
+        </w:tc>
+      </w:tr>
+      <w:tr>
+        <w:trPr>
+          <w:cantSplit/>
+        </w:trPr>
+        <w:tc>
+          <w:tcPr>
+            <w:tcW w:type="dxa" w:w="1985"/>
+            <w:tcBorders>
+              <w:top w:val="single" w:color="BFC9D6" w:sz="4"/>
+              <w:left w:val="single" w:color="BFC9D6" w:sz="4"/>
+              <w:bottom w:val="single" w:color="BFC9D6" w:sz="4"/>
+              <w:right w:val="single" w:color="BFC9D6" w:sz="4"/>
+            </w:tcBorders>
+            <w:tcMar>
+              <w:top w:type="dxa" w:w="60"/>
+              <w:left w:type="dxa" w:w="100"/>
+              <w:bottom w:type="dxa" w:w="60"/>
+              <w:right w:type="dxa" w:w="100"/>
+            </w:tcMar>
+            <w:vAlign w:val="center"/>
+          </w:tcPr>
+          <w:p>
+            <w:pPr>
+              <w:spacing w:after="30" w:before="30"/>
+              <w:jc w:val="left"/>
+            </w:pPr>
+            <w:r>
+              <w:rPr>
+                <w:rFonts w:ascii="Calibri" w:cs="Calibri" w:eastAsia="Calibri" w:hAnsi="Calibri"/>
+                <w:sz w:val="18"/>
+                <w:szCs w:val="18"/>
+              </w:rPr>
+              <w:t xml:space="preserve">MUSE</w:t>
+            </w:r>
+          </w:p>
+        </w:tc>
+        <w:tc>
+          <w:tcPr>
+            <w:tcW w:type="dxa" w:w="7041"/>
+            <w:tcBorders>
+              <w:top w:val="single" w:color="BFC9D6" w:sz="4"/>
+              <w:left w:val="single" w:color="BFC9D6" w:sz="4"/>
+              <w:bottom w:val="single" w:color="BFC9D6" w:sz="4"/>
+              <w:right w:val="single" w:color="BFC9D6" w:sz="4"/>
+            </w:tcBorders>
+            <w:tcMar>
+              <w:top w:type="dxa" w:w="60"/>
+              <w:left w:type="dxa" w:w="100"/>
+              <w:bottom w:type="dxa" w:w="60"/>
+              <w:right w:type="dxa" w:w="100"/>
+            </w:tcMar>
+            <w:vAlign w:val="center"/>
+          </w:tcPr>
+          <w:p>
+            <w:pPr>
+              <w:spacing w:after="30" w:before="30"/>
+              <w:jc w:val="left"/>
+            </w:pPr>
+            <w:r>
+              <w:rPr>
+                <w:rFonts w:ascii="Calibri" w:cs="Calibri" w:eastAsia="Calibri" w:hAnsi="Calibri"/>
+                <w:sz w:val="18"/>
+                <w:szCs w:val="18"/>
+              </w:rPr>
+              <w:t xml:space="preserve">The government financial management (ERP) system to which public institutions post revenue.</w:t>
+            </w:r>
+          </w:p>
+        </w:tc>
+      </w:tr>
+      <w:tr>
+        <w:trPr>
+          <w:cantSplit/>
+        </w:trPr>
+        <w:tc>
+          <w:tcPr>
+            <w:tcW w:type="dxa" w:w="1985"/>
+            <w:tcBorders>
+              <w:top w:val="single" w:color="BFC9D6" w:sz="4"/>
+              <w:left w:val="single" w:color="BFC9D6" w:sz="4"/>
+              <w:bottom w:val="single" w:color="BFC9D6" w:sz="4"/>
+              <w:right w:val="single" w:color="BFC9D6" w:sz="4"/>
+            </w:tcBorders>
+            <w:tcMar>
+              <w:top w:type="dxa" w:w="60"/>
+              <w:left w:type="dxa" w:w="100"/>
+              <w:bottom w:type="dxa" w:w="60"/>
+              <w:right w:type="dxa" w:w="100"/>
+            </w:tcMar>
+            <w:vAlign w:val="center"/>
+          </w:tcPr>
+          <w:p>
+            <w:pPr>
+              <w:spacing w:after="30" w:before="30"/>
+              <w:jc w:val="left"/>
+            </w:pPr>
+            <w:r>
+              <w:rPr>
+                <w:rFonts w:ascii="Calibri" w:cs="Calibri" w:eastAsia="Calibri" w:hAnsi="Calibri"/>
+                <w:sz w:val="18"/>
+                <w:szCs w:val="18"/>
+              </w:rPr>
+              <w:t xml:space="preserve">NACTVET</w:t>
+            </w:r>
+          </w:p>
+        </w:tc>
+        <w:tc>
+          <w:tcPr>
+            <w:tcW w:type="dxa" w:w="7041"/>
+            <w:tcBorders>
+              <w:top w:val="single" w:color="BFC9D6" w:sz="4"/>
+              <w:left w:val="single" w:color="BFC9D6" w:sz="4"/>
+              <w:bottom w:val="single" w:color="BFC9D6" w:sz="4"/>
+              <w:right w:val="single" w:color="BFC9D6" w:sz="4"/>
+            </w:tcBorders>
+            <w:tcMar>
+              <w:top w:type="dxa" w:w="60"/>
+              <w:left w:type="dxa" w:w="100"/>
+              <w:bottom w:type="dxa" w:w="60"/>
+              <w:right w:type="dxa" w:w="100"/>
+            </w:tcMar>
+            <w:vAlign w:val="center"/>
+          </w:tcPr>
+          <w:p>
+            <w:pPr>
+              <w:spacing w:after="30" w:before="30"/>
+              <w:jc w:val="left"/>
+            </w:pPr>
+            <w:r>
+              <w:rPr>
+                <w:rFonts w:ascii="Calibri" w:cs="Calibri" w:eastAsia="Calibri" w:hAnsi="Calibri"/>
+                <w:sz w:val="18"/>
+                <w:szCs w:val="18"/>
+              </w:rPr>
+              <w:t xml:space="preserve">National Council for Technical and Vocational Education and Training: the regulator of TVET institutions and awards.</w:t>
+            </w:r>
+          </w:p>
+        </w:tc>
+      </w:tr>
+      <w:tr>
+        <w:trPr>
+          <w:cantSplit/>
+        </w:trPr>
+        <w:tc>
+          <w:tcPr>
+            <w:tcW w:type="dxa" w:w="1985"/>
+            <w:tcBorders>
+              <w:top w:val="single" w:color="BFC9D6" w:sz="4"/>
+              <w:left w:val="single" w:color="BFC9D6" w:sz="4"/>
+              <w:bottom w:val="single" w:color="BFC9D6" w:sz="4"/>
+              <w:right w:val="single" w:color="BFC9D6" w:sz="4"/>
+            </w:tcBorders>
+            <w:tcMar>
+              <w:top w:type="dxa" w:w="60"/>
+              <w:left w:type="dxa" w:w="100"/>
+              <w:bottom w:type="dxa" w:w="60"/>
+              <w:right w:type="dxa" w:w="100"/>
+            </w:tcMar>
+            <w:vAlign w:val="center"/>
+          </w:tcPr>
+          <w:p>
+            <w:pPr>
+              <w:spacing w:after="30" w:before="30"/>
+              <w:jc w:val="left"/>
+            </w:pPr>
+            <w:r>
+              <w:rPr>
+                <w:rFonts w:ascii="Calibri" w:cs="Calibri" w:eastAsia="Calibri" w:hAnsi="Calibri"/>
+                <w:sz w:val="18"/>
+                <w:szCs w:val="18"/>
+              </w:rPr>
+              <w:t xml:space="preserve">NECTA</w:t>
+            </w:r>
+          </w:p>
+        </w:tc>
+        <w:tc>
+          <w:tcPr>
+            <w:tcW w:type="dxa" w:w="7041"/>
+            <w:tcBorders>
+              <w:top w:val="single" w:color="BFC9D6" w:sz="4"/>
+              <w:left w:val="single" w:color="BFC9D6" w:sz="4"/>
+              <w:bottom w:val="single" w:color="BFC9D6" w:sz="4"/>
+              <w:right w:val="single" w:color="BFC9D6" w:sz="4"/>
+            </w:tcBorders>
+            <w:tcMar>
+              <w:top w:type="dxa" w:w="60"/>
+              <w:left w:type="dxa" w:w="100"/>
+              <w:bottom w:type="dxa" w:w="60"/>
+              <w:right w:type="dxa" w:w="100"/>
+            </w:tcMar>
+            <w:vAlign w:val="center"/>
+          </w:tcPr>
+          <w:p>
+            <w:pPr>
+              <w:spacing w:after="30" w:before="30"/>
+              <w:jc w:val="left"/>
+            </w:pPr>
+            <w:r>
+              <w:rPr>
+                <w:rFonts w:ascii="Calibri" w:cs="Calibri" w:eastAsia="Calibri" w:hAnsi="Calibri"/>
+                <w:sz w:val="18"/>
+                <w:szCs w:val="18"/>
+              </w:rPr>
+              <w:t xml:space="preserve">National Examinations Council of Tanzania: source of CSEE and ACSEE results.</w:t>
+            </w:r>
+          </w:p>
+        </w:tc>
+      </w:tr>
+      <w:tr>
+        <w:trPr>
+          <w:cantSplit/>
+        </w:trPr>
+        <w:tc>
+          <w:tcPr>
+            <w:tcW w:type="dxa" w:w="1985"/>
+            <w:tcBorders>
+              <w:top w:val="single" w:color="BFC9D6" w:sz="4"/>
+              <w:left w:val="single" w:color="BFC9D6" w:sz="4"/>
+              <w:bottom w:val="single" w:color="BFC9D6" w:sz="4"/>
+              <w:right w:val="single" w:color="BFC9D6" w:sz="4"/>
+            </w:tcBorders>
+            <w:tcMar>
+              <w:top w:type="dxa" w:w="60"/>
+              <w:left w:type="dxa" w:w="100"/>
+              <w:bottom w:type="dxa" w:w="60"/>
+              <w:right w:type="dxa" w:w="100"/>
+            </w:tcMar>
+            <w:vAlign w:val="center"/>
+          </w:tcPr>
+          <w:p>
+            <w:pPr>
+              <w:spacing w:after="30" w:before="30"/>
+              <w:jc w:val="left"/>
+            </w:pPr>
+            <w:r>
+              <w:rPr>
+                <w:rFonts w:ascii="Calibri" w:cs="Calibri" w:eastAsia="Calibri" w:hAnsi="Calibri"/>
+                <w:sz w:val="18"/>
+                <w:szCs w:val="18"/>
+              </w:rPr>
+              <w:t xml:space="preserve">NIDA / NIN</w:t>
+            </w:r>
+          </w:p>
+        </w:tc>
+        <w:tc>
+          <w:tcPr>
+            <w:tcW w:type="dxa" w:w="7041"/>
+            <w:tcBorders>
+              <w:top w:val="single" w:color="BFC9D6" w:sz="4"/>
+              <w:left w:val="single" w:color="BFC9D6" w:sz="4"/>
+              <w:bottom w:val="single" w:color="BFC9D6" w:sz="4"/>
+              <w:right w:val="single" w:color="BFC9D6" w:sz="4"/>
+            </w:tcBorders>
+            <w:tcMar>
+              <w:top w:type="dxa" w:w="60"/>
+              <w:left w:type="dxa" w:w="100"/>
+              <w:bottom w:type="dxa" w:w="60"/>
+              <w:right w:type="dxa" w:w="100"/>
+            </w:tcMar>
+            <w:vAlign w:val="center"/>
+          </w:tcPr>
+          <w:p>
+            <w:pPr>
+              <w:spacing w:after="30" w:before="30"/>
+              <w:jc w:val="left"/>
+            </w:pPr>
+            <w:r>
+              <w:rPr>
+                <w:rFonts w:ascii="Calibri" w:cs="Calibri" w:eastAsia="Calibri" w:hAnsi="Calibri"/>
+                <w:sz w:val="18"/>
+                <w:szCs w:val="18"/>
+              </w:rPr>
+              <w:t xml:space="preserve">National Identification Authority / National Identification Number.</w:t>
+            </w:r>
+          </w:p>
+        </w:tc>
+      </w:tr>
+      <w:tr>
+        <w:trPr>
+          <w:cantSplit/>
+        </w:trPr>
+        <w:tc>
+          <w:tcPr>
+            <w:tcW w:type="dxa" w:w="1985"/>
+            <w:tcBorders>
+              <w:top w:val="single" w:color="BFC9D6" w:sz="4"/>
+              <w:left w:val="single" w:color="BFC9D6" w:sz="4"/>
+              <w:bottom w:val="single" w:color="BFC9D6" w:sz="4"/>
+              <w:right w:val="single" w:color="BFC9D6" w:sz="4"/>
+            </w:tcBorders>
+            <w:tcMar>
+              <w:top w:type="dxa" w:w="60"/>
+              <w:left w:type="dxa" w:w="100"/>
+              <w:bottom w:type="dxa" w:w="60"/>
+              <w:right w:type="dxa" w:w="100"/>
+            </w:tcMar>
+            <w:vAlign w:val="center"/>
+          </w:tcPr>
+          <w:p>
+            <w:pPr>
+              <w:spacing w:after="30" w:before="30"/>
+              <w:jc w:val="left"/>
+            </w:pPr>
+            <w:r>
+              <w:rPr>
+                <w:rFonts w:ascii="Calibri" w:cs="Calibri" w:eastAsia="Calibri" w:hAnsi="Calibri"/>
+                <w:sz w:val="18"/>
+                <w:szCs w:val="18"/>
+              </w:rPr>
+              <w:t xml:space="preserve">NOAS</w:t>
+            </w:r>
+          </w:p>
+        </w:tc>
+        <w:tc>
+          <w:tcPr>
+            <w:tcW w:type="dxa" w:w="7041"/>
+            <w:tcBorders>
+              <w:top w:val="single" w:color="BFC9D6" w:sz="4"/>
+              <w:left w:val="single" w:color="BFC9D6" w:sz="4"/>
+              <w:bottom w:val="single" w:color="BFC9D6" w:sz="4"/>
+              <w:right w:val="single" w:color="BFC9D6" w:sz="4"/>
+            </w:tcBorders>
+            <w:tcMar>
+              <w:top w:type="dxa" w:w="60"/>
+              <w:left w:type="dxa" w:w="100"/>
+              <w:bottom w:type="dxa" w:w="60"/>
+              <w:right w:type="dxa" w:w="100"/>
+            </w:tcMar>
+            <w:vAlign w:val="center"/>
+          </w:tcPr>
+          <w:p>
+            <w:pPr>
+              <w:spacing w:after="30" w:before="30"/>
+              <w:jc w:val="left"/>
+            </w:pPr>
+            <w:r>
+              <w:rPr>
+                <w:rFonts w:ascii="Calibri" w:cs="Calibri" w:eastAsia="Calibri" w:hAnsi="Calibri"/>
+                <w:sz w:val="18"/>
+                <w:szCs w:val="18"/>
+              </w:rPr>
+              <w:t xml:space="preserve">NACTE/NACTVET Online Admission System, the earlier central admission system.</w:t>
+            </w:r>
+          </w:p>
+        </w:tc>
+      </w:tr>
+      <w:tr>
+        <w:trPr>
+          <w:cantSplit/>
+        </w:trPr>
+        <w:tc>
+          <w:tcPr>
+            <w:tcW w:type="dxa" w:w="1985"/>
+            <w:tcBorders>
+              <w:top w:val="single" w:color="BFC9D6" w:sz="4"/>
+              <w:left w:val="single" w:color="BFC9D6" w:sz="4"/>
+              <w:bottom w:val="single" w:color="BFC9D6" w:sz="4"/>
+              <w:right w:val="single" w:color="BFC9D6" w:sz="4"/>
+            </w:tcBorders>
+            <w:tcMar>
+              <w:top w:type="dxa" w:w="60"/>
+              <w:left w:type="dxa" w:w="100"/>
+              <w:bottom w:type="dxa" w:w="60"/>
+              <w:right w:type="dxa" w:w="100"/>
+            </w:tcMar>
+            <w:vAlign w:val="center"/>
+          </w:tcPr>
+          <w:p>
+            <w:pPr>
+              <w:spacing w:after="30" w:before="30"/>
+              <w:jc w:val="left"/>
+            </w:pPr>
+            <w:r>
+              <w:rPr>
+                <w:rFonts w:ascii="Calibri" w:cs="Calibri" w:eastAsia="Calibri" w:hAnsi="Calibri"/>
+                <w:sz w:val="18"/>
+                <w:szCs w:val="18"/>
+              </w:rPr>
+              <w:t xml:space="preserve">NTA</w:t>
+            </w:r>
+          </w:p>
+        </w:tc>
+        <w:tc>
+          <w:tcPr>
+            <w:tcW w:type="dxa" w:w="7041"/>
+            <w:tcBorders>
+              <w:top w:val="single" w:color="BFC9D6" w:sz="4"/>
+              <w:left w:val="single" w:color="BFC9D6" w:sz="4"/>
+              <w:bottom w:val="single" w:color="BFC9D6" w:sz="4"/>
+              <w:right w:val="single" w:color="BFC9D6" w:sz="4"/>
+            </w:tcBorders>
+            <w:tcMar>
+              <w:top w:type="dxa" w:w="60"/>
+              <w:left w:type="dxa" w:w="100"/>
+              <w:bottom w:type="dxa" w:w="60"/>
+              <w:right w:type="dxa" w:w="100"/>
+            </w:tcMar>
+            <w:vAlign w:val="center"/>
+          </w:tcPr>
+          <w:p>
+            <w:pPr>
+              <w:spacing w:after="30" w:before="30"/>
+              <w:jc w:val="left"/>
+            </w:pPr>
+            <w:r>
+              <w:rPr>
+                <w:rFonts w:ascii="Calibri" w:cs="Calibri" w:eastAsia="Calibri" w:hAnsi="Calibri"/>
+                <w:sz w:val="18"/>
+                <w:szCs w:val="18"/>
+              </w:rPr>
+              <w:t xml:space="preserve">National Technical Award, Levels 4–8 (Basic Technician Certificate to Bachelor Degree).</w:t>
+            </w:r>
+          </w:p>
+        </w:tc>
+      </w:tr>
+      <w:tr>
+        <w:trPr>
+          <w:cantSplit/>
+        </w:trPr>
+        <w:tc>
+          <w:tcPr>
+            <w:tcW w:type="dxa" w:w="1985"/>
+            <w:tcBorders>
+              <w:top w:val="single" w:color="BFC9D6" w:sz="4"/>
+              <w:left w:val="single" w:color="BFC9D6" w:sz="4"/>
+              <w:bottom w:val="single" w:color="BFC9D6" w:sz="4"/>
+              <w:right w:val="single" w:color="BFC9D6" w:sz="4"/>
+            </w:tcBorders>
+            <w:tcMar>
+              <w:top w:type="dxa" w:w="60"/>
+              <w:left w:type="dxa" w:w="100"/>
+              <w:bottom w:type="dxa" w:w="60"/>
+              <w:right w:type="dxa" w:w="100"/>
+            </w:tcMar>
+            <w:vAlign w:val="center"/>
+          </w:tcPr>
+          <w:p>
+            <w:pPr>
+              <w:spacing w:after="30" w:before="30"/>
+              <w:jc w:val="left"/>
+            </w:pPr>
+            <w:r>
+              <w:rPr>
+                <w:rFonts w:ascii="Calibri" w:cs="Calibri" w:eastAsia="Calibri" w:hAnsi="Calibri"/>
+                <w:sz w:val="18"/>
+                <w:szCs w:val="18"/>
+              </w:rPr>
+              <w:t xml:space="preserve">NVA</w:t>
+            </w:r>
+          </w:p>
+        </w:tc>
+        <w:tc>
+          <w:tcPr>
+            <w:tcW w:type="dxa" w:w="7041"/>
+            <w:tcBorders>
+              <w:top w:val="single" w:color="BFC9D6" w:sz="4"/>
+              <w:left w:val="single" w:color="BFC9D6" w:sz="4"/>
+              <w:bottom w:val="single" w:color="BFC9D6" w:sz="4"/>
+              <w:right w:val="single" w:color="BFC9D6" w:sz="4"/>
+            </w:tcBorders>
+            <w:tcMar>
+              <w:top w:type="dxa" w:w="60"/>
+              <w:left w:type="dxa" w:w="100"/>
+              <w:bottom w:type="dxa" w:w="60"/>
+              <w:right w:type="dxa" w:w="100"/>
+            </w:tcMar>
+            <w:vAlign w:val="center"/>
+          </w:tcPr>
+          <w:p>
+            <w:pPr>
+              <w:spacing w:after="30" w:before="30"/>
+              <w:jc w:val="left"/>
+            </w:pPr>
+            <w:r>
+              <w:rPr>
+                <w:rFonts w:ascii="Calibri" w:cs="Calibri" w:eastAsia="Calibri" w:hAnsi="Calibri"/>
+                <w:sz w:val="18"/>
+                <w:szCs w:val="18"/>
+              </w:rPr>
+              <w:t xml:space="preserve">National Vocational Award, Levels I–III (certificates of competence, awarded through VETA).</w:t>
+            </w:r>
+          </w:p>
+        </w:tc>
+      </w:tr>
+      <w:tr>
+        <w:trPr>
+          <w:cantSplit/>
+        </w:trPr>
+        <w:tc>
+          <w:tcPr>
+            <w:tcW w:type="dxa" w:w="1985"/>
+            <w:tcBorders>
+              <w:top w:val="single" w:color="BFC9D6" w:sz="4"/>
+              <w:left w:val="single" w:color="BFC9D6" w:sz="4"/>
+              <w:bottom w:val="single" w:color="BFC9D6" w:sz="4"/>
+              <w:right w:val="single" w:color="BFC9D6" w:sz="4"/>
+            </w:tcBorders>
+            <w:tcMar>
+              <w:top w:type="dxa" w:w="60"/>
+              <w:left w:type="dxa" w:w="100"/>
+              <w:bottom w:type="dxa" w:w="60"/>
+              <w:right w:type="dxa" w:w="100"/>
+            </w:tcMar>
+            <w:vAlign w:val="center"/>
+          </w:tcPr>
+          <w:p>
+            <w:pPr>
+              <w:spacing w:after="30" w:before="30"/>
+              <w:jc w:val="left"/>
+            </w:pPr>
+            <w:r>
+              <w:rPr>
+                <w:rFonts w:ascii="Calibri" w:cs="Calibri" w:eastAsia="Calibri" w:hAnsi="Calibri"/>
+                <w:sz w:val="18"/>
+                <w:szCs w:val="18"/>
+              </w:rPr>
+              <w:t xml:space="preserve">PDF</w:t>
+            </w:r>
+          </w:p>
+        </w:tc>
+        <w:tc>
+          <w:tcPr>
+            <w:tcW w:type="dxa" w:w="7041"/>
+            <w:tcBorders>
+              <w:top w:val="single" w:color="BFC9D6" w:sz="4"/>
+              <w:left w:val="single" w:color="BFC9D6" w:sz="4"/>
+              <w:bottom w:val="single" w:color="BFC9D6" w:sz="4"/>
+              <w:right w:val="single" w:color="BFC9D6" w:sz="4"/>
+            </w:tcBorders>
+            <w:tcMar>
+              <w:top w:type="dxa" w:w="60"/>
+              <w:left w:type="dxa" w:w="100"/>
+              <w:bottom w:type="dxa" w:w="60"/>
+              <w:right w:type="dxa" w:w="100"/>
+            </w:tcMar>
+            <w:vAlign w:val="center"/>
+          </w:tcPr>
+          <w:p>
+            <w:pPr>
+              <w:spacing w:after="30" w:before="30"/>
+              <w:jc w:val="left"/>
+            </w:pPr>
+            <w:r>
+              <w:rPr>
+                <w:rFonts w:ascii="Calibri" w:cs="Calibri" w:eastAsia="Calibri" w:hAnsi="Calibri"/>
+                <w:sz w:val="18"/>
+                <w:szCs w:val="18"/>
+              </w:rPr>
+              <w:t xml:space="preserve">Portable Document Format, used for letters, statements, certificates and reports.</w:t>
+            </w:r>
+          </w:p>
+        </w:tc>
+      </w:tr>
+      <w:tr>
+        <w:trPr>
+          <w:cantSplit/>
+        </w:trPr>
+        <w:tc>
+          <w:tcPr>
+            <w:tcW w:type="dxa" w:w="1985"/>
+            <w:tcBorders>
+              <w:top w:val="single" w:color="BFC9D6" w:sz="4"/>
+              <w:left w:val="single" w:color="BFC9D6" w:sz="4"/>
+              <w:bottom w:val="single" w:color="BFC9D6" w:sz="4"/>
+              <w:right w:val="single" w:color="BFC9D6" w:sz="4"/>
+            </w:tcBorders>
+            <w:tcMar>
+              <w:top w:type="dxa" w:w="60"/>
+              <w:left w:type="dxa" w:w="100"/>
+              <w:bottom w:type="dxa" w:w="60"/>
+              <w:right w:type="dxa" w:w="100"/>
+            </w:tcMar>
+            <w:vAlign w:val="center"/>
+          </w:tcPr>
+          <w:p>
+            <w:pPr>
+              <w:spacing w:after="30" w:before="30"/>
+              <w:jc w:val="left"/>
+            </w:pPr>
+            <w:r>
+              <w:rPr>
+                <w:rFonts w:ascii="Calibri" w:cs="Calibri" w:eastAsia="Calibri" w:hAnsi="Calibri"/>
+                <w:sz w:val="18"/>
+                <w:szCs w:val="18"/>
+              </w:rPr>
+              <w:t xml:space="preserve">PDPA</w:t>
+            </w:r>
+          </w:p>
+        </w:tc>
+        <w:tc>
+          <w:tcPr>
+            <w:tcW w:type="dxa" w:w="7041"/>
+            <w:tcBorders>
+              <w:top w:val="single" w:color="BFC9D6" w:sz="4"/>
+              <w:left w:val="single" w:color="BFC9D6" w:sz="4"/>
+              <w:bottom w:val="single" w:color="BFC9D6" w:sz="4"/>
+              <w:right w:val="single" w:color="BFC9D6" w:sz="4"/>
+            </w:tcBorders>
+            <w:tcMar>
+              <w:top w:type="dxa" w:w="60"/>
+              <w:left w:type="dxa" w:w="100"/>
+              <w:bottom w:type="dxa" w:w="60"/>
+              <w:right w:type="dxa" w:w="100"/>
+            </w:tcMar>
+            <w:vAlign w:val="center"/>
+          </w:tcPr>
+          <w:p>
+            <w:pPr>
+              <w:spacing w:after="30" w:before="30"/>
+              <w:jc w:val="left"/>
+            </w:pPr>
+            <w:r>
+              <w:rPr>
+                <w:rFonts w:ascii="Calibri" w:cs="Calibri" w:eastAsia="Calibri" w:hAnsi="Calibri"/>
+                <w:sz w:val="18"/>
+                <w:szCs w:val="18"/>
+              </w:rPr>
+              <w:t xml:space="preserve">Personal Data Protection Act, 2022 (Tanzania).</w:t>
+            </w:r>
+          </w:p>
+        </w:tc>
+      </w:tr>
+      <w:tr>
+        <w:trPr>
+          <w:cantSplit/>
+        </w:trPr>
+        <w:tc>
+          <w:tcPr>
+            <w:tcW w:type="dxa" w:w="1985"/>
+            <w:tcBorders>
+              <w:top w:val="single" w:color="BFC9D6" w:sz="4"/>
+              <w:left w:val="single" w:color="BFC9D6" w:sz="4"/>
+              <w:bottom w:val="single" w:color="BFC9D6" w:sz="4"/>
+              <w:right w:val="single" w:color="BFC9D6" w:sz="4"/>
+            </w:tcBorders>
+            <w:tcMar>
+              <w:top w:type="dxa" w:w="60"/>
+              <w:left w:type="dxa" w:w="100"/>
+              <w:bottom w:type="dxa" w:w="60"/>
+              <w:right w:type="dxa" w:w="100"/>
+            </w:tcMar>
+            <w:vAlign w:val="center"/>
+          </w:tcPr>
+          <w:p>
+            <w:pPr>
+              <w:spacing w:after="30" w:before="30"/>
+              <w:jc w:val="left"/>
+            </w:pPr>
+            <w:r>
+              <w:rPr>
+                <w:rFonts w:ascii="Calibri" w:cs="Calibri" w:eastAsia="Calibri" w:hAnsi="Calibri"/>
+                <w:sz w:val="18"/>
+                <w:szCs w:val="18"/>
+              </w:rPr>
+              <w:t xml:space="preserve">PostgreSQL</w:t>
+            </w:r>
+          </w:p>
+        </w:tc>
+        <w:tc>
+          <w:tcPr>
+            <w:tcW w:type="dxa" w:w="7041"/>
+            <w:tcBorders>
+              <w:top w:val="single" w:color="BFC9D6" w:sz="4"/>
+              <w:left w:val="single" w:color="BFC9D6" w:sz="4"/>
+              <w:bottom w:val="single" w:color="BFC9D6" w:sz="4"/>
+              <w:right w:val="single" w:color="BFC9D6" w:sz="4"/>
+            </w:tcBorders>
+            <w:tcMar>
+              <w:top w:type="dxa" w:w="60"/>
+              <w:left w:type="dxa" w:w="100"/>
+              <w:bottom w:type="dxa" w:w="60"/>
+              <w:right w:type="dxa" w:w="100"/>
+            </w:tcMar>
+            <w:vAlign w:val="center"/>
+          </w:tcPr>
+          <w:p>
+            <w:pPr>
+              <w:spacing w:after="30" w:before="30"/>
+              <w:jc w:val="left"/>
+            </w:pPr>
+            <w:r>
+              <w:rPr>
+                <w:rFonts w:ascii="Calibri" w:cs="Calibri" w:eastAsia="Calibri" w:hAnsi="Calibri"/>
+                <w:sz w:val="18"/>
+                <w:szCs w:val="18"/>
+              </w:rPr>
+              <w:t xml:space="preserve">The open-source database CIMS stores its data in.</w:t>
+            </w:r>
+          </w:p>
+        </w:tc>
+      </w:tr>
+      <w:tr>
+        <w:trPr>
+          <w:cantSplit/>
+        </w:trPr>
+        <w:tc>
+          <w:tcPr>
+            <w:tcW w:type="dxa" w:w="1985"/>
+            <w:tcBorders>
+              <w:top w:val="single" w:color="BFC9D6" w:sz="4"/>
+              <w:left w:val="single" w:color="BFC9D6" w:sz="4"/>
+              <w:bottom w:val="single" w:color="BFC9D6" w:sz="4"/>
+              <w:right w:val="single" w:color="BFC9D6" w:sz="4"/>
+            </w:tcBorders>
+            <w:tcMar>
+              <w:top w:type="dxa" w:w="60"/>
+              <w:left w:type="dxa" w:w="100"/>
+              <w:bottom w:type="dxa" w:w="60"/>
+              <w:right w:type="dxa" w:w="100"/>
+            </w:tcMar>
+            <w:vAlign w:val="center"/>
+          </w:tcPr>
+          <w:p>
+            <w:pPr>
+              <w:spacing w:after="30" w:before="30"/>
+              <w:jc w:val="left"/>
+            </w:pPr>
+            <w:r>
+              <w:rPr>
+                <w:rFonts w:ascii="Calibri" w:cs="Calibri" w:eastAsia="Calibri" w:hAnsi="Calibri"/>
+                <w:sz w:val="18"/>
+                <w:szCs w:val="18"/>
+              </w:rPr>
+              <w:t xml:space="preserve">QR code</w:t>
+            </w:r>
+          </w:p>
+        </w:tc>
+        <w:tc>
+          <w:tcPr>
+            <w:tcW w:type="dxa" w:w="7041"/>
+            <w:tcBorders>
+              <w:top w:val="single" w:color="BFC9D6" w:sz="4"/>
+              <w:left w:val="single" w:color="BFC9D6" w:sz="4"/>
+              <w:bottom w:val="single" w:color="BFC9D6" w:sz="4"/>
+              <w:right w:val="single" w:color="BFC9D6" w:sz="4"/>
+            </w:tcBorders>
+            <w:tcMar>
+              <w:top w:type="dxa" w:w="60"/>
+              <w:left w:type="dxa" w:w="100"/>
+              <w:bottom w:type="dxa" w:w="60"/>
+              <w:right w:type="dxa" w:w="100"/>
+            </w:tcMar>
+            <w:vAlign w:val="center"/>
+          </w:tcPr>
+          <w:p>
+            <w:pPr>
+              <w:spacing w:after="30" w:before="30"/>
+              <w:jc w:val="left"/>
+            </w:pPr>
+            <w:r>
+              <w:rPr>
+                <w:rFonts w:ascii="Calibri" w:cs="Calibri" w:eastAsia="Calibri" w:hAnsi="Calibri"/>
+                <w:sz w:val="18"/>
+                <w:szCs w:val="18"/>
+              </w:rPr>
+              <w:t xml:space="preserve">A square barcode printed on documents; scanning it opens the verification page.</w:t>
+            </w:r>
+          </w:p>
+        </w:tc>
+      </w:tr>
+      <w:tr>
+        <w:trPr>
+          <w:cantSplit/>
+        </w:trPr>
+        <w:tc>
+          <w:tcPr>
+            <w:tcW w:type="dxa" w:w="1985"/>
+            <w:tcBorders>
+              <w:top w:val="single" w:color="BFC9D6" w:sz="4"/>
+              <w:left w:val="single" w:color="BFC9D6" w:sz="4"/>
+              <w:bottom w:val="single" w:color="BFC9D6" w:sz="4"/>
+              <w:right w:val="single" w:color="BFC9D6" w:sz="4"/>
+            </w:tcBorders>
+            <w:tcMar>
+              <w:top w:type="dxa" w:w="60"/>
+              <w:left w:type="dxa" w:w="100"/>
+              <w:bottom w:type="dxa" w:w="60"/>
+              <w:right w:type="dxa" w:w="100"/>
+            </w:tcMar>
+            <w:vAlign w:val="center"/>
+          </w:tcPr>
+          <w:p>
+            <w:pPr>
+              <w:spacing w:after="30" w:before="30"/>
+              <w:jc w:val="left"/>
+            </w:pPr>
+            <w:r>
+              <w:rPr>
+                <w:rFonts w:ascii="Calibri" w:cs="Calibri" w:eastAsia="Calibri" w:hAnsi="Calibri"/>
+                <w:sz w:val="18"/>
+                <w:szCs w:val="18"/>
+              </w:rPr>
+              <w:t xml:space="preserve">Registration number</w:t>
+            </w:r>
+          </w:p>
+        </w:tc>
+        <w:tc>
+          <w:tcPr>
+            <w:tcW w:type="dxa" w:w="7041"/>
+            <w:tcBorders>
+              <w:top w:val="single" w:color="BFC9D6" w:sz="4"/>
+              <w:left w:val="single" w:color="BFC9D6" w:sz="4"/>
+              <w:bottom w:val="single" w:color="BFC9D6" w:sz="4"/>
+              <w:right w:val="single" w:color="BFC9D6" w:sz="4"/>
+            </w:tcBorders>
+            <w:tcMar>
+              <w:top w:type="dxa" w:w="60"/>
+              <w:left w:type="dxa" w:w="100"/>
+              <w:bottom w:type="dxa" w:w="60"/>
+              <w:right w:type="dxa" w:w="100"/>
+            </w:tcMar>
+            <w:vAlign w:val="center"/>
+          </w:tcPr>
+          <w:p>
+            <w:pPr>
+              <w:spacing w:after="30" w:before="30"/>
+              <w:jc w:val="left"/>
+            </w:pPr>
+            <w:r>
+              <w:rPr>
+                <w:rFonts w:ascii="Calibri" w:cs="Calibri" w:eastAsia="Calibri" w:hAnsi="Calibri"/>
+                <w:sz w:val="18"/>
+                <w:szCs w:val="18"/>
+              </w:rPr>
+              <w:t xml:space="preserve">The student's permanent number, generated at hand-over and never changed or reused.</w:t>
+            </w:r>
+          </w:p>
+        </w:tc>
+      </w:tr>
+      <w:tr>
+        <w:trPr>
+          <w:cantSplit/>
+        </w:trPr>
+        <w:tc>
+          <w:tcPr>
+            <w:tcW w:type="dxa" w:w="1985"/>
+            <w:tcBorders>
+              <w:top w:val="single" w:color="BFC9D6" w:sz="4"/>
+              <w:left w:val="single" w:color="BFC9D6" w:sz="4"/>
+              <w:bottom w:val="single" w:color="BFC9D6" w:sz="4"/>
+              <w:right w:val="single" w:color="BFC9D6" w:sz="4"/>
+            </w:tcBorders>
+            <w:tcMar>
+              <w:top w:type="dxa" w:w="60"/>
+              <w:left w:type="dxa" w:w="100"/>
+              <w:bottom w:type="dxa" w:w="60"/>
+              <w:right w:type="dxa" w:w="100"/>
+            </w:tcMar>
+            <w:vAlign w:val="center"/>
+          </w:tcPr>
+          <w:p>
+            <w:pPr>
+              <w:spacing w:after="30" w:before="30"/>
+              <w:jc w:val="left"/>
+            </w:pPr>
+            <w:r>
+              <w:rPr>
+                <w:rFonts w:ascii="Calibri" w:cs="Calibri" w:eastAsia="Calibri" w:hAnsi="Calibri"/>
+                <w:sz w:val="18"/>
+                <w:szCs w:val="18"/>
+              </w:rPr>
+              <w:t xml:space="preserve">RLS</w:t>
+            </w:r>
+          </w:p>
+        </w:tc>
+        <w:tc>
+          <w:tcPr>
+            <w:tcW w:type="dxa" w:w="7041"/>
+            <w:tcBorders>
+              <w:top w:val="single" w:color="BFC9D6" w:sz="4"/>
+              <w:left w:val="single" w:color="BFC9D6" w:sz="4"/>
+              <w:bottom w:val="single" w:color="BFC9D6" w:sz="4"/>
+              <w:right w:val="single" w:color="BFC9D6" w:sz="4"/>
+            </w:tcBorders>
+            <w:tcMar>
+              <w:top w:type="dxa" w:w="60"/>
+              <w:left w:type="dxa" w:w="100"/>
+              <w:bottom w:type="dxa" w:w="60"/>
+              <w:right w:type="dxa" w:w="100"/>
+            </w:tcMar>
+            <w:vAlign w:val="center"/>
+          </w:tcPr>
+          <w:p>
+            <w:pPr>
+              <w:spacing w:after="30" w:before="30"/>
+              <w:jc w:val="left"/>
+            </w:pPr>
+            <w:r>
+              <w:rPr>
+                <w:rFonts w:ascii="Calibri" w:cs="Calibri" w:eastAsia="Calibri" w:hAnsi="Calibri"/>
+                <w:sz w:val="18"/>
+                <w:szCs w:val="18"/>
+              </w:rPr>
+              <w:t xml:space="preserve">Row-level security: the database rule that each institution sees only its own rows.</w:t>
+            </w:r>
+          </w:p>
+        </w:tc>
+      </w:tr>
+      <w:tr>
+        <w:trPr>
+          <w:cantSplit/>
+        </w:trPr>
+        <w:tc>
+          <w:tcPr>
+            <w:tcW w:type="dxa" w:w="1985"/>
+            <w:tcBorders>
+              <w:top w:val="single" w:color="BFC9D6" w:sz="4"/>
+              <w:left w:val="single" w:color="BFC9D6" w:sz="4"/>
+              <w:bottom w:val="single" w:color="BFC9D6" w:sz="4"/>
+              <w:right w:val="single" w:color="BFC9D6" w:sz="4"/>
+            </w:tcBorders>
+            <w:tcMar>
+              <w:top w:type="dxa" w:w="60"/>
+              <w:left w:type="dxa" w:w="100"/>
+              <w:bottom w:type="dxa" w:w="60"/>
+              <w:right w:type="dxa" w:w="100"/>
+            </w:tcMar>
+            <w:vAlign w:val="center"/>
+          </w:tcPr>
+          <w:p>
+            <w:pPr>
+              <w:spacing w:after="30" w:before="30"/>
+              <w:jc w:val="left"/>
+            </w:pPr>
+            <w:r>
+              <w:rPr>
+                <w:rFonts w:ascii="Calibri" w:cs="Calibri" w:eastAsia="Calibri" w:hAnsi="Calibri"/>
+                <w:sz w:val="18"/>
+                <w:szCs w:val="18"/>
+              </w:rPr>
+              <w:t xml:space="preserve">Simulator</w:t>
+            </w:r>
+          </w:p>
+        </w:tc>
+        <w:tc>
+          <w:tcPr>
+            <w:tcW w:type="dxa" w:w="7041"/>
+            <w:tcBorders>
+              <w:top w:val="single" w:color="BFC9D6" w:sz="4"/>
+              <w:left w:val="single" w:color="BFC9D6" w:sz="4"/>
+              <w:bottom w:val="single" w:color="BFC9D6" w:sz="4"/>
+              <w:right w:val="single" w:color="BFC9D6" w:sz="4"/>
+            </w:tcBorders>
+            <w:tcMar>
+              <w:top w:type="dxa" w:w="60"/>
+              <w:left w:type="dxa" w:w="100"/>
+              <w:bottom w:type="dxa" w:w="60"/>
+              <w:right w:type="dxa" w:w="100"/>
+            </w:tcMar>
+            <w:vAlign w:val="center"/>
+          </w:tcPr>
+          <w:p>
+            <w:pPr>
+              <w:spacing w:after="30" w:before="30"/>
+              <w:jc w:val="left"/>
+            </w:pPr>
+            <w:r>
+              <w:rPr>
+                <w:rFonts w:ascii="Calibri" w:cs="Calibri" w:eastAsia="Calibri" w:hAnsi="Calibri"/>
+                <w:sz w:val="18"/>
+                <w:szCs w:val="18"/>
+              </w:rPr>
+              <w:t xml:space="preserve">A stand-in for an outside system (for example NACTVET or GePG) used for testing until the live interface is available.</w:t>
+            </w:r>
+          </w:p>
+        </w:tc>
+      </w:tr>
+      <w:tr>
+        <w:trPr>
+          <w:cantSplit/>
+        </w:trPr>
+        <w:tc>
+          <w:tcPr>
+            <w:tcW w:type="dxa" w:w="1985"/>
+            <w:tcBorders>
+              <w:top w:val="single" w:color="BFC9D6" w:sz="4"/>
+              <w:left w:val="single" w:color="BFC9D6" w:sz="4"/>
+              <w:bottom w:val="single" w:color="BFC9D6" w:sz="4"/>
+              <w:right w:val="single" w:color="BFC9D6" w:sz="4"/>
+            </w:tcBorders>
+            <w:tcMar>
+              <w:top w:type="dxa" w:w="60"/>
+              <w:left w:type="dxa" w:w="100"/>
+              <w:bottom w:type="dxa" w:w="60"/>
+              <w:right w:type="dxa" w:w="100"/>
+            </w:tcMar>
+            <w:vAlign w:val="center"/>
+          </w:tcPr>
+          <w:p>
+            <w:pPr>
+              <w:spacing w:after="30" w:before="30"/>
+              <w:jc w:val="left"/>
+            </w:pPr>
+            <w:r>
+              <w:rPr>
+                <w:rFonts w:ascii="Calibri" w:cs="Calibri" w:eastAsia="Calibri" w:hAnsi="Calibri"/>
+                <w:sz w:val="18"/>
+                <w:szCs w:val="18"/>
+              </w:rPr>
+              <w:t xml:space="preserve">SMS</w:t>
+            </w:r>
+          </w:p>
+        </w:tc>
+        <w:tc>
+          <w:tcPr>
+            <w:tcW w:type="dxa" w:w="7041"/>
+            <w:tcBorders>
+              <w:top w:val="single" w:color="BFC9D6" w:sz="4"/>
+              <w:left w:val="single" w:color="BFC9D6" w:sz="4"/>
+              <w:bottom w:val="single" w:color="BFC9D6" w:sz="4"/>
+              <w:right w:val="single" w:color="BFC9D6" w:sz="4"/>
+            </w:tcBorders>
+            <w:tcMar>
+              <w:top w:type="dxa" w:w="60"/>
+              <w:left w:type="dxa" w:w="100"/>
+              <w:bottom w:type="dxa" w:w="60"/>
+              <w:right w:type="dxa" w:w="100"/>
+            </w:tcMar>
+            <w:vAlign w:val="center"/>
+          </w:tcPr>
+          <w:p>
+            <w:pPr>
+              <w:spacing w:after="30" w:before="30"/>
+              <w:jc w:val="left"/>
+            </w:pPr>
+            <w:r>
+              <w:rPr>
+                <w:rFonts w:ascii="Calibri" w:cs="Calibri" w:eastAsia="Calibri" w:hAnsi="Calibri"/>
+                <w:sz w:val="18"/>
+                <w:szCs w:val="18"/>
+              </w:rPr>
+              <w:t xml:space="preserve">Short message service: text messages to mobile phones.</w:t>
+            </w:r>
+          </w:p>
+        </w:tc>
+      </w:tr>
+      <w:tr>
+        <w:trPr>
+          <w:cantSplit/>
+        </w:trPr>
+        <w:tc>
+          <w:tcPr>
+            <w:tcW w:type="dxa" w:w="1985"/>
+            <w:tcBorders>
+              <w:top w:val="single" w:color="BFC9D6" w:sz="4"/>
+              <w:left w:val="single" w:color="BFC9D6" w:sz="4"/>
+              <w:bottom w:val="single" w:color="BFC9D6" w:sz="4"/>
+              <w:right w:val="single" w:color="BFC9D6" w:sz="4"/>
+            </w:tcBorders>
+            <w:tcMar>
+              <w:top w:type="dxa" w:w="60"/>
+              <w:left w:type="dxa" w:w="100"/>
+              <w:bottom w:type="dxa" w:w="60"/>
+              <w:right w:type="dxa" w:w="100"/>
+            </w:tcMar>
+            <w:vAlign w:val="center"/>
+          </w:tcPr>
+          <w:p>
+            <w:pPr>
+              <w:spacing w:after="30" w:before="30"/>
+              <w:jc w:val="left"/>
+            </w:pPr>
+            <w:r>
+              <w:rPr>
+                <w:rFonts w:ascii="Calibri" w:cs="Calibri" w:eastAsia="Calibri" w:hAnsi="Calibri"/>
+                <w:sz w:val="18"/>
+                <w:szCs w:val="18"/>
+              </w:rPr>
+              <w:t xml:space="preserve">SMTP</w:t>
+            </w:r>
+          </w:p>
+        </w:tc>
+        <w:tc>
+          <w:tcPr>
+            <w:tcW w:type="dxa" w:w="7041"/>
+            <w:tcBorders>
+              <w:top w:val="single" w:color="BFC9D6" w:sz="4"/>
+              <w:left w:val="single" w:color="BFC9D6" w:sz="4"/>
+              <w:bottom w:val="single" w:color="BFC9D6" w:sz="4"/>
+              <w:right w:val="single" w:color="BFC9D6" w:sz="4"/>
+            </w:tcBorders>
+            <w:tcMar>
+              <w:top w:type="dxa" w:w="60"/>
+              <w:left w:type="dxa" w:w="100"/>
+              <w:bottom w:type="dxa" w:w="60"/>
+              <w:right w:type="dxa" w:w="100"/>
+            </w:tcMar>
+            <w:vAlign w:val="center"/>
+          </w:tcPr>
+          <w:p>
+            <w:pPr>
+              <w:spacing w:after="30" w:before="30"/>
+              <w:jc w:val="left"/>
+            </w:pPr>
+            <w:r>
+              <w:rPr>
+                <w:rFonts w:ascii="Calibri" w:cs="Calibri" w:eastAsia="Calibri" w:hAnsi="Calibri"/>
+                <w:sz w:val="18"/>
+                <w:szCs w:val="18"/>
+              </w:rPr>
+              <w:t xml:space="preserve">Simple Mail Transfer Protocol, used to send email.</w:t>
+            </w:r>
+          </w:p>
+        </w:tc>
+      </w:tr>
+      <w:tr>
+        <w:trPr>
+          <w:cantSplit/>
+        </w:trPr>
+        <w:tc>
+          <w:tcPr>
+            <w:tcW w:type="dxa" w:w="1985"/>
+            <w:tcBorders>
+              <w:top w:val="single" w:color="BFC9D6" w:sz="4"/>
+              <w:left w:val="single" w:color="BFC9D6" w:sz="4"/>
+              <w:bottom w:val="single" w:color="BFC9D6" w:sz="4"/>
+              <w:right w:val="single" w:color="BFC9D6" w:sz="4"/>
+            </w:tcBorders>
+            <w:tcMar>
+              <w:top w:type="dxa" w:w="60"/>
+              <w:left w:type="dxa" w:w="100"/>
+              <w:bottom w:type="dxa" w:w="60"/>
+              <w:right w:type="dxa" w:w="100"/>
+            </w:tcMar>
+            <w:vAlign w:val="center"/>
+          </w:tcPr>
+          <w:p>
+            <w:pPr>
+              <w:spacing w:after="30" w:before="30"/>
+              <w:jc w:val="left"/>
+            </w:pPr>
+            <w:r>
+              <w:rPr>
+                <w:rFonts w:ascii="Calibri" w:cs="Calibri" w:eastAsia="Calibri" w:hAnsi="Calibri"/>
+                <w:sz w:val="18"/>
+                <w:szCs w:val="18"/>
+              </w:rPr>
+              <w:t xml:space="preserve">TAMISEMI</w:t>
+            </w:r>
+          </w:p>
+        </w:tc>
+        <w:tc>
+          <w:tcPr>
+            <w:tcW w:type="dxa" w:w="7041"/>
+            <w:tcBorders>
+              <w:top w:val="single" w:color="BFC9D6" w:sz="4"/>
+              <w:left w:val="single" w:color="BFC9D6" w:sz="4"/>
+              <w:bottom w:val="single" w:color="BFC9D6" w:sz="4"/>
+              <w:right w:val="single" w:color="BFC9D6" w:sz="4"/>
+            </w:tcBorders>
+            <w:tcMar>
+              <w:top w:type="dxa" w:w="60"/>
+              <w:left w:type="dxa" w:w="100"/>
+              <w:bottom w:type="dxa" w:w="60"/>
+              <w:right w:type="dxa" w:w="100"/>
+            </w:tcMar>
+            <w:vAlign w:val="center"/>
+          </w:tcPr>
+          <w:p>
+            <w:pPr>
+              <w:spacing w:after="30" w:before="30"/>
+              <w:jc w:val="left"/>
+            </w:pPr>
+            <w:r>
+              <w:rPr>
+                <w:rFonts w:ascii="Calibri" w:cs="Calibri" w:eastAsia="Calibri" w:hAnsi="Calibri"/>
+                <w:sz w:val="18"/>
+                <w:szCs w:val="18"/>
+              </w:rPr>
+              <w:t xml:space="preserve">President's Office – Regional Administration and Local Government, which selects some students centrally.</w:t>
+            </w:r>
+          </w:p>
+        </w:tc>
+      </w:tr>
+      <w:tr>
+        <w:trPr>
+          <w:cantSplit/>
+        </w:trPr>
+        <w:tc>
+          <w:tcPr>
+            <w:tcW w:type="dxa" w:w="1985"/>
+            <w:tcBorders>
+              <w:top w:val="single" w:color="BFC9D6" w:sz="4"/>
+              <w:left w:val="single" w:color="BFC9D6" w:sz="4"/>
+              <w:bottom w:val="single" w:color="BFC9D6" w:sz="4"/>
+              <w:right w:val="single" w:color="BFC9D6" w:sz="4"/>
+            </w:tcBorders>
+            <w:tcMar>
+              <w:top w:type="dxa" w:w="60"/>
+              <w:left w:type="dxa" w:w="100"/>
+              <w:bottom w:type="dxa" w:w="60"/>
+              <w:right w:type="dxa" w:w="100"/>
+            </w:tcMar>
+            <w:vAlign w:val="center"/>
+          </w:tcPr>
+          <w:p>
+            <w:pPr>
+              <w:spacing w:after="30" w:before="30"/>
+              <w:jc w:val="left"/>
+            </w:pPr>
+            <w:r>
+              <w:rPr>
+                <w:rFonts w:ascii="Calibri" w:cs="Calibri" w:eastAsia="Calibri" w:hAnsi="Calibri"/>
+                <w:sz w:val="18"/>
+                <w:szCs w:val="18"/>
+              </w:rPr>
+              <w:t xml:space="preserve">Tenant</w:t>
+            </w:r>
+          </w:p>
+        </w:tc>
+        <w:tc>
+          <w:tcPr>
+            <w:tcW w:type="dxa" w:w="7041"/>
+            <w:tcBorders>
+              <w:top w:val="single" w:color="BFC9D6" w:sz="4"/>
+              <w:left w:val="single" w:color="BFC9D6" w:sz="4"/>
+              <w:bottom w:val="single" w:color="BFC9D6" w:sz="4"/>
+              <w:right w:val="single" w:color="BFC9D6" w:sz="4"/>
+            </w:tcBorders>
+            <w:tcMar>
+              <w:top w:type="dxa" w:w="60"/>
+              <w:left w:type="dxa" w:w="100"/>
+              <w:bottom w:type="dxa" w:w="60"/>
+              <w:right w:type="dxa" w:w="100"/>
+            </w:tcMar>
+            <w:vAlign w:val="center"/>
+          </w:tcPr>
+          <w:p>
+            <w:pPr>
+              <w:spacing w:after="30" w:before="30"/>
+              <w:jc w:val="left"/>
+            </w:pPr>
+            <w:r>
+              <w:rPr>
+                <w:rFonts w:ascii="Calibri" w:cs="Calibri" w:eastAsia="Calibri" w:hAnsi="Calibri"/>
+                <w:sz w:val="18"/>
+                <w:szCs w:val="18"/>
+              </w:rPr>
+              <w:t xml:space="preserve">One institution's isolated space within the shared CIMS platform, with its own branding, users, data and settings.</w:t>
+            </w:r>
+          </w:p>
+        </w:tc>
+      </w:tr>
+      <w:tr>
+        <w:trPr>
+          <w:cantSplit/>
+        </w:trPr>
+        <w:tc>
+          <w:tcPr>
+            <w:tcW w:type="dxa" w:w="1985"/>
+            <w:tcBorders>
+              <w:top w:val="single" w:color="BFC9D6" w:sz="4"/>
+              <w:left w:val="single" w:color="BFC9D6" w:sz="4"/>
+              <w:bottom w:val="single" w:color="BFC9D6" w:sz="4"/>
+              <w:right w:val="single" w:color="BFC9D6" w:sz="4"/>
+            </w:tcBorders>
+            <w:tcMar>
+              <w:top w:type="dxa" w:w="60"/>
+              <w:left w:type="dxa" w:w="100"/>
+              <w:bottom w:type="dxa" w:w="60"/>
+              <w:right w:type="dxa" w:w="100"/>
+            </w:tcMar>
+            <w:vAlign w:val="center"/>
+          </w:tcPr>
+          <w:p>
+            <w:pPr>
+              <w:spacing w:after="30" w:before="30"/>
+              <w:jc w:val="left"/>
+            </w:pPr>
+            <w:r>
+              <w:rPr>
+                <w:rFonts w:ascii="Calibri" w:cs="Calibri" w:eastAsia="Calibri" w:hAnsi="Calibri"/>
+                <w:sz w:val="18"/>
+                <w:szCs w:val="18"/>
+              </w:rPr>
+              <w:t xml:space="preserve">TVET</w:t>
+            </w:r>
+          </w:p>
+        </w:tc>
+        <w:tc>
+          <w:tcPr>
+            <w:tcW w:type="dxa" w:w="7041"/>
+            <w:tcBorders>
+              <w:top w:val="single" w:color="BFC9D6" w:sz="4"/>
+              <w:left w:val="single" w:color="BFC9D6" w:sz="4"/>
+              <w:bottom w:val="single" w:color="BFC9D6" w:sz="4"/>
+              <w:right w:val="single" w:color="BFC9D6" w:sz="4"/>
+            </w:tcBorders>
+            <w:tcMar>
+              <w:top w:type="dxa" w:w="60"/>
+              <w:left w:type="dxa" w:w="100"/>
+              <w:bottom w:type="dxa" w:w="60"/>
+              <w:right w:type="dxa" w:w="100"/>
+            </w:tcMar>
+            <w:vAlign w:val="center"/>
+          </w:tcPr>
+          <w:p>
+            <w:pPr>
+              <w:spacing w:after="30" w:before="30"/>
+              <w:jc w:val="left"/>
+            </w:pPr>
+            <w:r>
+              <w:rPr>
+                <w:rFonts w:ascii="Calibri" w:cs="Calibri" w:eastAsia="Calibri" w:hAnsi="Calibri"/>
+                <w:sz w:val="18"/>
+                <w:szCs w:val="18"/>
+              </w:rPr>
+              <w:t xml:space="preserve">Technical and vocational education and training.</w:t>
+            </w:r>
+          </w:p>
+        </w:tc>
+      </w:tr>
+      <w:tr>
+        <w:trPr>
+          <w:cantSplit/>
+        </w:trPr>
+        <w:tc>
+          <w:tcPr>
+            <w:tcW w:type="dxa" w:w="1985"/>
+            <w:tcBorders>
+              <w:top w:val="single" w:color="BFC9D6" w:sz="4"/>
+              <w:left w:val="single" w:color="BFC9D6" w:sz="4"/>
+              <w:bottom w:val="single" w:color="BFC9D6" w:sz="4"/>
+              <w:right w:val="single" w:color="BFC9D6" w:sz="4"/>
+            </w:tcBorders>
+            <w:tcMar>
+              <w:top w:type="dxa" w:w="60"/>
+              <w:left w:type="dxa" w:w="100"/>
+              <w:bottom w:type="dxa" w:w="60"/>
+              <w:right w:type="dxa" w:w="100"/>
+            </w:tcMar>
+            <w:vAlign w:val="center"/>
+          </w:tcPr>
+          <w:p>
+            <w:pPr>
+              <w:spacing w:after="30" w:before="30"/>
+              <w:jc w:val="left"/>
+            </w:pPr>
+            <w:r>
+              <w:rPr>
+                <w:rFonts w:ascii="Calibri" w:cs="Calibri" w:eastAsia="Calibri" w:hAnsi="Calibri"/>
+                <w:sz w:val="18"/>
+                <w:szCs w:val="18"/>
+              </w:rPr>
+              <w:t xml:space="preserve">Verification code</w:t>
+            </w:r>
+          </w:p>
+        </w:tc>
+        <w:tc>
+          <w:tcPr>
+            <w:tcW w:type="dxa" w:w="7041"/>
+            <w:tcBorders>
+              <w:top w:val="single" w:color="BFC9D6" w:sz="4"/>
+              <w:left w:val="single" w:color="BFC9D6" w:sz="4"/>
+              <w:bottom w:val="single" w:color="BFC9D6" w:sz="4"/>
+              <w:right w:val="single" w:color="BFC9D6" w:sz="4"/>
+            </w:tcBorders>
+            <w:tcMar>
+              <w:top w:type="dxa" w:w="60"/>
+              <w:left w:type="dxa" w:w="100"/>
+              <w:bottom w:type="dxa" w:w="60"/>
+              <w:right w:type="dxa" w:w="100"/>
+            </w:tcMar>
+            <w:vAlign w:val="center"/>
+          </w:tcPr>
+          <w:p>
+            <w:pPr>
+              <w:spacing w:after="30" w:before="30"/>
+              <w:jc w:val="left"/>
+            </w:pPr>
+            <w:r>
+              <w:rPr>
+                <w:rFonts w:ascii="Calibri" w:cs="Calibri" w:eastAsia="Calibri" w:hAnsi="Calibri"/>
+                <w:sz w:val="18"/>
+                <w:szCs w:val="18"/>
+              </w:rPr>
+              <w:t xml:space="preserve">The code printed (with a QR code) on letters, statements, certificates and ID cards, checked on the verification page.</w:t>
+            </w:r>
+          </w:p>
+        </w:tc>
+      </w:tr>
+      <w:tr>
+        <w:trPr>
+          <w:cantSplit/>
+        </w:trPr>
+        <w:tc>
+          <w:tcPr>
+            <w:tcW w:type="dxa" w:w="1985"/>
+            <w:tcBorders>
+              <w:top w:val="single" w:color="BFC9D6" w:sz="4"/>
+              <w:left w:val="single" w:color="BFC9D6" w:sz="4"/>
+              <w:bottom w:val="single" w:color="BFC9D6" w:sz="4"/>
+              <w:right w:val="single" w:color="BFC9D6" w:sz="4"/>
+            </w:tcBorders>
+            <w:tcMar>
+              <w:top w:type="dxa" w:w="60"/>
+              <w:left w:type="dxa" w:w="100"/>
+              <w:bottom w:type="dxa" w:w="60"/>
+              <w:right w:type="dxa" w:w="100"/>
+            </w:tcMar>
+            <w:vAlign w:val="center"/>
+          </w:tcPr>
+          <w:p>
+            <w:pPr>
+              <w:spacing w:after="30" w:before="30"/>
+              <w:jc w:val="left"/>
+            </w:pPr>
+            <w:r>
+              <w:rPr>
+                <w:rFonts w:ascii="Calibri" w:cs="Calibri" w:eastAsia="Calibri" w:hAnsi="Calibri"/>
+                <w:sz w:val="18"/>
+                <w:szCs w:val="18"/>
+              </w:rPr>
+              <w:t xml:space="preserve">Waiver</w:t>
+            </w:r>
+          </w:p>
+        </w:tc>
+        <w:tc>
+          <w:tcPr>
+            <w:tcW w:type="dxa" w:w="7041"/>
+            <w:tcBorders>
+              <w:top w:val="single" w:color="BFC9D6" w:sz="4"/>
+              <w:left w:val="single" w:color="BFC9D6" w:sz="4"/>
+              <w:bottom w:val="single" w:color="BFC9D6" w:sz="4"/>
+              <w:right w:val="single" w:color="BFC9D6" w:sz="4"/>
+            </w:tcBorders>
+            <w:tcMar>
+              <w:top w:type="dxa" w:w="60"/>
+              <w:left w:type="dxa" w:w="100"/>
+              <w:bottom w:type="dxa" w:w="60"/>
+              <w:right w:type="dxa" w:w="100"/>
+            </w:tcMar>
+            <w:vAlign w:val="center"/>
+          </w:tcPr>
+          <w:p>
+            <w:pPr>
+              <w:spacing w:after="30" w:before="30"/>
+              <w:jc w:val="left"/>
+            </w:pPr>
+            <w:r>
+              <w:rPr>
+                <w:rFonts w:ascii="Calibri" w:cs="Calibri" w:eastAsia="Calibri" w:hAnsi="Calibri"/>
+                <w:sz w:val="18"/>
+                <w:szCs w:val="18"/>
+              </w:rPr>
+              <w:t xml:space="preserve">An approved reduction of what a student owes on an invoice.</w:t>
+            </w:r>
+          </w:p>
+        </w:tc>
+      </w:tr>
+      <w:tr>
+        <w:trPr>
+          <w:cantSplit/>
+        </w:trPr>
+        <w:tc>
+          <w:tcPr>
+            <w:tcW w:type="dxa" w:w="1985"/>
+            <w:tcBorders>
+              <w:top w:val="single" w:color="BFC9D6" w:sz="4"/>
+              <w:left w:val="single" w:color="BFC9D6" w:sz="4"/>
+              <w:bottom w:val="single" w:color="BFC9D6" w:sz="4"/>
+              <w:right w:val="single" w:color="BFC9D6" w:sz="4"/>
+            </w:tcBorders>
+            <w:tcMar>
+              <w:top w:type="dxa" w:w="60"/>
+              <w:left w:type="dxa" w:w="100"/>
+              <w:bottom w:type="dxa" w:w="60"/>
+              <w:right w:type="dxa" w:w="100"/>
+            </w:tcMar>
+            <w:vAlign w:val="center"/>
+          </w:tcPr>
+          <w:p>
+            <w:pPr>
+              <w:spacing w:after="30" w:before="30"/>
+              <w:jc w:val="left"/>
+            </w:pPr>
+            <w:r>
+              <w:rPr>
+                <w:rFonts w:ascii="Calibri" w:cs="Calibri" w:eastAsia="Calibri" w:hAnsi="Calibri"/>
+                <w:sz w:val="18"/>
+                <w:szCs w:val="18"/>
+              </w:rPr>
+              <w:t xml:space="preserve">XML</w:t>
+            </w:r>
+          </w:p>
+        </w:tc>
+        <w:tc>
+          <w:tcPr>
+            <w:tcW w:type="dxa" w:w="7041"/>
+            <w:tcBorders>
+              <w:top w:val="single" w:color="BFC9D6" w:sz="4"/>
+              <w:left w:val="single" w:color="BFC9D6" w:sz="4"/>
+              <w:bottom w:val="single" w:color="BFC9D6" w:sz="4"/>
+              <w:right w:val="single" w:color="BFC9D6" w:sz="4"/>
+            </w:tcBorders>
+            <w:tcMar>
+              <w:top w:type="dxa" w:w="60"/>
+              <w:left w:type="dxa" w:w="100"/>
+              <w:bottom w:type="dxa" w:w="60"/>
+              <w:right w:type="dxa" w:w="100"/>
+            </w:tcMar>
+            <w:vAlign w:val="center"/>
+          </w:tcPr>
+          <w:p>
+            <w:pPr>
+              <w:spacing w:after="30" w:before="30"/>
+              <w:jc w:val="left"/>
+            </w:pPr>
+            <w:r>
+              <w:rPr>
+                <w:rFonts w:ascii="Calibri" w:cs="Calibri" w:eastAsia="Calibri" w:hAnsi="Calibri"/>
+                <w:sz w:val="18"/>
+                <w:szCs w:val="18"/>
+              </w:rPr>
+              <w:t xml:space="preserve">Extensible Markup Language, the message format GePG uses.</w:t>
+            </w:r>
+          </w:p>
+        </w:tc>
+      </w:tr>
+    </w:tbl>
     <w:sectPr>
       <w:headerReference w:type="default" r:id="rId7"/>
       <w:footerReference w:type="default" r:id="rId8"/>

</xml_diff>

<commit_message>
Spring Boot 3.5.12 upgrade; Maven failures as CI annotations; docs
</commit_message>
<xml_diff>
--- a/docs/01_Concept_Note_College_Institution_Management_System.docx
+++ b/docs/01_Concept_Note_College_Institution_Management_System.docx
@@ -1510,7 +1510,7 @@
                 <w:sz w:val="18"/>
                 <w:szCs w:val="18"/>
               </w:rPr>
-              <w:t xml:space="preserve">Sections 5.4, 5.5 and the progress note brought up to date after the completion batches (campuses and transfers; instalments, penalties and discounts; email; two-step sign-in, API clients and personal-data requests; data import and document uploads; configurable approval stages; alumni and tracer surveys; government adapters, deployment and load tests; the staff back-office in Kiswahili). The version 2.0 vision and scope stay the baseline. Abbreviations and glossary table added (Appendix A).</w:t>
+              <w:t xml:space="preserve">Sections 5.4, 5.5 and the progress note brought up to date after the completion batches (campuses and transfers; instalments, penalties and discounts; email; two-step sign-in, API clients and personal-data requests; data import and document uploads; configurable approval stages; alumni and tracer surveys; government adapters, deployment and load tests; the staff back-office in Kiswahili). The version 2.0 vision and scope stay the baseline. Abbreviations and glossary table added (Appendix A). Spring Boot 3.5 noted in the technology row.</w:t>
             </w:r>
           </w:p>
         </w:tc>
@@ -4501,7 +4501,7 @@
                 <w:sz w:val="18"/>
                 <w:szCs w:val="18"/>
               </w:rPr>
-              <w:t xml:space="preserve">Java 21 / Spring Boot 3.3, React 18 with TypeScript and MUI, PostgreSQL 16 with row-level security, Flyway, Docker — open source, no per-user licence fees. The build signs in users with its own token issuer; Keycloak is planned for single sign-on and multi-factor authentication.</w:t>
+              <w:t xml:space="preserve">Java 21 / Spring Boot 3.5, React 18 with TypeScript and MUI, PostgreSQL 16 with row-level security, Flyway, Docker — open source, no per-user licence fees. The build signs in users with its own token issuer; Keycloak is planned for single sign-on and multi-factor authentication.</w:t>
             </w:r>
           </w:p>
         </w:tc>

</xml_diff>